<commit_message>
Made chnages in UI and updated
</commit_message>
<xml_diff>
--- a/Resume_Harshith_S_V1_Portolio.docx
+++ b/Resume_Harshith_S_V1_Portolio.docx
@@ -1,42 +1,50 @@
 
 <file path=word/document.xml><?xml version="1.0" encoding="utf-8"?>
-<w:document xmlns:wpc="http://schemas.microsoft.com/office/word/2010/wordprocessingCanvas" xmlns:cx="http://schemas.microsoft.com/office/drawing/2014/chartex" xmlns:cx1="http://schemas.microsoft.com/office/drawing/2015/9/8/chartex" xmlns:cx2="http://schemas.microsoft.com/office/drawing/2015/10/21/chartex" xmlns:cx3="http://schemas.microsoft.com/office/drawing/2016/5/9/chartex" xmlns:cx4="http://schemas.microsoft.com/office/drawing/2016/5/10/chartex" xmlns:cx5="http://schemas.microsoft.com/office/drawing/2016/5/11/chartex" xmlns:cx6="http://schemas.microsoft.com/office/drawing/2016/5/12/chartex" xmlns:cx7="http://schemas.microsoft.com/office/drawing/2016/5/13/chartex" xmlns:cx8="http://schemas.microsoft.com/office/drawing/2016/5/14/chartex" xmlns:mc="http://schemas.openxmlformats.org/markup-compatibility/2006" xmlns:aink="http://schemas.microsoft.com/office/drawing/2016/ink" xmlns:am3d="http://schemas.microsoft.com/office/drawing/2017/model3d" xmlns:o="urn:schemas-microsoft-com:office:office" xmlns:oel="http://schemas.microsoft.com/office/2019/extlst" xmlns:r="http://schemas.openxmlformats.org/officeDocument/2006/relationships" xmlns:m="http://schemas.openxmlformats.org/officeDocument/2006/math" xmlns:v="urn:schemas-microsoft-com:vml" xmlns:wp14="http://schemas.microsoft.com/office/word/2010/wordprocessingDrawing" xmlns:wp="http://schemas.openxmlformats.org/drawingml/2006/wordprocessingDrawing" xmlns:w10="urn:schemas-microsoft-com:office:word" xmlns:w="http://schemas.openxmlformats.org/wordprocessingml/2006/main" xmlns:w14="http://schemas.microsoft.com/office/word/2010/wordml" xmlns:w15="http://schemas.microsoft.com/office/word/2012/wordml" xmlns:w16cex="http://schemas.microsoft.com/office/word/2018/wordml/cex" xmlns:w16cid="http://schemas.microsoft.com/office/word/2016/wordml/cid" xmlns:w16="http://schemas.microsoft.com/office/word/2018/wordml" xmlns:w16du="http://schemas.microsoft.com/office/word/2023/wordml/word16du" xmlns:w16sdtdh="http://schemas.microsoft.com/office/word/2020/wordml/sdtdatahash" xmlns:w16se="http://schemas.microsoft.com/office/word/2015/wordml/symex" xmlns:wpg="http://schemas.microsoft.com/office/word/2010/wordprocessingGroup" xmlns:wpi="http://schemas.microsoft.com/office/word/2010/wordprocessingInk" xmlns:wne="http://schemas.microsoft.com/office/word/2006/wordml" xmlns:wps="http://schemas.microsoft.com/office/word/2010/wordprocessingShape" mc:Ignorable="w14 w15 w16se w16cid w16 w16cex w16sdtdh w16du wp14">
+<w:document xmlns:wpc="http://schemas.microsoft.com/office/word/2010/wordprocessingCanvas" xmlns:cx="http://schemas.microsoft.com/office/drawing/2014/chartex" xmlns:cx1="http://schemas.microsoft.com/office/drawing/2015/9/8/chartex" xmlns:cx2="http://schemas.microsoft.com/office/drawing/2015/10/21/chartex" xmlns:cx3="http://schemas.microsoft.com/office/drawing/2016/5/9/chartex" xmlns:cx4="http://schemas.microsoft.com/office/drawing/2016/5/10/chartex" xmlns:cx5="http://schemas.microsoft.com/office/drawing/2016/5/11/chartex" xmlns:cx6="http://schemas.microsoft.com/office/drawing/2016/5/12/chartex" xmlns:cx7="http://schemas.microsoft.com/office/drawing/2016/5/13/chartex" xmlns:cx8="http://schemas.microsoft.com/office/drawing/2016/5/14/chartex" xmlns:mc="http://schemas.openxmlformats.org/markup-compatibility/2006" xmlns:aink="http://schemas.microsoft.com/office/drawing/2016/ink" xmlns:am3d="http://schemas.microsoft.com/office/drawing/2017/model3d" xmlns:o="urn:schemas-microsoft-com:office:office" xmlns:oel="http://schemas.microsoft.com/office/2019/extlst" xmlns:r="http://schemas.openxmlformats.org/officeDocument/2006/relationships" xmlns:m="http://schemas.openxmlformats.org/officeDocument/2006/math" xmlns:v="urn:schemas-microsoft-com:vml" xmlns:wp14="http://schemas.microsoft.com/office/word/2010/wordprocessingDrawing" xmlns:wp="http://schemas.openxmlformats.org/drawingml/2006/wordprocessingDrawing" xmlns:w10="urn:schemas-microsoft-com:office:word" xmlns:w="http://schemas.openxmlformats.org/wordprocessingml/2006/main" xmlns:w14="http://schemas.microsoft.com/office/word/2010/wordml" xmlns:w15="http://schemas.microsoft.com/office/word/2012/wordml" xmlns:w16cex="http://schemas.microsoft.com/office/word/2018/wordml/cex" xmlns:w16cid="http://schemas.microsoft.com/office/word/2016/wordml/cid" xmlns:w16="http://schemas.microsoft.com/office/word/2018/wordml" xmlns:w16du="http://schemas.microsoft.com/office/word/2023/wordml/word16du" xmlns:w16sdtdh="http://schemas.microsoft.com/office/word/2020/wordml/sdtdatahash" xmlns:w16sdtfl="http://schemas.microsoft.com/office/word/2024/wordml/sdtformatlock" xmlns:w16se="http://schemas.microsoft.com/office/word/2015/wordml/symex" xmlns:wpg="http://schemas.microsoft.com/office/word/2010/wordprocessingGroup" xmlns:wpi="http://schemas.microsoft.com/office/word/2010/wordprocessingInk" xmlns:wne="http://schemas.microsoft.com/office/word/2006/wordml" xmlns:wps="http://schemas.microsoft.com/office/word/2010/wordprocessingShape" mc:Ignorable="w14 w15 w16se w16cid w16 w16cex w16sdtdh w16sdtfl w16du wp14">
   <w:body>
     <w:p>
       <w:pPr>
         <w:pStyle w:val="Title"/>
+        <w:rPr>
+          <w:rFonts w:asciiTheme="minorHAnsi" w:hAnsiTheme="minorHAnsi" w:cstheme="minorHAnsi"/>
+        </w:rPr>
       </w:pPr>
       <w:r>
+        <w:rPr>
+          <w:rFonts w:asciiTheme="minorHAnsi" w:hAnsiTheme="minorHAnsi" w:cstheme="minorHAnsi"/>
+        </w:rPr>
         <w:t>Harshith S</w:t>
       </w:r>
     </w:p>
     <w:p>
       <w:pPr>
         <w:pStyle w:val="ContactInfo"/>
+        <w:rPr>
+          <w:rFonts w:cstheme="minorHAnsi"/>
+        </w:rPr>
       </w:pPr>
       <w:hyperlink r:id="rId10" w:history="1">
         <w:r>
           <w:rPr>
             <w:rStyle w:val="Hyperlink"/>
+            <w:rFonts w:cstheme="minorHAnsi"/>
           </w:rPr>
-          <w:t>Link</w:t>
-        </w:r>
-        <w:r>
-          <w:rPr>
-            <w:rStyle w:val="Hyperlink"/>
-          </w:rPr>
-          <w:t>edin</w:t>
+          <w:t>Linkedin</w:t>
         </w:r>
       </w:hyperlink>
     </w:p>
     <w:p>
       <w:pPr>
         <w:pStyle w:val="ContactInfo"/>
+        <w:rPr>
+          <w:rFonts w:cstheme="minorHAnsi"/>
+        </w:rPr>
       </w:pPr>
       <w:hyperlink r:id="rId11" w:history="1">
         <w:r>
           <w:rPr>
             <w:rStyle w:val="Hyperlink"/>
+            <w:rFonts w:cstheme="minorHAnsi"/>
           </w:rPr>
           <w:t>GIthub</w:t>
         </w:r>
@@ -46,10 +54,14 @@
       <w:pPr>
         <w:pStyle w:val="ContactInfo"/>
         <w:rPr>
+          <w:rFonts w:cstheme="minorHAnsi"/>
           <w:lang w:val="fr-FR"/>
         </w:rPr>
       </w:pPr>
       <w:r>
+        <w:rPr>
+          <w:rFonts w:cstheme="minorHAnsi"/>
+        </w:rPr>
         <w:t>harsrini411@gmail.com</w:t>
       </w:r>
     </w:p>
@@ -57,14 +69,19 @@
       <w:pPr>
         <w:pStyle w:val="ContactInfo"/>
         <w:rPr>
+          <w:rFonts w:cstheme="minorHAnsi"/>
           <w:lang w:val="fr-FR"/>
         </w:rPr>
       </w:pPr>
       <w:r>
+        <w:rPr>
+          <w:rFonts w:cstheme="minorHAnsi"/>
+        </w:rPr>
         <w:t>Bengaluru,</w:t>
       </w:r>
       <w:r>
         <w:rPr>
+          <w:rFonts w:cstheme="minorHAnsi"/>
           <w:lang w:val="fr-FR"/>
         </w:rPr>
         <w:t xml:space="preserve"> Karnataka, india</w:t>
@@ -74,6 +91,7 @@
       <w:pPr>
         <w:pStyle w:val="Line"/>
         <w:rPr>
+          <w:rFonts w:cstheme="minorHAnsi"/>
           <w:lang w:val="fr-FR"/>
         </w:rPr>
       </w:pPr>
@@ -82,22 +100,36 @@
       <w:pPr>
         <w:pStyle w:val="Heading1"/>
         <w:rPr>
+          <w:rFonts w:asciiTheme="minorHAnsi" w:hAnsiTheme="minorHAnsi" w:cstheme="minorHAnsi"/>
+          <w:b/>
+          <w:bCs/>
           <w:lang w:val="fr-FR"/>
         </w:rPr>
       </w:pPr>
       <w:r>
+        <w:rPr>
+          <w:rFonts w:asciiTheme="minorHAnsi" w:hAnsiTheme="minorHAnsi" w:cstheme="minorHAnsi"/>
+          <w:b/>
+          <w:bCs/>
+        </w:rPr>
         <w:t>Summary</w:t>
       </w:r>
     </w:p>
     <w:p>
       <w:pPr>
         <w:pStyle w:val="Line"/>
+        <w:rPr>
+          <w:rFonts w:cstheme="minorHAnsi"/>
+        </w:rPr>
       </w:pPr>
       <w:r>
+        <w:rPr>
+          <w:rFonts w:cstheme="minorHAnsi"/>
+        </w:rPr>
         <mc:AlternateContent>
           <mc:Choice Requires="wps">
             <w:drawing>
-              <wp:inline distT="0" distB="0" distL="0" distR="0" wp14:anchorId="0924DA7D" wp14:editId="226FC843">
+              <wp:inline distT="0" distB="0" distL="0" distR="0" wp14:anchorId="3D56475E" wp14:editId="31FCAEB3">
                 <wp:extent cx="5943600" cy="0"/>
                 <wp:effectExtent l="0" t="0" r="0" b="0"/>
                 <wp:docPr id="290712055" name="Straight Connector 1">
@@ -151,7 +183,7 @@
           </mc:Choice>
           <mc:Fallback>
             <w:pict>
-              <v:line w14:anchorId="3349B3CB" id="Straight Connector 1" o:spid="_x0000_s1026" alt="&quot;&quot;" style="visibility:visible;mso-wrap-style:square;mso-left-percent:-10001;mso-top-percent:-10001;mso-position-horizontal:absolute;mso-position-horizontal-relative:char;mso-position-vertical:absolute;mso-position-vertical-relative:line;mso-left-percent:-10001;mso-top-percent:-10001" from="0,0" to="468pt,0" o:gfxdata="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" strokecolor="#bfbfbf [2412]" strokeweight=".5pt">
+              <v:line w14:anchorId="2086B401" id="Straight Connector 1" o:spid="_x0000_s1026" alt="&quot;&quot;" style="visibility:visible;mso-wrap-style:square;mso-left-percent:-10001;mso-top-percent:-10001;mso-position-horizontal:absolute;mso-position-horizontal-relative:char;mso-position-vertical:absolute;mso-position-vertical-relative:line;mso-left-percent:-10001;mso-top-percent:-10001" from="0,0" to="468pt,0" o:gfxdata="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" strokecolor="#bfbfbf [2412]" strokeweight=".5pt">
                 <v:stroke joinstyle="miter"/>
                 <w10:anchorlock/>
               </v:line>
@@ -163,14 +195,21 @@
     <w:p>
       <w:pPr>
         <w:jc w:val="both"/>
+        <w:rPr>
+          <w:rFonts w:asciiTheme="minorHAnsi" w:hAnsiTheme="minorHAnsi" w:cstheme="minorHAnsi"/>
+        </w:rPr>
       </w:pPr>
       <w:r>
-        <w:t>As a dedicated BCA student at Dayananda Sagar University, I possess a strong passion for Data Analytics and Web Development. My commitment to continuous learning is evidenced by my proficiency in a diverse set of tools and languages, including Python, Power BI, Excel, and Figma, alongside foundational knowledge in HTML and CSS. My academic journey is complemented by hands-on experience through various projects that showcase my ability to apply these skills effectively.</w:t>
+        <w:rPr>
+          <w:rFonts w:asciiTheme="minorHAnsi" w:hAnsiTheme="minorHAnsi" w:cstheme="minorHAnsi"/>
+        </w:rPr>
+        <w:t>I have completed my BCA at Dayananda Sagar University, where I developed a strong passion for Data Analytics and Web Development. My commitment to continuous learning is reflected in my proficiency with a diverse set of tools and languages, including Python, Power BI, Excel, and Figma, along with foundational knowledge of HTML and CSS. My academic journey is enriched by hands-on experience through various projects that demonstrate my ability to apply these skills effectively.</w:t>
       </w:r>
     </w:p>
     <w:p>
       <w:pPr>
         <w:rPr>
+          <w:rFonts w:asciiTheme="minorHAnsi" w:hAnsiTheme="minorHAnsi" w:cstheme="minorHAnsi"/>
           <w:sz w:val="18"/>
           <w:szCs w:val="16"/>
         </w:rPr>
@@ -179,20 +218,692 @@
     <w:p>
       <w:pPr>
         <w:pStyle w:val="Heading1"/>
+        <w:spacing w:before="0"/>
+        <w:rPr>
+          <w:rFonts w:asciiTheme="minorHAnsi" w:hAnsiTheme="minorHAnsi" w:cstheme="minorHAnsi"/>
+          <w:b/>
+          <w:szCs w:val="24"/>
+        </w:rPr>
+      </w:pPr>
+      <w:sdt>
+        <w:sdtPr>
+          <w:rPr>
+            <w:rFonts w:asciiTheme="minorHAnsi" w:hAnsiTheme="minorHAnsi" w:cstheme="minorHAnsi"/>
+            <w:b/>
+            <w:szCs w:val="24"/>
+          </w:rPr>
+          <w:id w:val="728805515"/>
+          <w:placeholder>
+            <w:docPart w:val="B1960E8FC1C746E1958FF01958A4A076"/>
+          </w:placeholder>
+          <w:temporary/>
+          <w:showingPlcHdr/>
+          <w15:appearance w15:val="hidden"/>
+        </w:sdtPr>
+        <w:sdtEndPr>
+          <w:rPr>
+            <w:b w:val="0"/>
+            <w:szCs w:val="28"/>
+          </w:rPr>
+        </w:sdtEndPr>
+        <w:sdtContent>
+          <w:r>
+            <w:rPr>
+              <w:rFonts w:asciiTheme="minorHAnsi" w:hAnsiTheme="minorHAnsi" w:cstheme="minorHAnsi"/>
+              <w:b/>
+              <w:bCs/>
+            </w:rPr>
+            <w:t>Education</w:t>
+          </w:r>
+        </w:sdtContent>
+      </w:sdt>
+    </w:p>
+    <w:p>
+      <w:pPr>
+        <w:pStyle w:val="Line"/>
+        <w:rPr>
+          <w:rFonts w:cstheme="minorHAnsi"/>
+        </w:rPr>
       </w:pPr>
       <w:r>
+        <w:rPr>
+          <w:rFonts w:cstheme="minorHAnsi"/>
+        </w:rPr>
+        <mc:AlternateContent>
+          <mc:Choice Requires="wps">
+            <w:drawing>
+              <wp:inline distT="0" distB="0" distL="0" distR="0" wp14:anchorId="45C6E2CB" wp14:editId="79F75072">
+                <wp:extent cx="5943600" cy="0"/>
+                <wp:effectExtent l="0" t="0" r="0" b="0"/>
+                <wp:docPr id="1940888775" name="Straight Connector 1">
+                  <a:extLst xmlns:a="http://schemas.openxmlformats.org/drawingml/2006/main">
+                    <a:ext uri="{C183D7F6-B498-43B3-948B-1728B52AA6E4}">
+                      <adec:decorative xmlns:adec="http://schemas.microsoft.com/office/drawing/2017/decorative" val="1"/>
+                    </a:ext>
+                  </a:extLst>
+                </wp:docPr>
+                <wp:cNvGraphicFramePr/>
+                <a:graphic xmlns:a="http://schemas.openxmlformats.org/drawingml/2006/main">
+                  <a:graphicData uri="http://schemas.microsoft.com/office/word/2010/wordprocessingShape">
+                    <wps:wsp>
+                      <wps:cNvCnPr/>
+                      <wps:spPr>
+                        <a:xfrm>
+                          <a:off x="0" y="0"/>
+                          <a:ext cx="5943600" cy="0"/>
+                        </a:xfrm>
+                        <a:prstGeom prst="line">
+                          <a:avLst/>
+                        </a:prstGeom>
+                        <a:noFill/>
+                        <a:ln w="6350" cap="flat" cmpd="sng" algn="ctr">
+                          <a:solidFill>
+                            <a:sysClr val="window" lastClr="FFFFFF">
+                              <a:lumMod val="75000"/>
+                            </a:sysClr>
+                          </a:solidFill>
+                          <a:prstDash val="solid"/>
+                          <a:miter lim="800000"/>
+                        </a:ln>
+                        <a:effectLst/>
+                      </wps:spPr>
+                      <wps:bodyPr/>
+                    </wps:wsp>
+                  </a:graphicData>
+                </a:graphic>
+              </wp:inline>
+            </w:drawing>
+          </mc:Choice>
+          <mc:Fallback>
+            <w:pict>
+              <v:line w14:anchorId="4CDA904A" id="Straight Connector 1" o:spid="_x0000_s1026" alt="&quot;&quot;" style="visibility:visible;mso-wrap-style:square;mso-left-percent:-10001;mso-top-percent:-10001;mso-position-horizontal:absolute;mso-position-horizontal-relative:char;mso-position-vertical:absolute;mso-position-vertical-relative:line;mso-left-percent:-10001;mso-top-percent:-10001" from="0,0" to="468pt,0" o:gfxdata="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" strokecolor="#bfbfbf" strokeweight=".5pt">
+                <v:stroke joinstyle="miter"/>
+                <w10:anchorlock/>
+              </v:line>
+            </w:pict>
+          </mc:Fallback>
+        </mc:AlternateContent>
+      </w:r>
+    </w:p>
+    <w:p>
+      <w:pPr>
+        <w:pStyle w:val="Line"/>
+        <w:rPr>
+          <w:rFonts w:cstheme="minorHAnsi"/>
+        </w:rPr>
+      </w:pPr>
+    </w:p>
+    <w:tbl>
+      <w:tblPr>
+        <w:tblStyle w:val="TableGrid"/>
+        <w:tblW w:w="9355" w:type="dxa"/>
+        <w:tblLook w:val="04A0" w:firstRow="1" w:lastRow="0" w:firstColumn="1" w:lastColumn="0" w:noHBand="0" w:noVBand="1"/>
+      </w:tblPr>
+      <w:tblGrid>
+        <w:gridCol w:w="4320"/>
+        <w:gridCol w:w="3055"/>
+        <w:gridCol w:w="1980"/>
+      </w:tblGrid>
+      <w:tr>
+        <w:trPr>
+          <w:trHeight w:val="432"/>
+        </w:trPr>
+        <w:tc>
+          <w:tcPr>
+            <w:tcW w:w="4320" w:type="dxa"/>
+            <w:vAlign w:val="center"/>
+          </w:tcPr>
+          <w:p>
+            <w:pPr>
+              <w:pStyle w:val="Heading2"/>
+              <w:spacing w:before="0"/>
+              <w:jc w:val="center"/>
+              <w:rPr>
+                <w:rStyle w:val="NotBold"/>
+                <w:rFonts w:asciiTheme="minorHAnsi" w:hAnsiTheme="minorHAnsi" w:cstheme="minorHAnsi"/>
+                <w:b/>
+                <w:bCs/>
+              </w:rPr>
+            </w:pPr>
+            <w:r>
+              <w:rPr>
+                <w:rStyle w:val="NotBold"/>
+                <w:rFonts w:asciiTheme="minorHAnsi" w:hAnsiTheme="minorHAnsi" w:cstheme="minorHAnsi"/>
+                <w:b/>
+                <w:bCs/>
+              </w:rPr>
+              <w:t>Academic</w:t>
+            </w:r>
+          </w:p>
+        </w:tc>
+        <w:tc>
+          <w:tcPr>
+            <w:tcW w:w="3055" w:type="dxa"/>
+            <w:vAlign w:val="center"/>
+          </w:tcPr>
+          <w:p>
+            <w:pPr>
+              <w:pStyle w:val="Heading2"/>
+              <w:spacing w:before="0"/>
+              <w:jc w:val="center"/>
+              <w:rPr>
+                <w:rStyle w:val="NotBold"/>
+                <w:rFonts w:asciiTheme="minorHAnsi" w:hAnsiTheme="minorHAnsi" w:cstheme="minorHAnsi"/>
+                <w:b/>
+                <w:bCs/>
+              </w:rPr>
+            </w:pPr>
+            <w:r>
+              <w:rPr>
+                <w:rStyle w:val="NotBold"/>
+                <w:rFonts w:asciiTheme="minorHAnsi" w:hAnsiTheme="minorHAnsi" w:cstheme="minorHAnsi"/>
+                <w:b/>
+                <w:bCs/>
+              </w:rPr>
+              <w:t>Year of Passing</w:t>
+            </w:r>
+          </w:p>
+        </w:tc>
+        <w:tc>
+          <w:tcPr>
+            <w:tcW w:w="1980" w:type="dxa"/>
+            <w:vAlign w:val="center"/>
+          </w:tcPr>
+          <w:p>
+            <w:pPr>
+              <w:pStyle w:val="Heading2"/>
+              <w:spacing w:before="0"/>
+              <w:jc w:val="center"/>
+              <w:rPr>
+                <w:rStyle w:val="NotBold"/>
+                <w:rFonts w:asciiTheme="minorHAnsi" w:hAnsiTheme="minorHAnsi" w:cstheme="minorHAnsi"/>
+                <w:b/>
+                <w:bCs/>
+              </w:rPr>
+            </w:pPr>
+            <w:r>
+              <w:rPr>
+                <w:rStyle w:val="NotBold"/>
+                <w:rFonts w:asciiTheme="minorHAnsi" w:hAnsiTheme="minorHAnsi" w:cstheme="minorHAnsi"/>
+                <w:b/>
+                <w:bCs/>
+              </w:rPr>
+              <w:t>% Obtained / CGPA</w:t>
+            </w:r>
+          </w:p>
+        </w:tc>
+      </w:tr>
+      <w:tr>
+        <w:trPr>
+          <w:trHeight w:val="432"/>
+        </w:trPr>
+        <w:tc>
+          <w:tcPr>
+            <w:tcW w:w="4320" w:type="dxa"/>
+            <w:vAlign w:val="center"/>
+          </w:tcPr>
+          <w:p>
+            <w:pPr>
+              <w:pStyle w:val="Heading2"/>
+              <w:spacing w:before="0"/>
+              <w:rPr>
+                <w:rFonts w:asciiTheme="minorHAnsi" w:hAnsiTheme="minorHAnsi" w:cstheme="minorHAnsi"/>
+              </w:rPr>
+            </w:pPr>
+            <w:r>
+              <w:rPr>
+                <w:rFonts w:asciiTheme="minorHAnsi" w:hAnsiTheme="minorHAnsi" w:cstheme="minorHAnsi"/>
+              </w:rPr>
+              <w:t>Bachelor of Computer Applications (BCA)</w:t>
+            </w:r>
+          </w:p>
+          <w:p>
+            <w:pPr>
+              <w:pStyle w:val="Heading2"/>
+              <w:spacing w:before="0"/>
+              <w:rPr>
+                <w:rFonts w:asciiTheme="minorHAnsi" w:hAnsiTheme="minorHAnsi" w:cstheme="minorHAnsi"/>
+                <w:b w:val="0"/>
+                <w:bCs/>
+              </w:rPr>
+            </w:pPr>
+            <w:r>
+              <w:rPr>
+                <w:rFonts w:asciiTheme="minorHAnsi" w:hAnsiTheme="minorHAnsi" w:cstheme="minorHAnsi"/>
+                <w:b w:val="0"/>
+                <w:bCs/>
+              </w:rPr>
+              <w:t>Dayananda Sagar University, Bengaluru</w:t>
+            </w:r>
+          </w:p>
+        </w:tc>
+        <w:tc>
+          <w:tcPr>
+            <w:tcW w:w="3055" w:type="dxa"/>
+            <w:vAlign w:val="center"/>
+          </w:tcPr>
+          <w:p>
+            <w:pPr>
+              <w:pStyle w:val="Heading2"/>
+              <w:spacing w:before="0"/>
+              <w:jc w:val="center"/>
+              <w:rPr>
+                <w:rStyle w:val="NotBold"/>
+                <w:rFonts w:asciiTheme="minorHAnsi" w:hAnsiTheme="minorHAnsi" w:cstheme="minorHAnsi"/>
+                <w:b/>
+                <w:bCs/>
+              </w:rPr>
+            </w:pPr>
+            <w:r>
+              <w:rPr>
+                <w:rStyle w:val="NotBold"/>
+                <w:rFonts w:asciiTheme="minorHAnsi" w:hAnsiTheme="minorHAnsi" w:cstheme="minorHAnsi"/>
+              </w:rPr>
+              <w:t xml:space="preserve">May </w:t>
+            </w:r>
+            <w:r>
+              <w:rPr>
+                <w:rStyle w:val="NotBold"/>
+                <w:rFonts w:asciiTheme="minorHAnsi" w:hAnsiTheme="minorHAnsi" w:cstheme="minorHAnsi"/>
+              </w:rPr>
+              <w:t>2025</w:t>
+            </w:r>
+          </w:p>
+        </w:tc>
+        <w:tc>
+          <w:tcPr>
+            <w:tcW w:w="1980" w:type="dxa"/>
+            <w:vAlign w:val="center"/>
+          </w:tcPr>
+          <w:p>
+            <w:pPr>
+              <w:pStyle w:val="Heading2"/>
+              <w:spacing w:before="0"/>
+              <w:jc w:val="center"/>
+              <w:rPr>
+                <w:rStyle w:val="NotBold"/>
+                <w:rFonts w:asciiTheme="minorHAnsi" w:hAnsiTheme="minorHAnsi" w:cstheme="minorHAnsi"/>
+                <w:b/>
+                <w:bCs/>
+              </w:rPr>
+            </w:pPr>
+            <w:r>
+              <w:rPr>
+                <w:rStyle w:val="NotBold"/>
+                <w:rFonts w:asciiTheme="minorHAnsi" w:hAnsiTheme="minorHAnsi" w:cstheme="minorHAnsi"/>
+                <w:b/>
+                <w:bCs/>
+              </w:rPr>
+              <w:t>8.5</w:t>
+            </w:r>
+            <w:r>
+              <w:rPr>
+                <w:rStyle w:val="NotBold"/>
+                <w:rFonts w:asciiTheme="minorHAnsi" w:hAnsiTheme="minorHAnsi" w:cstheme="minorHAnsi"/>
+                <w:b/>
+                <w:bCs/>
+              </w:rPr>
+              <w:t>9</w:t>
+            </w:r>
+          </w:p>
+        </w:tc>
+      </w:tr>
+      <w:tr>
+        <w:trPr>
+          <w:trHeight w:val="432"/>
+        </w:trPr>
+        <w:tc>
+          <w:tcPr>
+            <w:tcW w:w="4320" w:type="dxa"/>
+            <w:vAlign w:val="center"/>
+          </w:tcPr>
+          <w:p>
+            <w:pPr>
+              <w:pStyle w:val="Heading2"/>
+              <w:spacing w:before="0"/>
+              <w:rPr>
+                <w:rStyle w:val="NotBold"/>
+                <w:rFonts w:asciiTheme="minorHAnsi" w:hAnsiTheme="minorHAnsi" w:cstheme="minorHAnsi"/>
+                <w:b/>
+                <w:bCs/>
+              </w:rPr>
+            </w:pPr>
+            <w:r>
+              <w:rPr>
+                <w:rStyle w:val="NotBold"/>
+                <w:rFonts w:asciiTheme="minorHAnsi" w:hAnsiTheme="minorHAnsi" w:cstheme="minorHAnsi"/>
+                <w:b/>
+                <w:bCs/>
+              </w:rPr>
+              <w:t>Pre-University</w:t>
+            </w:r>
+            <w:r>
+              <w:rPr>
+                <w:rStyle w:val="NotBold"/>
+                <w:rFonts w:asciiTheme="minorHAnsi" w:hAnsiTheme="minorHAnsi" w:cstheme="minorHAnsi"/>
+              </w:rPr>
+              <w:t xml:space="preserve"> </w:t>
+            </w:r>
+            <w:r>
+              <w:rPr>
+                <w:rStyle w:val="NotBold"/>
+                <w:rFonts w:asciiTheme="minorHAnsi" w:hAnsiTheme="minorHAnsi" w:cstheme="minorHAnsi"/>
+                <w:b/>
+                <w:bCs/>
+              </w:rPr>
+              <w:t>(12</w:t>
+            </w:r>
+            <w:r>
+              <w:rPr>
+                <w:rStyle w:val="NotBold"/>
+                <w:rFonts w:asciiTheme="minorHAnsi" w:hAnsiTheme="minorHAnsi" w:cstheme="minorHAnsi"/>
+                <w:b/>
+                <w:bCs/>
+                <w:vertAlign w:val="superscript"/>
+              </w:rPr>
+              <w:t>th</w:t>
+            </w:r>
+            <w:r>
+              <w:rPr>
+                <w:rStyle w:val="NotBold"/>
+                <w:rFonts w:asciiTheme="minorHAnsi" w:hAnsiTheme="minorHAnsi" w:cstheme="minorHAnsi"/>
+                <w:b/>
+                <w:bCs/>
+              </w:rPr>
+              <w:t xml:space="preserve"> - PUC</w:t>
+            </w:r>
+            <w:r>
+              <w:rPr>
+                <w:rStyle w:val="NotBold"/>
+                <w:rFonts w:asciiTheme="minorHAnsi" w:hAnsiTheme="minorHAnsi" w:cstheme="minorHAnsi"/>
+                <w:b/>
+                <w:bCs/>
+              </w:rPr>
+              <w:t xml:space="preserve">) </w:t>
+            </w:r>
+          </w:p>
+          <w:p>
+            <w:pPr>
+              <w:pStyle w:val="Heading2"/>
+              <w:spacing w:before="0"/>
+              <w:rPr>
+                <w:rStyle w:val="NotBold"/>
+                <w:rFonts w:asciiTheme="minorHAnsi" w:hAnsiTheme="minorHAnsi" w:cstheme="minorHAnsi"/>
+              </w:rPr>
+            </w:pPr>
+            <w:r>
+              <w:rPr>
+                <w:rStyle w:val="NotBold"/>
+                <w:rFonts w:asciiTheme="minorHAnsi" w:hAnsiTheme="minorHAnsi" w:cstheme="minorHAnsi"/>
+              </w:rPr>
+              <w:t>(Course: SCBA - Statistics, Computer Science, Business Studies, Accountancy)</w:t>
+            </w:r>
+          </w:p>
+          <w:p>
+            <w:pPr>
+              <w:pStyle w:val="Heading2"/>
+              <w:spacing w:before="0"/>
+              <w:rPr>
+                <w:rFonts w:asciiTheme="minorHAnsi" w:hAnsiTheme="minorHAnsi" w:cstheme="minorHAnsi"/>
+                <w:b w:val="0"/>
+                <w:bCs/>
+              </w:rPr>
+            </w:pPr>
+            <w:r>
+              <w:rPr>
+                <w:rFonts w:asciiTheme="minorHAnsi" w:hAnsiTheme="minorHAnsi" w:cstheme="minorHAnsi"/>
+                <w:b w:val="0"/>
+                <w:bCs/>
+              </w:rPr>
+              <w:t>SSMRV PU College, Bengaluru</w:t>
+            </w:r>
+          </w:p>
+        </w:tc>
+        <w:tc>
+          <w:tcPr>
+            <w:tcW w:w="3055" w:type="dxa"/>
+            <w:vAlign w:val="center"/>
+          </w:tcPr>
+          <w:p>
+            <w:pPr>
+              <w:pStyle w:val="Heading2"/>
+              <w:spacing w:before="0"/>
+              <w:jc w:val="center"/>
+              <w:rPr>
+                <w:rStyle w:val="NotBold"/>
+                <w:rFonts w:asciiTheme="minorHAnsi" w:hAnsiTheme="minorHAnsi" w:cstheme="minorHAnsi"/>
+                <w:b/>
+                <w:bCs/>
+              </w:rPr>
+            </w:pPr>
+            <w:r>
+              <w:rPr>
+                <w:rStyle w:val="NotBold"/>
+                <w:rFonts w:asciiTheme="minorHAnsi" w:hAnsiTheme="minorHAnsi" w:cstheme="minorHAnsi"/>
+              </w:rPr>
+              <w:t>May 2022</w:t>
+            </w:r>
+          </w:p>
+        </w:tc>
+        <w:tc>
+          <w:tcPr>
+            <w:tcW w:w="1980" w:type="dxa"/>
+            <w:vAlign w:val="center"/>
+          </w:tcPr>
+          <w:p>
+            <w:pPr>
+              <w:pStyle w:val="Heading2"/>
+              <w:spacing w:before="0"/>
+              <w:jc w:val="center"/>
+              <w:rPr>
+                <w:rStyle w:val="NotBold"/>
+                <w:rFonts w:asciiTheme="minorHAnsi" w:hAnsiTheme="minorHAnsi" w:cstheme="minorHAnsi"/>
+              </w:rPr>
+            </w:pPr>
+            <w:r>
+              <w:rPr>
+                <w:rStyle w:val="NotBold"/>
+                <w:rFonts w:asciiTheme="minorHAnsi" w:hAnsiTheme="minorHAnsi" w:cstheme="minorHAnsi"/>
+                <w:b/>
+                <w:bCs/>
+              </w:rPr>
+              <w:t>89%</w:t>
+            </w:r>
+          </w:p>
+        </w:tc>
+      </w:tr>
+      <w:tr>
+        <w:trPr>
+          <w:trHeight w:val="432"/>
+        </w:trPr>
+        <w:tc>
+          <w:tcPr>
+            <w:tcW w:w="4320" w:type="dxa"/>
+            <w:vAlign w:val="center"/>
+          </w:tcPr>
+          <w:p>
+            <w:pPr>
+              <w:pStyle w:val="Heading2"/>
+              <w:spacing w:before="0"/>
+              <w:rPr>
+                <w:rStyle w:val="NotBold"/>
+                <w:rFonts w:asciiTheme="minorHAnsi" w:hAnsiTheme="minorHAnsi" w:cstheme="minorHAnsi"/>
+              </w:rPr>
+            </w:pPr>
+            <w:r>
+              <w:rPr>
+                <w:rStyle w:val="NotBold"/>
+                <w:rFonts w:asciiTheme="minorHAnsi" w:hAnsiTheme="minorHAnsi" w:cstheme="minorHAnsi"/>
+                <w:b/>
+                <w:bCs/>
+              </w:rPr>
+              <w:t xml:space="preserve">S.S.L.C </w:t>
+            </w:r>
+            <w:r>
+              <w:rPr>
+                <w:rStyle w:val="NotBold"/>
+                <w:rFonts w:asciiTheme="minorHAnsi" w:hAnsiTheme="minorHAnsi" w:cstheme="minorHAnsi"/>
+                <w:b/>
+                <w:bCs/>
+              </w:rPr>
+              <w:t>(10</w:t>
+            </w:r>
+            <w:r>
+              <w:rPr>
+                <w:rStyle w:val="NotBold"/>
+                <w:rFonts w:asciiTheme="minorHAnsi" w:hAnsiTheme="minorHAnsi" w:cstheme="minorHAnsi"/>
+                <w:b/>
+                <w:bCs/>
+                <w:vertAlign w:val="superscript"/>
+              </w:rPr>
+              <w:t xml:space="preserve">th </w:t>
+            </w:r>
+            <w:r>
+              <w:rPr>
+                <w:rStyle w:val="NotBold"/>
+                <w:rFonts w:asciiTheme="minorHAnsi" w:hAnsiTheme="minorHAnsi" w:cstheme="minorHAnsi"/>
+                <w:b/>
+                <w:bCs/>
+              </w:rPr>
+              <w:t>– Matriculation)</w:t>
+            </w:r>
+          </w:p>
+          <w:p>
+            <w:pPr>
+              <w:pStyle w:val="Heading2"/>
+              <w:spacing w:before="0"/>
+              <w:rPr>
+                <w:rFonts w:asciiTheme="minorHAnsi" w:hAnsiTheme="minorHAnsi" w:cstheme="minorHAnsi"/>
+              </w:rPr>
+            </w:pPr>
+            <w:r>
+              <w:rPr>
+                <w:rStyle w:val="Heading2Char"/>
+                <w:rFonts w:asciiTheme="minorHAnsi" w:eastAsiaTheme="minorEastAsia" w:hAnsiTheme="minorHAnsi" w:cstheme="minorHAnsi"/>
+                <w:color w:val="262626" w:themeColor="text1" w:themeTint="D9"/>
+                <w:szCs w:val="22"/>
+              </w:rPr>
+              <w:t>Shantiniketan Trust School, Bengaluru</w:t>
+            </w:r>
+          </w:p>
+        </w:tc>
+        <w:tc>
+          <w:tcPr>
+            <w:tcW w:w="3055" w:type="dxa"/>
+            <w:vAlign w:val="center"/>
+          </w:tcPr>
+          <w:p>
+            <w:pPr>
+              <w:pStyle w:val="Heading2"/>
+              <w:spacing w:before="0"/>
+              <w:jc w:val="center"/>
+              <w:rPr>
+                <w:rStyle w:val="NotBold"/>
+                <w:rFonts w:asciiTheme="minorHAnsi" w:hAnsiTheme="minorHAnsi" w:cstheme="minorHAnsi"/>
+              </w:rPr>
+            </w:pPr>
+            <w:r>
+              <w:rPr>
+                <w:rStyle w:val="NotBold"/>
+                <w:rFonts w:asciiTheme="minorHAnsi" w:hAnsiTheme="minorHAnsi" w:cstheme="minorHAnsi"/>
+              </w:rPr>
+              <w:t>August 2020</w:t>
+            </w:r>
+          </w:p>
+        </w:tc>
+        <w:tc>
+          <w:tcPr>
+            <w:tcW w:w="1980" w:type="dxa"/>
+            <w:vAlign w:val="center"/>
+          </w:tcPr>
+          <w:p>
+            <w:pPr>
+              <w:pStyle w:val="Heading2"/>
+              <w:spacing w:before="0"/>
+              <w:jc w:val="center"/>
+              <w:rPr>
+                <w:rStyle w:val="NotBold"/>
+                <w:rFonts w:asciiTheme="minorHAnsi" w:hAnsiTheme="minorHAnsi" w:cstheme="minorHAnsi"/>
+                <w:b/>
+                <w:bCs/>
+              </w:rPr>
+            </w:pPr>
+            <w:r>
+              <w:rPr>
+                <w:rStyle w:val="NotBold"/>
+                <w:rFonts w:asciiTheme="minorHAnsi" w:hAnsiTheme="minorHAnsi" w:cstheme="minorHAnsi"/>
+                <w:b/>
+                <w:bCs/>
+              </w:rPr>
+              <w:t>6</w:t>
+            </w:r>
+            <w:r>
+              <w:rPr>
+                <w:rStyle w:val="NotBold"/>
+                <w:rFonts w:asciiTheme="minorHAnsi" w:hAnsiTheme="minorHAnsi" w:cstheme="minorHAnsi"/>
+                <w:b/>
+                <w:bCs/>
+              </w:rPr>
+              <w:t>6.56</w:t>
+            </w:r>
+            <w:r>
+              <w:rPr>
+                <w:rStyle w:val="NotBold"/>
+                <w:rFonts w:asciiTheme="minorHAnsi" w:hAnsiTheme="minorHAnsi" w:cstheme="minorHAnsi"/>
+                <w:b/>
+                <w:bCs/>
+              </w:rPr>
+              <w:t>%</w:t>
+            </w:r>
+          </w:p>
+        </w:tc>
+      </w:tr>
+    </w:tbl>
+    <w:p>
+      <w:pPr>
+        <w:pStyle w:val="Heading1"/>
+        <w:spacing w:before="0"/>
+        <w:rPr>
+          <w:rFonts w:asciiTheme="minorHAnsi" w:hAnsiTheme="minorHAnsi" w:cstheme="minorHAnsi"/>
+          <w:b/>
+          <w:bCs/>
+        </w:rPr>
+      </w:pPr>
+    </w:p>
+    <w:p>
+      <w:pPr>
+        <w:pStyle w:val="Heading1"/>
+        <w:spacing w:before="0"/>
+        <w:rPr>
+          <w:rFonts w:asciiTheme="minorHAnsi" w:hAnsiTheme="minorHAnsi" w:cstheme="minorHAnsi"/>
+          <w:b/>
+          <w:bCs/>
+        </w:rPr>
+      </w:pPr>
+      <w:r>
+        <w:rPr>
+          <w:rFonts w:asciiTheme="minorHAnsi" w:hAnsiTheme="minorHAnsi" w:cstheme="minorHAnsi"/>
+          <w:b/>
+          <w:bCs/>
+        </w:rPr>
         <w:t>Skills</w:t>
       </w:r>
     </w:p>
     <w:p>
       <w:pPr>
         <w:pStyle w:val="Line"/>
+        <w:rPr>
+          <w:rFonts w:cstheme="minorHAnsi"/>
+        </w:rPr>
       </w:pPr>
       <w:r>
+        <w:rPr>
+          <w:rFonts w:cstheme="minorHAnsi"/>
+        </w:rPr>
         <mc:AlternateContent>
           <mc:Choice Requires="wps">
             <w:drawing>
-              <wp:inline distT="0" distB="0" distL="0" distR="0" wp14:anchorId="4C30B5DC" wp14:editId="35626ECF">
+              <wp:inline distT="0" distB="0" distL="0" distR="0" wp14:anchorId="1FD6294A" wp14:editId="75FAC9BB">
                 <wp:extent cx="5943600" cy="0"/>
                 <wp:effectExtent l="0" t="0" r="0" b="0"/>
                 <wp:docPr id="16880014" name="Straight Connector 1">
@@ -236,7 +947,7 @@
           </mc:Choice>
           <mc:Fallback>
             <w:pict>
-              <v:line w14:anchorId="6F52D4D5" id="Straight Connector 1" o:spid="_x0000_s1026" alt="&quot;&quot;" style="visibility:visible;mso-wrap-style:square;mso-left-percent:-10001;mso-top-percent:-10001;mso-position-horizontal:absolute;mso-position-horizontal-relative:char;mso-position-vertical:absolute;mso-position-vertical-relative:line;mso-left-percent:-10001;mso-top-percent:-10001" from="0,0" to="468pt,0" o:gfxdata="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" strokecolor="#bfbfbf" strokeweight=".5pt">
+              <v:line w14:anchorId="773A9819" id="Straight Connector 1" o:spid="_x0000_s1026" alt="&quot;&quot;" style="visibility:visible;mso-wrap-style:square;mso-left-percent:-10001;mso-top-percent:-10001;mso-position-horizontal:absolute;mso-position-horizontal-relative:char;mso-position-vertical:absolute;mso-position-vertical-relative:line;mso-left-percent:-10001;mso-top-percent:-10001" from="0,0" to="468pt,0" o:gfxdata="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" strokecolor="#bfbfbf" strokeweight=".5pt">
                 <v:stroke joinstyle="miter"/>
                 <w10:anchorlock/>
               </v:line>
@@ -248,14 +959,21 @@
     <w:p>
       <w:pPr>
         <w:jc w:val="both"/>
+        <w:rPr>
+          <w:rFonts w:asciiTheme="minorHAnsi" w:hAnsiTheme="minorHAnsi" w:cstheme="minorHAnsi"/>
+        </w:rPr>
       </w:pPr>
       <w:r>
+        <w:rPr>
+          <w:rFonts w:asciiTheme="minorHAnsi" w:hAnsiTheme="minorHAnsi" w:cstheme="minorHAnsi"/>
+        </w:rPr>
         <w:t>With a foundational understanding of Python, I bring to the table a suite of technical abilities including data analytics with Power BI, advanced data management through Excel, design innovation via Figma, and web development skills with HTML &amp; CSS, all supported by practical knowledge of SQL for effective database management.</w:t>
       </w:r>
     </w:p>
     <w:p>
       <w:pPr>
         <w:rPr>
+          <w:rFonts w:asciiTheme="minorHAnsi" w:hAnsiTheme="minorHAnsi" w:cstheme="minorHAnsi"/>
           <w:sz w:val="18"/>
           <w:szCs w:val="16"/>
         </w:rPr>
@@ -264,23 +982,36 @@
     <w:p>
       <w:pPr>
         <w:pStyle w:val="Heading1"/>
+        <w:rPr>
+          <w:rFonts w:asciiTheme="minorHAnsi" w:hAnsiTheme="minorHAnsi" w:cstheme="minorHAnsi"/>
+          <w:b/>
+          <w:bCs/>
+        </w:rPr>
       </w:pPr>
       <w:r>
-        <w:t xml:space="preserve">INTERNSHIP </w:t>
-      </w:r>
-      <w:r>
-        <w:t>Experience</w:t>
+        <w:rPr>
+          <w:rFonts w:asciiTheme="minorHAnsi" w:hAnsiTheme="minorHAnsi" w:cstheme="minorHAnsi"/>
+          <w:b/>
+          <w:bCs/>
+        </w:rPr>
+        <w:t>INTERNSHIP Experience</w:t>
       </w:r>
     </w:p>
     <w:p>
       <w:pPr>
         <w:pStyle w:val="Line"/>
+        <w:rPr>
+          <w:rFonts w:cstheme="minorHAnsi"/>
+        </w:rPr>
       </w:pPr>
       <w:r>
+        <w:rPr>
+          <w:rFonts w:cstheme="minorHAnsi"/>
+        </w:rPr>
         <mc:AlternateContent>
           <mc:Choice Requires="wps">
             <w:drawing>
-              <wp:inline distT="0" distB="0" distL="0" distR="0" wp14:anchorId="46E48628" wp14:editId="47FB815A">
+              <wp:inline distT="0" distB="0" distL="0" distR="0" wp14:anchorId="311A0092" wp14:editId="4D94C1C5">
                 <wp:extent cx="5943600" cy="0"/>
                 <wp:effectExtent l="0" t="0" r="0" b="0"/>
                 <wp:docPr id="1297320815" name="Straight Connector 1">
@@ -324,7 +1055,7 @@
           </mc:Choice>
           <mc:Fallback>
             <w:pict>
-              <v:line w14:anchorId="09F04CCB" id="Straight Connector 1" o:spid="_x0000_s1026" alt="&quot;&quot;" style="visibility:visible;mso-wrap-style:square;mso-left-percent:-10001;mso-top-percent:-10001;mso-position-horizontal:absolute;mso-position-horizontal-relative:char;mso-position-vertical:absolute;mso-position-vertical-relative:line;mso-left-percent:-10001;mso-top-percent:-10001" from="0,0" to="468pt,0" o:gfxdata="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" strokecolor="#bfbfbf" strokeweight=".5pt">
+              <v:line w14:anchorId="757CFEDD" id="Straight Connector 1" o:spid="_x0000_s1026" alt="&quot;&quot;" style="visibility:visible;mso-wrap-style:square;mso-left-percent:-10001;mso-top-percent:-10001;mso-position-horizontal:absolute;mso-position-horizontal-relative:char;mso-position-vertical:absolute;mso-position-vertical-relative:line;mso-left-percent:-10001;mso-top-percent:-10001" from="0,0" to="468pt,0" o:gfxdata="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" strokecolor="#bfbfbf" strokeweight=".5pt">
                 <v:stroke joinstyle="miter"/>
                 <w10:anchorlock/>
               </v:line>
@@ -337,7 +1068,7 @@
       <w:pPr>
         <w:rPr>
           <w:rStyle w:val="Heading2Char"/>
-          <w:rFonts w:eastAsiaTheme="minorEastAsia" w:cstheme="minorBidi"/>
+          <w:rFonts w:asciiTheme="minorHAnsi" w:eastAsiaTheme="minorEastAsia" w:hAnsiTheme="minorHAnsi" w:cstheme="minorHAnsi"/>
           <w:bCs/>
           <w:color w:val="262626" w:themeColor="text1" w:themeTint="D9"/>
           <w:szCs w:val="22"/>
@@ -346,7 +1077,47 @@
       <w:r>
         <w:rPr>
           <w:rStyle w:val="Heading2Char"/>
-          <w:rFonts w:eastAsiaTheme="minorEastAsia" w:cstheme="minorBidi"/>
+          <w:rFonts w:asciiTheme="minorHAnsi" w:eastAsiaTheme="minorEastAsia" w:hAnsiTheme="minorHAnsi" w:cstheme="minorHAnsi"/>
+          <w:bCs/>
+          <w:color w:val="262626" w:themeColor="text1" w:themeTint="D9"/>
+          <w:szCs w:val="22"/>
+        </w:rPr>
+        <w:t>Company: Ioncure Tech Pvt.</w:t>
+      </w:r>
+      <w:r>
+        <w:rPr>
+          <w:rStyle w:val="Heading2Char"/>
+          <w:rFonts w:asciiTheme="minorHAnsi" w:eastAsiaTheme="minorEastAsia" w:hAnsiTheme="minorHAnsi" w:cstheme="minorHAnsi"/>
+          <w:bCs/>
+          <w:color w:val="262626" w:themeColor="text1" w:themeTint="D9"/>
+          <w:szCs w:val="22"/>
+        </w:rPr>
+        <w:t xml:space="preserve"> </w:t>
+      </w:r>
+      <w:r>
+        <w:rPr>
+          <w:rStyle w:val="Heading2Char"/>
+          <w:rFonts w:asciiTheme="minorHAnsi" w:eastAsiaTheme="minorEastAsia" w:hAnsiTheme="minorHAnsi" w:cstheme="minorHAnsi"/>
+          <w:bCs/>
+          <w:color w:val="262626" w:themeColor="text1" w:themeTint="D9"/>
+          <w:szCs w:val="22"/>
+        </w:rPr>
+        <w:t>Ltd</w:t>
+      </w:r>
+      <w:r>
+        <w:rPr>
+          <w:rStyle w:val="Heading2Char"/>
+          <w:rFonts w:asciiTheme="minorHAnsi" w:eastAsiaTheme="minorEastAsia" w:hAnsiTheme="minorHAnsi" w:cstheme="minorHAnsi"/>
+          <w:bCs/>
+          <w:color w:val="262626" w:themeColor="text1" w:themeTint="D9"/>
+          <w:szCs w:val="22"/>
+        </w:rPr>
+        <w:t xml:space="preserve"> (</w:t>
+      </w:r>
+      <w:r>
+        <w:rPr>
+          <w:rStyle w:val="Heading2Char"/>
+          <w:rFonts w:asciiTheme="minorHAnsi" w:eastAsiaTheme="minorEastAsia" w:hAnsiTheme="minorHAnsi" w:cstheme="minorHAnsi"/>
           <w:bCs/>
           <w:color w:val="262626" w:themeColor="text1" w:themeTint="D9"/>
           <w:szCs w:val="22"/>
@@ -356,23 +1127,12 @@
       <w:r>
         <w:rPr>
           <w:rStyle w:val="Heading2Char"/>
-          <w:rFonts w:eastAsiaTheme="minorEastAsia" w:cstheme="minorBidi"/>
+          <w:rFonts w:asciiTheme="minorHAnsi" w:eastAsiaTheme="minorEastAsia" w:hAnsiTheme="minorHAnsi" w:cstheme="minorHAnsi"/>
           <w:bCs/>
           <w:color w:val="262626" w:themeColor="text1" w:themeTint="D9"/>
           <w:szCs w:val="22"/>
         </w:rPr>
-        <w:tab/>
-        <w:t xml:space="preserve">Company: </w:t>
-      </w:r>
-      <w:r>
-        <w:rPr>
-          <w:rStyle w:val="Heading2Char"/>
-          <w:rFonts w:eastAsiaTheme="minorEastAsia" w:cstheme="minorBidi"/>
-          <w:bCs/>
-          <w:color w:val="262626" w:themeColor="text1" w:themeTint="D9"/>
-          <w:szCs w:val="22"/>
-        </w:rPr>
-        <w:t>Ioncure Tech Pvt.Ltd</w:t>
+        <w:t>)</w:t>
       </w:r>
     </w:p>
     <w:p>
@@ -382,7 +1142,9 @@
           <w:ilvl w:val="0"/>
           <w:numId w:val="22"/>
         </w:numPr>
+        <w:ind w:left="360"/>
         <w:rPr>
+          <w:rFonts w:asciiTheme="minorHAnsi" w:hAnsiTheme="minorHAnsi" w:cstheme="minorHAnsi"/>
           <w:b/>
           <w:bCs/>
           <w:szCs w:val="20"/>
@@ -390,6 +1152,7 @@
       </w:pPr>
       <w:r>
         <w:rPr>
+          <w:rFonts w:asciiTheme="minorHAnsi" w:hAnsiTheme="minorHAnsi" w:cstheme="minorHAnsi"/>
           <w:b/>
           <w:bCs/>
           <w:szCs w:val="20"/>
@@ -402,15 +1165,17 @@
         <w:pStyle w:val="ListParagraph"/>
         <w:numPr>
           <w:ilvl w:val="0"/>
-          <w:numId w:val="25"/>
+          <w:numId w:val="26"/>
         </w:numPr>
         <w:jc w:val="both"/>
         <w:rPr>
+          <w:rFonts w:asciiTheme="minorHAnsi" w:hAnsiTheme="minorHAnsi" w:cstheme="minorHAnsi"/>
           <w:szCs w:val="20"/>
         </w:rPr>
       </w:pPr>
       <w:r>
         <w:rPr>
+          <w:rFonts w:asciiTheme="minorHAnsi" w:hAnsiTheme="minorHAnsi" w:cstheme="minorHAnsi"/>
           <w:szCs w:val="20"/>
         </w:rPr>
         <w:t>Participated in a comprehensive data collection and web scraping project focused on state-wise news channels, newspapers, and online news portals. The initiative aimed to compile a detailed list of email IDs for the promotion of two major books—one showcasing the remarkable achievements of the honorable Prime Minister and the other exploring the AI revolution in India.</w:t>
@@ -421,15 +1186,17 @@
         <w:pStyle w:val="ListParagraph"/>
         <w:numPr>
           <w:ilvl w:val="0"/>
-          <w:numId w:val="25"/>
+          <w:numId w:val="26"/>
         </w:numPr>
         <w:jc w:val="both"/>
         <w:rPr>
+          <w:rFonts w:asciiTheme="minorHAnsi" w:hAnsiTheme="minorHAnsi" w:cstheme="minorHAnsi"/>
           <w:szCs w:val="20"/>
         </w:rPr>
       </w:pPr>
       <w:r>
         <w:rPr>
+          <w:rFonts w:asciiTheme="minorHAnsi" w:hAnsiTheme="minorHAnsi" w:cstheme="minorHAnsi"/>
           <w:szCs w:val="20"/>
         </w:rPr>
         <w:t>Collected and meticulously cleaned a dataset of approximately 30,000 email IDs from various states, utilizing Python for web scraping and Excel for data cleaning. Ensured the accuracy and relevance of the dataset by removing duplicates and irrelevant entries.</w:t>
@@ -440,15 +1207,17 @@
         <w:pStyle w:val="ListParagraph"/>
         <w:numPr>
           <w:ilvl w:val="0"/>
-          <w:numId w:val="25"/>
+          <w:numId w:val="26"/>
         </w:numPr>
         <w:jc w:val="both"/>
         <w:rPr>
+          <w:rFonts w:asciiTheme="minorHAnsi" w:hAnsiTheme="minorHAnsi" w:cstheme="minorHAnsi"/>
           <w:szCs w:val="20"/>
         </w:rPr>
       </w:pPr>
       <w:r>
         <w:rPr>
+          <w:rFonts w:asciiTheme="minorHAnsi" w:hAnsiTheme="minorHAnsi" w:cstheme="minorHAnsi"/>
           <w:szCs w:val="20"/>
         </w:rPr>
         <w:t>Gained hands-on experience in writing bulk emails, creating blogs using AI chatbot tools, and distributing content across social media platforms. This experience significantly enhanced skills in data processing, automation, and digital marketing.</w:t>
@@ -457,6 +1226,7 @@
     <w:p>
       <w:pPr>
         <w:rPr>
+          <w:rFonts w:asciiTheme="minorHAnsi" w:hAnsiTheme="minorHAnsi" w:cstheme="minorHAnsi"/>
           <w:b/>
           <w:bCs/>
           <w:szCs w:val="20"/>
@@ -464,6 +1234,25 @@
       </w:pPr>
       <w:r>
         <w:rPr>
+          <w:rFonts w:asciiTheme="minorHAnsi" w:hAnsiTheme="minorHAnsi" w:cstheme="minorHAnsi"/>
+          <w:b/>
+          <w:bCs/>
+          <w:szCs w:val="20"/>
+        </w:rPr>
+        <w:t>Company: PwC Switzerland Power BI Job Simulation on Forage</w:t>
+      </w:r>
+      <w:r>
+        <w:rPr>
+          <w:rFonts w:asciiTheme="minorHAnsi" w:hAnsiTheme="minorHAnsi" w:cstheme="minorHAnsi"/>
+          <w:b/>
+          <w:bCs/>
+          <w:szCs w:val="20"/>
+        </w:rPr>
+        <w:t xml:space="preserve"> (</w:t>
+      </w:r>
+      <w:r>
+        <w:rPr>
+          <w:rFonts w:asciiTheme="minorHAnsi" w:hAnsiTheme="minorHAnsi" w:cstheme="minorHAnsi"/>
           <w:b/>
           <w:bCs/>
           <w:szCs w:val="20"/>
@@ -472,20 +1261,12 @@
       </w:r>
       <w:r>
         <w:rPr>
+          <w:rFonts w:asciiTheme="minorHAnsi" w:hAnsiTheme="minorHAnsi" w:cstheme="minorHAnsi"/>
           <w:b/>
           <w:bCs/>
           <w:szCs w:val="20"/>
         </w:rPr>
-        <w:tab/>
-        <w:t xml:space="preserve">Company: </w:t>
-      </w:r>
-      <w:r>
-        <w:rPr>
-          <w:b/>
-          <w:bCs/>
-          <w:szCs w:val="20"/>
-        </w:rPr>
-        <w:t>PwC Switzerland Power BI Job Simulation on Forage</w:t>
+        <w:t>)</w:t>
       </w:r>
     </w:p>
     <w:p>
@@ -495,7 +1276,9 @@
           <w:ilvl w:val="0"/>
           <w:numId w:val="22"/>
         </w:numPr>
+        <w:ind w:left="360"/>
         <w:rPr>
+          <w:rFonts w:asciiTheme="minorHAnsi" w:hAnsiTheme="minorHAnsi" w:cstheme="minorHAnsi"/>
           <w:b/>
           <w:bCs/>
           <w:szCs w:val="20"/>
@@ -503,10 +1286,12 @@
       </w:pPr>
       <w:r>
         <w:rPr>
+          <w:rFonts w:asciiTheme="minorHAnsi" w:hAnsiTheme="minorHAnsi" w:cstheme="minorHAnsi"/>
           <w:b/>
           <w:bCs/>
           <w:szCs w:val="20"/>
         </w:rPr>
+        <w:lastRenderedPageBreak/>
         <w:t>PowerBI Virtual Internship</w:t>
       </w:r>
     </w:p>
@@ -515,15 +1300,17 @@
         <w:pStyle w:val="ListParagraph"/>
         <w:numPr>
           <w:ilvl w:val="0"/>
-          <w:numId w:val="24"/>
+          <w:numId w:val="27"/>
         </w:numPr>
         <w:jc w:val="both"/>
         <w:rPr>
+          <w:rFonts w:asciiTheme="minorHAnsi" w:hAnsiTheme="minorHAnsi" w:cstheme="minorHAnsi"/>
           <w:szCs w:val="20"/>
         </w:rPr>
       </w:pPr>
       <w:r>
         <w:rPr>
+          <w:rFonts w:asciiTheme="minorHAnsi" w:hAnsiTheme="minorHAnsi" w:cstheme="minorHAnsi"/>
           <w:szCs w:val="20"/>
         </w:rPr>
         <w:t>Completed a job simulation where I strengthened my PowerBI skills to better understand clients and their data visualization needs.</w:t>
@@ -534,15 +1321,17 @@
         <w:pStyle w:val="ListParagraph"/>
         <w:numPr>
           <w:ilvl w:val="0"/>
-          <w:numId w:val="24"/>
+          <w:numId w:val="27"/>
         </w:numPr>
         <w:jc w:val="both"/>
         <w:rPr>
+          <w:rFonts w:asciiTheme="minorHAnsi" w:hAnsiTheme="minorHAnsi" w:cstheme="minorHAnsi"/>
           <w:szCs w:val="20"/>
         </w:rPr>
       </w:pPr>
       <w:r>
         <w:rPr>
+          <w:rFonts w:asciiTheme="minorHAnsi" w:hAnsiTheme="minorHAnsi" w:cstheme="minorHAnsi"/>
           <w:szCs w:val="20"/>
         </w:rPr>
         <w:t>Demonstrated expertise in data visualization through the creation of Power BI dashboards that effectively conveyed KPIs, showcasing the ability to respond to client requests with well-designed solutions.</w:t>
@@ -553,15 +1342,17 @@
         <w:pStyle w:val="ListParagraph"/>
         <w:numPr>
           <w:ilvl w:val="0"/>
-          <w:numId w:val="24"/>
+          <w:numId w:val="27"/>
         </w:numPr>
         <w:jc w:val="both"/>
         <w:rPr>
+          <w:rFonts w:asciiTheme="minorHAnsi" w:hAnsiTheme="minorHAnsi" w:cstheme="minorHAnsi"/>
           <w:szCs w:val="20"/>
         </w:rPr>
       </w:pPr>
       <w:r>
         <w:rPr>
+          <w:rFonts w:asciiTheme="minorHAnsi" w:hAnsiTheme="minorHAnsi" w:cstheme="minorHAnsi"/>
           <w:szCs w:val="20"/>
         </w:rPr>
         <w:t>Strong communication skills reflected in the concise and informative email communication with engagement partners, delivering valuable insights and actionable suggestions based on data analysis.</w:t>
@@ -572,15 +1363,17 @@
         <w:pStyle w:val="ListParagraph"/>
         <w:numPr>
           <w:ilvl w:val="0"/>
-          <w:numId w:val="24"/>
+          <w:numId w:val="27"/>
         </w:numPr>
         <w:jc w:val="both"/>
         <w:rPr>
+          <w:rFonts w:asciiTheme="minorHAnsi" w:hAnsiTheme="minorHAnsi" w:cstheme="minorHAnsi"/>
           <w:szCs w:val="20"/>
         </w:rPr>
       </w:pPr>
       <w:r>
         <w:rPr>
+          <w:rFonts w:asciiTheme="minorHAnsi" w:hAnsiTheme="minorHAnsi" w:cstheme="minorHAnsi"/>
           <w:szCs w:val="20"/>
         </w:rPr>
         <w:t>Leveraged analytical problem-solving skills to examine HR data, particularly focusing on gender-related KPIs, and identified root causes for gender balance issues at the executive management level, highlighting a commitment to data-driven decision-making.</w:t>
@@ -589,6 +1382,7 @@
     <w:p>
       <w:pPr>
         <w:rPr>
+          <w:rFonts w:asciiTheme="minorHAnsi" w:hAnsiTheme="minorHAnsi" w:cstheme="minorHAnsi"/>
           <w:sz w:val="18"/>
           <w:szCs w:val="16"/>
         </w:rPr>
@@ -597,23 +1391,36 @@
     <w:p>
       <w:pPr>
         <w:pStyle w:val="Heading1"/>
+        <w:rPr>
+          <w:rFonts w:asciiTheme="minorHAnsi" w:hAnsiTheme="minorHAnsi" w:cstheme="minorHAnsi"/>
+          <w:b/>
+          <w:bCs/>
+        </w:rPr>
       </w:pPr>
       <w:r>
-        <w:t xml:space="preserve">ACADEMIC </w:t>
-      </w:r>
-      <w:r>
-        <w:t>Projects</w:t>
+        <w:rPr>
+          <w:rFonts w:asciiTheme="minorHAnsi" w:hAnsiTheme="minorHAnsi" w:cstheme="minorHAnsi"/>
+          <w:b/>
+          <w:bCs/>
+        </w:rPr>
+        <w:t>ACADEMIC Projects</w:t>
       </w:r>
     </w:p>
     <w:p>
       <w:pPr>
         <w:pStyle w:val="Line"/>
+        <w:rPr>
+          <w:rFonts w:cstheme="minorHAnsi"/>
+        </w:rPr>
       </w:pPr>
       <w:r>
+        <w:rPr>
+          <w:rFonts w:cstheme="minorHAnsi"/>
+        </w:rPr>
         <mc:AlternateContent>
           <mc:Choice Requires="wps">
             <w:drawing>
-              <wp:inline distT="0" distB="0" distL="0" distR="0" wp14:anchorId="0B0EED7A" wp14:editId="1C41C515">
+              <wp:inline distT="0" distB="0" distL="0" distR="0" wp14:anchorId="5EDA8F83" wp14:editId="01C0727B">
                 <wp:extent cx="5943600" cy="0"/>
                 <wp:effectExtent l="0" t="0" r="0" b="0"/>
                 <wp:docPr id="313050122" name="Straight Connector 1">
@@ -657,7 +1464,7 @@
           </mc:Choice>
           <mc:Fallback>
             <w:pict>
-              <v:line w14:anchorId="441E79DC" id="Straight Connector 1" o:spid="_x0000_s1026" alt="&quot;&quot;" style="visibility:visible;mso-wrap-style:square;mso-left-percent:-10001;mso-top-percent:-10001;mso-position-horizontal:absolute;mso-position-horizontal-relative:char;mso-position-vertical:absolute;mso-position-vertical-relative:line;mso-left-percent:-10001;mso-top-percent:-10001" from="0,0" to="468pt,0" o:gfxdata="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" strokecolor="#bfbfbf" strokeweight=".5pt">
+              <v:line w14:anchorId="23205C01" id="Straight Connector 1" o:spid="_x0000_s1026" alt="&quot;&quot;" style="visibility:visible;mso-wrap-style:square;mso-left-percent:-10001;mso-top-percent:-10001;mso-position-horizontal:absolute;mso-position-horizontal-relative:char;mso-position-vertical:absolute;mso-position-vertical-relative:line;mso-left-percent:-10001;mso-top-percent:-10001" from="0,0" to="468pt,0" o:gfxdata="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" strokecolor="#bfbfbf" strokeweight=".5pt">
                 <v:stroke joinstyle="miter"/>
                 <w10:anchorlock/>
               </v:line>
@@ -669,69 +1476,133 @@
     <w:p>
       <w:pPr>
         <w:rPr>
-          <w:rFonts w:eastAsiaTheme="majorEastAsia" w:cstheme="majorBidi"/>
-          <w:b/>
+          <w:rStyle w:val="Heading2Char"/>
+          <w:rFonts w:asciiTheme="minorHAnsi" w:eastAsiaTheme="minorEastAsia" w:hAnsiTheme="minorHAnsi" w:cstheme="minorHAnsi"/>
           <w:bCs/>
-          <w:color w:val="000000" w:themeColor="text1"/>
-          <w:szCs w:val="24"/>
+          <w:color w:val="262626" w:themeColor="text1" w:themeTint="D9"/>
+          <w:szCs w:val="22"/>
         </w:rPr>
       </w:pPr>
       <w:r>
         <w:rPr>
-          <w:rFonts w:eastAsiaTheme="majorEastAsia" w:cstheme="majorBidi"/>
-          <w:b/>
+          <w:rStyle w:val="Heading2Char"/>
+          <w:rFonts w:asciiTheme="minorHAnsi" w:eastAsiaTheme="minorEastAsia" w:hAnsiTheme="minorHAnsi" w:cstheme="minorHAnsi"/>
           <w:bCs/>
-          <w:color w:val="000000" w:themeColor="text1"/>
-          <w:szCs w:val="24"/>
+          <w:color w:val="262626" w:themeColor="text1" w:themeTint="D9"/>
+          <w:szCs w:val="22"/>
         </w:rPr>
-        <w:t>2024-Present: AI Voice Assistant (Python)</w:t>
+        <w:t>202</w:t>
+      </w:r>
+      <w:r>
+        <w:rPr>
+          <w:rStyle w:val="Heading2Char"/>
+          <w:rFonts w:asciiTheme="minorHAnsi" w:eastAsiaTheme="minorEastAsia" w:hAnsiTheme="minorHAnsi" w:cstheme="minorHAnsi"/>
+          <w:bCs/>
+          <w:color w:val="262626" w:themeColor="text1" w:themeTint="D9"/>
+          <w:szCs w:val="22"/>
+        </w:rPr>
+        <w:t>5</w:t>
+      </w:r>
+      <w:r>
+        <w:rPr>
+          <w:rStyle w:val="Heading2Char"/>
+          <w:rFonts w:asciiTheme="minorHAnsi" w:eastAsiaTheme="minorEastAsia" w:hAnsiTheme="minorHAnsi" w:cstheme="minorHAnsi"/>
+          <w:bCs/>
+          <w:color w:val="262626" w:themeColor="text1" w:themeTint="D9"/>
+          <w:szCs w:val="22"/>
+        </w:rPr>
+        <w:t>-202</w:t>
+      </w:r>
+      <w:r>
+        <w:rPr>
+          <w:rStyle w:val="Heading2Char"/>
+          <w:rFonts w:asciiTheme="minorHAnsi" w:eastAsiaTheme="minorEastAsia" w:hAnsiTheme="minorHAnsi" w:cstheme="minorHAnsi"/>
+          <w:bCs/>
+          <w:color w:val="262626" w:themeColor="text1" w:themeTint="D9"/>
+          <w:szCs w:val="22"/>
+        </w:rPr>
+        <w:t>5</w:t>
+      </w:r>
+      <w:r>
+        <w:rPr>
+          <w:rStyle w:val="Heading2Char"/>
+          <w:rFonts w:asciiTheme="minorHAnsi" w:eastAsiaTheme="minorEastAsia" w:hAnsiTheme="minorHAnsi" w:cstheme="minorHAnsi"/>
+          <w:bCs/>
+          <w:color w:val="262626" w:themeColor="text1" w:themeTint="D9"/>
+          <w:szCs w:val="22"/>
+        </w:rPr>
+        <w:t xml:space="preserve">: </w:t>
+      </w:r>
+      <w:r>
+        <w:rPr>
+          <w:rStyle w:val="Heading2Char"/>
+          <w:rFonts w:asciiTheme="minorHAnsi" w:eastAsiaTheme="minorEastAsia" w:hAnsiTheme="minorHAnsi" w:cstheme="minorHAnsi"/>
+          <w:bCs/>
+          <w:color w:val="262626" w:themeColor="text1" w:themeTint="D9"/>
+          <w:szCs w:val="22"/>
+        </w:rPr>
+        <w:t>AI Code Fusion</w:t>
       </w:r>
     </w:p>
     <w:p>
       <w:pPr>
+        <w:pStyle w:val="ListParagraph"/>
         <w:numPr>
           <w:ilvl w:val="0"/>
-          <w:numId w:val="16"/>
+          <w:numId w:val="18"/>
         </w:numPr>
-        <w:contextualSpacing/>
-        <w:jc w:val="both"/>
-        <w:rPr>
-          <w:rFonts w:eastAsiaTheme="majorEastAsia" w:cstheme="majorBidi"/>
-          <w:b/>
-          <w:bCs/>
-          <w:color w:val="000000" w:themeColor="text1"/>
-          <w:szCs w:val="24"/>
-        </w:rPr>
-      </w:pPr>
-      <w:r>
-        <w:t>Currently developing a voice assistant with Python as the backend and utilizing HTML, CSS, and JavaScript for the frontend to design interactive animations, buttons, and the user interface.</w:t>
-      </w:r>
-    </w:p>
-    <w:p>
-      <w:pPr>
-        <w:numPr>
-          <w:ilvl w:val="0"/>
-          <w:numId w:val="16"/>
-        </w:numPr>
-        <w:contextualSpacing/>
         <w:jc w:val="both"/>
         <w:rPr>
           <w:rStyle w:val="Heading2Char"/>
-          <w:rFonts w:eastAsiaTheme="minorEastAsia" w:cstheme="minorBidi"/>
+          <w:rFonts w:asciiTheme="minorHAnsi" w:eastAsiaTheme="minorEastAsia" w:hAnsiTheme="minorHAnsi" w:cstheme="minorHAnsi"/>
           <w:b w:val="0"/>
           <w:color w:val="262626" w:themeColor="text1" w:themeTint="D9"/>
           <w:szCs w:val="22"/>
         </w:rPr>
       </w:pPr>
       <w:r>
-        <w:t>The voice assistant is capable of executing tasks such as opening applications through voice commands, providing responses to user queries similar to ChatGPT, and initiating phone calls via WhatsApp.</w:t>
+        <w:rPr>
+          <w:rStyle w:val="Heading2Char"/>
+          <w:rFonts w:asciiTheme="minorHAnsi" w:eastAsiaTheme="minorEastAsia" w:hAnsiTheme="minorHAnsi" w:cstheme="minorHAnsi"/>
+          <w:b w:val="0"/>
+          <w:color w:val="262626" w:themeColor="text1" w:themeTint="D9"/>
+          <w:szCs w:val="22"/>
+        </w:rPr>
+        <w:t>Developed a web-based tool using python, flask, and Gemini 2.0 flash API, enabling AI-powered code review and conversion across languages like python, java, C++, C and JavaScript.</w:t>
       </w:r>
     </w:p>
     <w:p>
       <w:pPr>
+        <w:pStyle w:val="ListParagraph"/>
+        <w:numPr>
+          <w:ilvl w:val="0"/>
+          <w:numId w:val="18"/>
+        </w:numPr>
+        <w:jc w:val="both"/>
         <w:rPr>
           <w:rStyle w:val="Heading2Char"/>
-          <w:rFonts w:eastAsiaTheme="minorEastAsia" w:cstheme="minorBidi"/>
+          <w:rFonts w:asciiTheme="minorHAnsi" w:eastAsiaTheme="minorEastAsia" w:hAnsiTheme="minorHAnsi" w:cstheme="minorHAnsi"/>
+          <w:b w:val="0"/>
+          <w:color w:val="262626" w:themeColor="text1" w:themeTint="D9"/>
+          <w:szCs w:val="22"/>
+        </w:rPr>
+      </w:pPr>
+      <w:r>
+        <w:rPr>
+          <w:rStyle w:val="Heading2Char"/>
+          <w:rFonts w:asciiTheme="minorHAnsi" w:eastAsiaTheme="minorEastAsia" w:hAnsiTheme="minorHAnsi" w:cstheme="minorHAnsi"/>
+          <w:b w:val="0"/>
+          <w:color w:val="262626" w:themeColor="text1" w:themeTint="D9"/>
+          <w:szCs w:val="22"/>
+        </w:rPr>
+        <w:t>Implemented a user-friendly interface with real-time syntax highlighting and file upload features, achieving a 10-20 second response time.</w:t>
+      </w:r>
+    </w:p>
+    <w:p>
+      <w:pPr>
+        <w:rPr>
+          <w:rStyle w:val="Heading2Char"/>
+          <w:rFonts w:asciiTheme="minorHAnsi" w:eastAsiaTheme="minorEastAsia" w:hAnsiTheme="minorHAnsi" w:cstheme="minorHAnsi"/>
           <w:bCs/>
           <w:color w:val="262626" w:themeColor="text1" w:themeTint="D9"/>
           <w:szCs w:val="22"/>
@@ -740,12 +1611,12 @@
       <w:r>
         <w:rPr>
           <w:rStyle w:val="Heading2Char"/>
-          <w:rFonts w:eastAsiaTheme="minorEastAsia" w:cstheme="minorBidi"/>
+          <w:rFonts w:asciiTheme="minorHAnsi" w:eastAsiaTheme="minorEastAsia" w:hAnsiTheme="minorHAnsi" w:cstheme="minorHAnsi"/>
           <w:bCs/>
           <w:color w:val="262626" w:themeColor="text1" w:themeTint="D9"/>
           <w:szCs w:val="22"/>
         </w:rPr>
-        <w:t>2023-2024: Game of Chess (Python)</w:t>
+        <w:t xml:space="preserve">2024-2024: AI Voice Assistant </w:t>
       </w:r>
     </w:p>
     <w:p>
@@ -758,43 +1629,31 @@
         <w:jc w:val="both"/>
         <w:rPr>
           <w:rStyle w:val="Heading2Char"/>
-          <w:rFonts w:eastAsiaTheme="minorEastAsia" w:cstheme="minorBidi"/>
+          <w:rFonts w:asciiTheme="minorHAnsi" w:eastAsiaTheme="minorEastAsia" w:hAnsiTheme="minorHAnsi" w:cstheme="minorHAnsi"/>
+          <w:bCs/>
+          <w:color w:val="262626" w:themeColor="text1" w:themeTint="D9"/>
+          <w:szCs w:val="22"/>
+        </w:rPr>
+      </w:pPr>
+      <w:r>
+        <w:rPr>
+          <w:rStyle w:val="Heading2Char"/>
+          <w:rFonts w:asciiTheme="minorHAnsi" w:eastAsiaTheme="minorEastAsia" w:hAnsiTheme="minorHAnsi" w:cstheme="minorHAnsi"/>
           <w:b w:val="0"/>
           <w:color w:val="262626" w:themeColor="text1" w:themeTint="D9"/>
           <w:szCs w:val="22"/>
         </w:rPr>
-      </w:pPr>
+        <w:t xml:space="preserve">Developed </w:t>
+      </w:r>
       <w:r>
         <w:rPr>
           <w:rStyle w:val="Heading2Char"/>
-          <w:rFonts w:eastAsiaTheme="minorEastAsia" w:cstheme="minorBidi"/>
+          <w:rFonts w:asciiTheme="minorHAnsi" w:eastAsiaTheme="minorEastAsia" w:hAnsiTheme="minorHAnsi" w:cstheme="minorHAnsi"/>
           <w:b w:val="0"/>
           <w:color w:val="262626" w:themeColor="text1" w:themeTint="D9"/>
           <w:szCs w:val="22"/>
         </w:rPr>
-        <w:t xml:space="preserve">Developed an interactive chess game using Python with libraries such as Pygame and </w:t>
-      </w:r>
-      <w:proofErr w:type="spellStart"/>
-      <w:r>
-        <w:rPr>
-          <w:rStyle w:val="Heading2Char"/>
-          <w:rFonts w:eastAsiaTheme="minorEastAsia" w:cstheme="minorBidi"/>
-          <w:b w:val="0"/>
-          <w:color w:val="262626" w:themeColor="text1" w:themeTint="D9"/>
-          <w:szCs w:val="22"/>
-        </w:rPr>
-        <w:t>SimpleGUI</w:t>
-      </w:r>
-      <w:proofErr w:type="spellEnd"/>
-      <w:r>
-        <w:rPr>
-          <w:rStyle w:val="Heading2Char"/>
-          <w:rFonts w:eastAsiaTheme="minorEastAsia" w:cstheme="minorBidi"/>
-          <w:b w:val="0"/>
-          <w:color w:val="262626" w:themeColor="text1" w:themeTint="D9"/>
-          <w:szCs w:val="22"/>
-        </w:rPr>
-        <w:t>.</w:t>
+        <w:t>a voice assistant with Python as the backend and utilizing HTML, CSS, and JavaScript for the frontend to design interactive animations, buttons, and the user interface.</w:t>
       </w:r>
     </w:p>
     <w:p>
@@ -807,7 +1666,7 @@
         <w:jc w:val="both"/>
         <w:rPr>
           <w:rStyle w:val="Heading2Char"/>
-          <w:rFonts w:eastAsiaTheme="minorEastAsia" w:cstheme="minorBidi"/>
+          <w:rFonts w:asciiTheme="minorHAnsi" w:eastAsiaTheme="minorEastAsia" w:hAnsiTheme="minorHAnsi" w:cstheme="minorHAnsi"/>
           <w:b w:val="0"/>
           <w:color w:val="262626" w:themeColor="text1" w:themeTint="D9"/>
           <w:szCs w:val="22"/>
@@ -816,7 +1675,82 @@
       <w:r>
         <w:rPr>
           <w:rStyle w:val="Heading2Char"/>
-          <w:rFonts w:eastAsiaTheme="minorEastAsia" w:cstheme="minorBidi"/>
+          <w:rFonts w:asciiTheme="minorHAnsi" w:eastAsiaTheme="minorEastAsia" w:hAnsiTheme="minorHAnsi" w:cstheme="minorHAnsi"/>
+          <w:b w:val="0"/>
+          <w:color w:val="262626" w:themeColor="text1" w:themeTint="D9"/>
+          <w:szCs w:val="22"/>
+        </w:rPr>
+        <w:t>The voice assistant is capable of executing tasks such as opening applications through voice commands, providing responses to user queries similar to ChatGPT, and initiating phone calls via WhatsApp.</w:t>
+      </w:r>
+    </w:p>
+    <w:p>
+      <w:pPr>
+        <w:rPr>
+          <w:rStyle w:val="Heading2Char"/>
+          <w:rFonts w:asciiTheme="minorHAnsi" w:eastAsiaTheme="minorEastAsia" w:hAnsiTheme="minorHAnsi" w:cstheme="minorHAnsi"/>
+          <w:bCs/>
+          <w:color w:val="262626" w:themeColor="text1" w:themeTint="D9"/>
+          <w:szCs w:val="22"/>
+        </w:rPr>
+      </w:pPr>
+      <w:r>
+        <w:rPr>
+          <w:rStyle w:val="Heading2Char"/>
+          <w:rFonts w:asciiTheme="minorHAnsi" w:eastAsiaTheme="minorEastAsia" w:hAnsiTheme="minorHAnsi" w:cstheme="minorHAnsi"/>
+          <w:bCs/>
+          <w:color w:val="262626" w:themeColor="text1" w:themeTint="D9"/>
+          <w:szCs w:val="22"/>
+        </w:rPr>
+        <w:t xml:space="preserve">2023-2024: Game of Chess </w:t>
+      </w:r>
+    </w:p>
+    <w:p>
+      <w:pPr>
+        <w:pStyle w:val="ListParagraph"/>
+        <w:numPr>
+          <w:ilvl w:val="0"/>
+          <w:numId w:val="16"/>
+        </w:numPr>
+        <w:jc w:val="both"/>
+        <w:rPr>
+          <w:rStyle w:val="Heading2Char"/>
+          <w:rFonts w:asciiTheme="minorHAnsi" w:eastAsiaTheme="minorEastAsia" w:hAnsiTheme="minorHAnsi" w:cstheme="minorHAnsi"/>
+          <w:b w:val="0"/>
+          <w:color w:val="262626" w:themeColor="text1" w:themeTint="D9"/>
+          <w:szCs w:val="22"/>
+        </w:rPr>
+      </w:pPr>
+      <w:r>
+        <w:rPr>
+          <w:rStyle w:val="Heading2Char"/>
+          <w:rFonts w:asciiTheme="minorHAnsi" w:eastAsiaTheme="minorEastAsia" w:hAnsiTheme="minorHAnsi" w:cstheme="minorHAnsi"/>
+          <w:b w:val="0"/>
+          <w:color w:val="262626" w:themeColor="text1" w:themeTint="D9"/>
+          <w:szCs w:val="22"/>
+        </w:rPr>
+        <w:t>Developed an interactive chess game using Python with libraries such as Pygame and SimpleGUI.</w:t>
+      </w:r>
+    </w:p>
+    <w:p>
+      <w:pPr>
+        <w:pStyle w:val="ListParagraph"/>
+        <w:numPr>
+          <w:ilvl w:val="0"/>
+          <w:numId w:val="16"/>
+        </w:numPr>
+        <w:jc w:val="both"/>
+        <w:rPr>
+          <w:rStyle w:val="Heading2Char"/>
+          <w:rFonts w:asciiTheme="minorHAnsi" w:eastAsiaTheme="minorEastAsia" w:hAnsiTheme="minorHAnsi" w:cstheme="minorHAnsi"/>
+          <w:b w:val="0"/>
+          <w:color w:val="262626" w:themeColor="text1" w:themeTint="D9"/>
+          <w:szCs w:val="22"/>
+        </w:rPr>
+      </w:pPr>
+      <w:r>
+        <w:rPr>
+          <w:rStyle w:val="Heading2Char"/>
+          <w:rFonts w:asciiTheme="minorHAnsi" w:eastAsiaTheme="minorEastAsia" w:hAnsiTheme="minorHAnsi" w:cstheme="minorHAnsi"/>
           <w:b w:val="0"/>
           <w:color w:val="262626" w:themeColor="text1" w:themeTint="D9"/>
           <w:szCs w:val="22"/>
@@ -828,7 +1762,7 @@
       <w:pPr>
         <w:rPr>
           <w:rStyle w:val="Heading2Char"/>
-          <w:rFonts w:eastAsiaTheme="minorEastAsia" w:cstheme="minorBidi"/>
+          <w:rFonts w:asciiTheme="minorHAnsi" w:eastAsiaTheme="minorEastAsia" w:hAnsiTheme="minorHAnsi" w:cstheme="minorHAnsi"/>
           <w:bCs/>
           <w:color w:val="262626" w:themeColor="text1" w:themeTint="D9"/>
           <w:szCs w:val="22"/>
@@ -837,7 +1771,7 @@
       <w:r>
         <w:rPr>
           <w:rStyle w:val="Heading2Char"/>
-          <w:rFonts w:eastAsiaTheme="minorEastAsia" w:cstheme="minorBidi"/>
+          <w:rFonts w:asciiTheme="minorHAnsi" w:eastAsiaTheme="minorEastAsia" w:hAnsiTheme="minorHAnsi" w:cstheme="minorHAnsi"/>
           <w:bCs/>
           <w:color w:val="262626" w:themeColor="text1" w:themeTint="D9"/>
           <w:szCs w:val="22"/>
@@ -855,7 +1789,7 @@
         <w:jc w:val="both"/>
         <w:rPr>
           <w:rStyle w:val="Heading2Char"/>
-          <w:rFonts w:eastAsiaTheme="minorEastAsia" w:cstheme="minorBidi"/>
+          <w:rFonts w:asciiTheme="minorHAnsi" w:eastAsiaTheme="minorEastAsia" w:hAnsiTheme="minorHAnsi" w:cstheme="minorHAnsi"/>
           <w:b w:val="0"/>
           <w:color w:val="262626" w:themeColor="text1" w:themeTint="D9"/>
           <w:szCs w:val="22"/>
@@ -864,32 +1798,12 @@
       <w:r>
         <w:rPr>
           <w:rStyle w:val="Heading2Char"/>
-          <w:rFonts w:eastAsiaTheme="minorEastAsia" w:cstheme="minorBidi"/>
+          <w:rFonts w:asciiTheme="minorHAnsi" w:eastAsiaTheme="minorEastAsia" w:hAnsiTheme="minorHAnsi" w:cstheme="minorHAnsi"/>
           <w:b w:val="0"/>
           <w:color w:val="262626" w:themeColor="text1" w:themeTint="D9"/>
           <w:szCs w:val="22"/>
         </w:rPr>
-        <w:t xml:space="preserve">Designed and </w:t>
-      </w:r>
-      <w:r>
-        <w:rPr>
-          <w:rStyle w:val="Heading2Char"/>
-          <w:rFonts w:eastAsiaTheme="minorEastAsia" w:cstheme="minorBidi"/>
-          <w:b w:val="0"/>
-          <w:color w:val="262626" w:themeColor="text1" w:themeTint="D9"/>
-          <w:szCs w:val="22"/>
-        </w:rPr>
-        <w:t xml:space="preserve">basic </w:t>
-      </w:r>
-      <w:r>
-        <w:rPr>
-          <w:rStyle w:val="Heading2Char"/>
-          <w:rFonts w:eastAsiaTheme="minorEastAsia" w:cstheme="minorBidi"/>
-          <w:b w:val="0"/>
-          <w:color w:val="262626" w:themeColor="text1" w:themeTint="D9"/>
-          <w:szCs w:val="22"/>
-        </w:rPr>
-        <w:t>functional e-commerce platform, inspired by Amazon and eBay, using HTML and CSS.</w:t>
+        <w:t>Designed and basic functional e-commerce platform, inspired by Amazon and eBay, using HTML and CSS.</w:t>
       </w:r>
     </w:p>
     <w:p>
@@ -902,7 +1816,7 @@
         <w:jc w:val="both"/>
         <w:rPr>
           <w:rStyle w:val="Heading2Char"/>
-          <w:rFonts w:eastAsiaTheme="minorEastAsia" w:cstheme="minorBidi"/>
+          <w:rFonts w:asciiTheme="minorHAnsi" w:eastAsiaTheme="minorEastAsia" w:hAnsiTheme="minorHAnsi" w:cstheme="minorHAnsi"/>
           <w:b w:val="0"/>
           <w:color w:val="262626" w:themeColor="text1" w:themeTint="D9"/>
           <w:szCs w:val="22"/>
@@ -911,279 +1825,67 @@
       <w:r>
         <w:rPr>
           <w:rStyle w:val="Heading2Char"/>
-          <w:rFonts w:eastAsiaTheme="minorEastAsia" w:cstheme="minorBidi"/>
+          <w:rFonts w:asciiTheme="minorHAnsi" w:eastAsiaTheme="minorEastAsia" w:hAnsiTheme="minorHAnsi" w:cstheme="minorHAnsi"/>
           <w:b w:val="0"/>
           <w:color w:val="262626" w:themeColor="text1" w:themeTint="D9"/>
           <w:szCs w:val="22"/>
         </w:rPr>
-        <w:t xml:space="preserve">We can see different section like male, female, shoes, </w:t>
-      </w:r>
-      <w:r>
-        <w:rPr>
-          <w:rStyle w:val="Heading2Char"/>
-          <w:rFonts w:eastAsiaTheme="minorEastAsia" w:cstheme="minorBidi"/>
-          <w:b w:val="0"/>
-          <w:color w:val="262626" w:themeColor="text1" w:themeTint="D9"/>
-          <w:szCs w:val="22"/>
-        </w:rPr>
-        <w:t xml:space="preserve">electronics, beauty and others, which </w:t>
-      </w:r>
-      <w:r>
-        <w:rPr>
-          <w:rStyle w:val="Heading2Char"/>
-          <w:rFonts w:eastAsiaTheme="minorEastAsia" w:cstheme="minorBidi"/>
-          <w:b w:val="0"/>
-          <w:color w:val="262626" w:themeColor="text1" w:themeTint="D9"/>
-          <w:szCs w:val="22"/>
-        </w:rPr>
-        <w:t>can be navigated from home page.</w:t>
+        <w:t>We can see different section like male, female, shoes, electronics, beauty and others, which can be navigated from home page.</w:t>
       </w:r>
     </w:p>
     <w:p>
       <w:pPr>
+        <w:pStyle w:val="Heading1"/>
         <w:rPr>
-          <w:rStyle w:val="Heading2Char"/>
-          <w:rFonts w:eastAsiaTheme="minorEastAsia" w:cstheme="minorBidi"/>
+          <w:rFonts w:asciiTheme="minorHAnsi" w:hAnsiTheme="minorHAnsi" w:cstheme="minorHAnsi"/>
+          <w:b/>
+          <w:szCs w:val="24"/>
+        </w:rPr>
+      </w:pPr>
+    </w:p>
+    <w:p>
+      <w:pPr>
+        <w:rPr>
+          <w:rFonts w:asciiTheme="minorHAnsi" w:eastAsiaTheme="majorEastAsia" w:hAnsiTheme="minorHAnsi" w:cstheme="minorHAnsi"/>
+          <w:b/>
           <w:bCs/>
-          <w:color w:val="262626" w:themeColor="text1" w:themeTint="D9"/>
-          <w:szCs w:val="22"/>
+          <w:caps/>
+          <w:color w:val="000000" w:themeColor="text1"/>
+          <w:spacing w:val="10"/>
+          <w:szCs w:val="28"/>
         </w:rPr>
       </w:pPr>
       <w:r>
         <w:rPr>
-          <w:rStyle w:val="Heading2Char"/>
-          <w:rFonts w:eastAsiaTheme="minorEastAsia" w:cstheme="minorBidi"/>
+          <w:rFonts w:asciiTheme="minorHAnsi" w:eastAsiaTheme="majorEastAsia" w:hAnsiTheme="minorHAnsi" w:cstheme="minorHAnsi"/>
+          <w:b/>
           <w:bCs/>
-          <w:color w:val="262626" w:themeColor="text1" w:themeTint="D9"/>
-          <w:szCs w:val="22"/>
+          <w:caps/>
+          <w:color w:val="000000" w:themeColor="text1"/>
+          <w:spacing w:val="10"/>
+          <w:szCs w:val="28"/>
         </w:rPr>
-        <w:t>2022-2023: Library Resources Website</w:t>
+        <w:t>ACCOMPLISHMENTS THROUGH SELF-LEARNING</w:t>
       </w:r>
     </w:p>
     <w:p>
       <w:pPr>
-        <w:pStyle w:val="ListParagraph"/>
-        <w:numPr>
-          <w:ilvl w:val="0"/>
-          <w:numId w:val="18"/>
-        </w:numPr>
-        <w:jc w:val="both"/>
+        <w:pStyle w:val="Line"/>
         <w:rPr>
-          <w:rStyle w:val="Heading2Char"/>
-          <w:rFonts w:eastAsiaTheme="minorEastAsia" w:cstheme="minorBidi"/>
-          <w:b w:val="0"/>
-          <w:color w:val="262626" w:themeColor="text1" w:themeTint="D9"/>
-          <w:szCs w:val="22"/>
+          <w:rFonts w:cstheme="minorHAnsi"/>
         </w:rPr>
       </w:pPr>
       <w:r>
         <w:rPr>
-          <w:rStyle w:val="Heading2Char"/>
-          <w:rFonts w:eastAsiaTheme="minorEastAsia" w:cstheme="minorBidi"/>
-          <w:b w:val="0"/>
-          <w:color w:val="262626" w:themeColor="text1" w:themeTint="D9"/>
-          <w:szCs w:val="22"/>
+          <w:rFonts w:cstheme="minorHAnsi"/>
         </w:rPr>
-        <w:t>Created a comprehensive online library resource for university students to access course textbooks and past examination papers.</w:t>
-      </w:r>
-    </w:p>
-    <w:p>
-      <w:pPr>
-        <w:pStyle w:val="ListParagraph"/>
-        <w:numPr>
-          <w:ilvl w:val="0"/>
-          <w:numId w:val="18"/>
-        </w:numPr>
-        <w:jc w:val="both"/>
-        <w:rPr>
-          <w:rStyle w:val="Heading2Char"/>
-          <w:rFonts w:eastAsiaTheme="minorEastAsia" w:cstheme="minorBidi"/>
-          <w:b w:val="0"/>
-          <w:color w:val="262626" w:themeColor="text1" w:themeTint="D9"/>
-          <w:szCs w:val="22"/>
-        </w:rPr>
-      </w:pPr>
-      <w:r>
-        <w:rPr>
-          <w:rStyle w:val="Heading2Char"/>
-          <w:rFonts w:eastAsiaTheme="minorEastAsia" w:cstheme="minorBidi"/>
-          <w:b w:val="0"/>
-          <w:color w:val="262626" w:themeColor="text1" w:themeTint="D9"/>
-          <w:szCs w:val="22"/>
-        </w:rPr>
-        <w:t>Ensured easy retrieval of materials, contributing to efficient study practices and academic success.</w:t>
-      </w:r>
-    </w:p>
-    <w:p>
-      <w:pPr>
-        <w:pStyle w:val="ListParagraph"/>
-        <w:numPr>
-          <w:ilvl w:val="0"/>
-          <w:numId w:val="18"/>
-        </w:numPr>
-        <w:jc w:val="both"/>
-        <w:rPr>
-          <w:rStyle w:val="Heading2Char"/>
-          <w:rFonts w:eastAsiaTheme="minorEastAsia" w:cstheme="minorBidi"/>
-          <w:b w:val="0"/>
-          <w:color w:val="262626" w:themeColor="text1" w:themeTint="D9"/>
-          <w:szCs w:val="22"/>
-        </w:rPr>
-      </w:pPr>
-      <w:r>
-        <w:rPr>
-          <w:rStyle w:val="Heading2Char"/>
-          <w:rFonts w:eastAsiaTheme="minorEastAsia" w:cstheme="minorBidi"/>
-          <w:b w:val="0"/>
-          <w:color w:val="262626" w:themeColor="text1" w:themeTint="D9"/>
-          <w:szCs w:val="22"/>
-        </w:rPr>
-        <w:t>Used</w:t>
-      </w:r>
-      <w:r>
-        <w:rPr>
-          <w:rStyle w:val="Heading2Char"/>
-          <w:rFonts w:eastAsiaTheme="minorEastAsia" w:cstheme="minorBidi"/>
-          <w:b w:val="0"/>
-          <w:color w:val="262626" w:themeColor="text1" w:themeTint="D9"/>
-          <w:szCs w:val="22"/>
-        </w:rPr>
-        <w:t xml:space="preserve"> HTML and CSS</w:t>
-      </w:r>
-    </w:p>
-    <w:p>
-      <w:pPr>
-        <w:rPr>
-          <w:rStyle w:val="Heading2Char"/>
-          <w:rFonts w:eastAsiaTheme="minorEastAsia" w:cstheme="minorBidi"/>
-          <w:bCs/>
-          <w:color w:val="262626" w:themeColor="text1" w:themeTint="D9"/>
-          <w:szCs w:val="22"/>
-        </w:rPr>
-      </w:pPr>
-      <w:r>
-        <w:rPr>
-          <w:rStyle w:val="Heading2Char"/>
-          <w:rFonts w:eastAsiaTheme="minorEastAsia" w:cstheme="minorBidi"/>
-          <w:bCs/>
-          <w:color w:val="262626" w:themeColor="text1" w:themeTint="D9"/>
-          <w:szCs w:val="22"/>
-        </w:rPr>
-        <w:t>2022-2023: Multi Converter (Java)</w:t>
-      </w:r>
-    </w:p>
-    <w:p>
-      <w:pPr>
-        <w:pStyle w:val="ListParagraph"/>
-        <w:numPr>
-          <w:ilvl w:val="0"/>
-          <w:numId w:val="19"/>
-        </w:numPr>
-        <w:jc w:val="both"/>
-        <w:rPr>
-          <w:rStyle w:val="Heading2Char"/>
-          <w:rFonts w:eastAsiaTheme="minorEastAsia" w:cstheme="minorBidi"/>
-          <w:b w:val="0"/>
-          <w:color w:val="262626" w:themeColor="text1" w:themeTint="D9"/>
-          <w:szCs w:val="22"/>
-        </w:rPr>
-      </w:pPr>
-      <w:r>
-        <w:rPr>
-          <w:rStyle w:val="Heading2Char"/>
-          <w:rFonts w:eastAsiaTheme="minorEastAsia" w:cstheme="minorBidi"/>
-          <w:b w:val="0"/>
-          <w:color w:val="262626" w:themeColor="text1" w:themeTint="D9"/>
-          <w:szCs w:val="22"/>
-        </w:rPr>
-        <w:t>Programmed a versatile conversion tool in Java, offering functionalities like weight, currency, unit, and distance conversions.</w:t>
-      </w:r>
-    </w:p>
-    <w:p>
-      <w:pPr>
-        <w:pStyle w:val="ListParagraph"/>
-        <w:numPr>
-          <w:ilvl w:val="0"/>
-          <w:numId w:val="19"/>
-        </w:numPr>
-        <w:jc w:val="both"/>
-        <w:rPr>
-          <w:rStyle w:val="Heading2Char"/>
-          <w:rFonts w:eastAsiaTheme="minorEastAsia" w:cstheme="minorBidi"/>
-          <w:b w:val="0"/>
-          <w:color w:val="262626" w:themeColor="text1" w:themeTint="D9"/>
-          <w:szCs w:val="22"/>
-        </w:rPr>
-      </w:pPr>
-      <w:r>
-        <w:rPr>
-          <w:rStyle w:val="Heading2Char"/>
-          <w:rFonts w:eastAsiaTheme="minorEastAsia" w:cstheme="minorBidi"/>
-          <w:b w:val="0"/>
-          <w:color w:val="262626" w:themeColor="text1" w:themeTint="D9"/>
-          <w:szCs w:val="22"/>
-        </w:rPr>
-        <w:t>Built an intuitive selection interface, allowing users to easily choose and perform various conversions.</w:t>
-      </w:r>
-    </w:p>
-    <w:p>
-      <w:pPr>
-        <w:rPr>
-          <w:rStyle w:val="Heading2Char"/>
-          <w:sz w:val="18"/>
-        </w:rPr>
-      </w:pPr>
-    </w:p>
-    <w:p>
-      <w:pPr>
-        <w:pStyle w:val="Heading1"/>
-        <w:rPr>
-          <w:rFonts w:ascii="Calibri" w:hAnsi="Calibri" w:cstheme="majorBidi"/>
-          <w:b/>
-          <w:szCs w:val="24"/>
-        </w:rPr>
-      </w:pPr>
-      <w:sdt>
-        <w:sdtPr>
-          <w:rPr>
-            <w:rFonts w:ascii="Calibri" w:hAnsi="Calibri" w:cstheme="majorBidi"/>
-            <w:b/>
-            <w:szCs w:val="24"/>
-          </w:rPr>
-          <w:id w:val="728805515"/>
-          <w:placeholder>
-            <w:docPart w:val="AB163E7F5DBB415B875F0BE5BD032FBE"/>
-          </w:placeholder>
-          <w:temporary/>
-          <w:showingPlcHdr/>
-          <w15:appearance w15:val="hidden"/>
-        </w:sdtPr>
-        <w:sdtEndPr>
-          <w:rPr>
-            <w:rFonts w:asciiTheme="majorHAnsi" w:hAnsiTheme="majorHAnsi" w:cs="Tahoma (Headings CS)"/>
-            <w:b w:val="0"/>
-            <w:szCs w:val="28"/>
-          </w:rPr>
-        </w:sdtEndPr>
-        <w:sdtContent>
-          <w:r>
-            <w:t>Education</w:t>
-          </w:r>
-        </w:sdtContent>
-      </w:sdt>
-    </w:p>
-    <w:p>
-      <w:pPr>
-        <w:pStyle w:val="Line"/>
-      </w:pPr>
-      <w:r>
         <mc:AlternateContent>
           <mc:Choice Requires="wps">
             <w:drawing>
-              <wp:inline distT="0" distB="0" distL="0" distR="0" wp14:anchorId="3E8C7DAE" wp14:editId="22326DDA">
+              <wp:inline distT="0" distB="0" distL="0" distR="0" wp14:anchorId="4EF47CA6" wp14:editId="145ECD58">
                 <wp:extent cx="5943600" cy="0"/>
                 <wp:effectExtent l="0" t="0" r="0" b="0"/>
-                <wp:docPr id="1940888775" name="Straight Connector 1">
+                <wp:docPr id="743514089" name="Straight Connector 1">
                   <a:extLst xmlns:a="http://schemas.openxmlformats.org/drawingml/2006/main">
                     <a:ext uri="{C183D7F6-B498-43B3-948B-1728B52AA6E4}">
                       <adec:decorative xmlns:adec="http://schemas.microsoft.com/office/drawing/2017/decorative" val="1"/>
@@ -1224,7 +1926,7 @@
           </mc:Choice>
           <mc:Fallback>
             <w:pict>
-              <v:line w14:anchorId="3970267E" id="Straight Connector 1" o:spid="_x0000_s1026" alt="&quot;&quot;" style="visibility:visible;mso-wrap-style:square;mso-left-percent:-10001;mso-top-percent:-10001;mso-position-horizontal:absolute;mso-position-horizontal-relative:char;mso-position-vertical:absolute;mso-position-vertical-relative:line;mso-left-percent:-10001;mso-top-percent:-10001" from="0,0" to="468pt,0" o:gfxdata="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" strokecolor="#bfbfbf" strokeweight=".5pt">
+              <v:line w14:anchorId="37E87AC6" id="Straight Connector 1" o:spid="_x0000_s1026" alt="&quot;&quot;" style="visibility:visible;mso-wrap-style:square;mso-left-percent:-10001;mso-top-percent:-10001;mso-position-horizontal:absolute;mso-position-horizontal-relative:char;mso-position-vertical:absolute;mso-position-vertical-relative:line;mso-left-percent:-10001;mso-top-percent:-10001" from="0,0" to="468pt,0" o:gfxdata="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" strokecolor="#bfbfbf" strokeweight=".5pt">
                 <v:stroke joinstyle="miter"/>
                 <w10:anchorlock/>
               </v:line>
@@ -1235,487 +1937,69 @@
     </w:p>
     <w:p>
       <w:pPr>
-        <w:pStyle w:val="Heading2"/>
+        <w:pStyle w:val="Heading3"/>
+        <w:numPr>
+          <w:ilvl w:val="0"/>
+          <w:numId w:val="21"/>
+        </w:numPr>
+        <w:tabs>
+          <w:tab w:val="num" w:pos="1440"/>
+        </w:tabs>
+        <w:spacing w:after="0"/>
+        <w:ind w:left="1440"/>
+        <w:jc w:val="both"/>
+        <w:rPr>
+          <w:rFonts w:asciiTheme="minorHAnsi" w:eastAsiaTheme="minorEastAsia" w:hAnsiTheme="minorHAnsi" w:cstheme="minorHAnsi"/>
+          <w:color w:val="262626" w:themeColor="text1" w:themeTint="D9"/>
+          <w:szCs w:val="22"/>
+        </w:rPr>
       </w:pPr>
       <w:r>
         <w:rPr>
-          <w:rStyle w:val="NotBold"/>
+          <w:rFonts w:asciiTheme="minorHAnsi" w:eastAsiaTheme="minorEastAsia" w:hAnsiTheme="minorHAnsi" w:cstheme="minorHAnsi"/>
+          <w:color w:val="262626" w:themeColor="text1" w:themeTint="D9"/>
+          <w:szCs w:val="22"/>
         </w:rPr>
-        <w:t>[2022] – [</w:t>
-      </w:r>
-      <w:r>
-        <w:rPr>
-          <w:rStyle w:val="NotBold"/>
-        </w:rPr>
-        <w:t>Currently</w:t>
-      </w:r>
-      <w:r>
-        <w:rPr>
-          <w:rStyle w:val="NotBold"/>
-        </w:rPr>
-        <w:t>]</w:t>
-      </w:r>
-      <w:r>
-        <w:rPr>
-          <w:rStyle w:val="NotBold"/>
-        </w:rPr>
-        <w:tab/>
-      </w:r>
-      <w:r>
-        <w:t>Bachelor of Computer Applications (</w:t>
-      </w:r>
-      <w:r>
-        <w:t>BCA)</w:t>
-      </w:r>
-      <w:r>
-        <w:t xml:space="preserve"> </w:t>
+        <w:t>Developed an interactive dashboard to visualize datasets sourced from Kaggle.</w:t>
       </w:r>
     </w:p>
     <w:p>
+      <w:pPr>
+        <w:pStyle w:val="ListParagraph"/>
+        <w:numPr>
+          <w:ilvl w:val="0"/>
+          <w:numId w:val="21"/>
+        </w:numPr>
+        <w:spacing w:before="0"/>
+        <w:jc w:val="both"/>
+        <w:rPr>
+          <w:rFonts w:asciiTheme="minorHAnsi" w:hAnsiTheme="minorHAnsi" w:cstheme="minorHAnsi"/>
+        </w:rPr>
+      </w:pPr>
       <w:r>
-        <w:tab/>
-      </w:r>
-      <w:r>
-        <w:tab/>
-      </w:r>
-      <w:r>
-        <w:tab/>
-      </w:r>
-      <w:r>
-        <w:tab/>
-      </w:r>
-      <w:r>
-        <w:t>CGPA: 8.44</w:t>
+        <w:rPr>
+          <w:rFonts w:asciiTheme="minorHAnsi" w:hAnsiTheme="minorHAnsi" w:cstheme="minorHAnsi"/>
+        </w:rPr>
+        <w:t>Utilized Power BI and Excel to create dynamic visualizations and data manipulation.</w:t>
       </w:r>
     </w:p>
     <w:p>
       <w:pPr>
-        <w:pStyle w:val="Heading3"/>
-      </w:pPr>
-      <w:r>
-        <w:t>Dayananda Sagar University</w:t>
-      </w:r>
-      <w:r>
-        <w:t>, Bengaluru</w:t>
-      </w:r>
-    </w:p>
-    <w:p>
-      <w:pPr>
-        <w:pStyle w:val="Heading2"/>
-        <w:ind w:left="2794" w:hanging="2794"/>
-        <w:rPr>
-          <w:rStyle w:val="NotBold"/>
-        </w:rPr>
-      </w:pPr>
-      <w:r>
-        <w:rPr>
-          <w:rStyle w:val="NotBold"/>
-        </w:rPr>
-        <w:t>Year</w:t>
-      </w:r>
-      <w:r>
-        <w:rPr>
-          <w:rStyle w:val="NotBold"/>
-        </w:rPr>
-        <w:t xml:space="preserve"> of passing may</w:t>
-      </w:r>
-      <w:r>
-        <w:rPr>
-          <w:rStyle w:val="NotBold"/>
-        </w:rPr>
-        <w:t xml:space="preserve"> </w:t>
-      </w:r>
-      <w:r>
-        <w:rPr>
-          <w:rStyle w:val="NotBold"/>
-        </w:rPr>
-        <w:t>2022</w:t>
-      </w:r>
-      <w:r>
-        <w:rPr>
-          <w:rStyle w:val="NotBold"/>
-        </w:rPr>
-        <w:tab/>
-      </w:r>
-      <w:r>
-        <w:rPr>
-          <w:rStyle w:val="NotBold"/>
-          <w:b/>
-          <w:bCs/>
-        </w:rPr>
-        <w:t>Pre-Univer</w:t>
-      </w:r>
-      <w:r>
-        <w:rPr>
-          <w:rStyle w:val="NotBold"/>
-          <w:b/>
-          <w:bCs/>
-        </w:rPr>
-        <w:t>sity</w:t>
-      </w:r>
-      <w:r>
-        <w:rPr>
-          <w:rStyle w:val="NotBold"/>
-        </w:rPr>
-        <w:t xml:space="preserve"> </w:t>
-      </w:r>
-      <w:r>
-        <w:rPr>
-          <w:rStyle w:val="NotBold"/>
-          <w:b/>
-          <w:bCs/>
-        </w:rPr>
-        <w:t>(12th)</w:t>
-      </w:r>
-      <w:r>
-        <w:rPr>
-          <w:rStyle w:val="NotBold"/>
-          <w:b/>
-          <w:bCs/>
-        </w:rPr>
-        <w:t xml:space="preserve"> </w:t>
-      </w:r>
-      <w:r>
-        <w:rPr>
-          <w:rStyle w:val="NotBold"/>
-        </w:rPr>
-        <w:t>(Course: SCBA (</w:t>
-      </w:r>
-      <w:r>
-        <w:rPr>
-          <w:rStyle w:val="NotBold"/>
-        </w:rPr>
-        <w:t xml:space="preserve">Statistics, Computer </w:t>
-      </w:r>
-      <w:r>
-        <w:rPr>
-          <w:rStyle w:val="NotBold"/>
-        </w:rPr>
-        <w:t>Science, Business</w:t>
-      </w:r>
-      <w:r>
-        <w:rPr>
-          <w:rStyle w:val="NotBold"/>
-        </w:rPr>
-        <w:t xml:space="preserve"> Studies, Accountancy</w:t>
-      </w:r>
-      <w:r>
-        <w:rPr>
-          <w:rStyle w:val="NotBold"/>
-        </w:rPr>
-        <w:t>)</w:t>
-      </w:r>
-      <w:r>
-        <w:rPr>
-          <w:rStyle w:val="NotBold"/>
-        </w:rPr>
-        <w:t>)</w:t>
-      </w:r>
-    </w:p>
-    <w:p>
-      <w:r>
-        <w:tab/>
-      </w:r>
-      <w:r>
-        <w:tab/>
-      </w:r>
-      <w:r>
-        <w:tab/>
-      </w:r>
-      <w:r>
-        <w:tab/>
-      </w:r>
-      <w:r>
-        <w:t>Marks: 89%</w:t>
-      </w:r>
-    </w:p>
-    <w:p>
-      <w:pPr>
-        <w:pStyle w:val="Heading3"/>
-      </w:pPr>
-      <w:r>
-        <w:t>SSMRV PU Col</w:t>
-      </w:r>
-      <w:r>
-        <w:t>lege, Bengaluru</w:t>
-      </w:r>
-    </w:p>
-    <w:p>
-      <w:pPr>
-        <w:pStyle w:val="Heading2"/>
-      </w:pPr>
-      <w:r>
-        <w:rPr>
-          <w:rStyle w:val="NotBold"/>
-        </w:rPr>
-        <w:t xml:space="preserve">Year of passing august </w:t>
-      </w:r>
-      <w:r>
-        <w:rPr>
-          <w:rStyle w:val="NotBold"/>
-        </w:rPr>
-        <w:t>2020</w:t>
-      </w:r>
-      <w:r>
-        <w:rPr>
-          <w:rStyle w:val="NotBold"/>
-        </w:rPr>
-        <w:tab/>
-      </w:r>
-      <w:r>
-        <w:rPr>
-          <w:rStyle w:val="NotBold"/>
-          <w:b/>
-          <w:bCs/>
-        </w:rPr>
-        <w:t>Matriculation</w:t>
-      </w:r>
-      <w:r>
-        <w:t xml:space="preserve"> </w:t>
-      </w:r>
-      <w:r>
-        <w:t>(</w:t>
-      </w:r>
-      <w:r>
-        <w:t>10th</w:t>
-      </w:r>
-      <w:r>
-        <w:t>)</w:t>
-      </w:r>
-      <w:r>
-        <w:t xml:space="preserve"> </w:t>
-      </w:r>
-    </w:p>
-    <w:p>
-      <w:r>
-        <w:tab/>
-      </w:r>
-      <w:r>
-        <w:tab/>
-      </w:r>
-      <w:r>
-        <w:tab/>
-      </w:r>
-      <w:r>
-        <w:tab/>
-      </w:r>
-      <w:r>
-        <w:t>Marks: 68%</w:t>
-      </w:r>
-    </w:p>
-    <w:p>
-      <w:pPr>
-        <w:pStyle w:val="Heading3"/>
-        <w:rPr>
-          <w:rStyle w:val="Heading2Char"/>
-          <w:rFonts w:eastAsiaTheme="minorEastAsia" w:cstheme="minorBidi"/>
-          <w:b w:val="0"/>
-          <w:color w:val="262626" w:themeColor="text1" w:themeTint="D9"/>
-          <w:szCs w:val="22"/>
-        </w:rPr>
-      </w:pPr>
-      <w:r>
-        <w:rPr>
-          <w:rStyle w:val="Heading2Char"/>
-          <w:rFonts w:eastAsiaTheme="minorEastAsia" w:cstheme="minorBidi"/>
-          <w:b w:val="0"/>
-          <w:color w:val="262626" w:themeColor="text1" w:themeTint="D9"/>
-          <w:szCs w:val="22"/>
-        </w:rPr>
-        <w:t>S</w:t>
-      </w:r>
-      <w:r>
-        <w:rPr>
-          <w:rStyle w:val="Heading2Char"/>
-          <w:rFonts w:eastAsiaTheme="minorEastAsia" w:cstheme="minorBidi"/>
-          <w:b w:val="0"/>
-          <w:color w:val="262626" w:themeColor="text1" w:themeTint="D9"/>
-          <w:szCs w:val="22"/>
-        </w:rPr>
-        <w:t xml:space="preserve">hantiniketan </w:t>
-      </w:r>
-      <w:r>
-        <w:rPr>
-          <w:rStyle w:val="Heading2Char"/>
-          <w:rFonts w:eastAsiaTheme="minorEastAsia" w:cstheme="minorBidi"/>
-          <w:b w:val="0"/>
-          <w:color w:val="262626" w:themeColor="text1" w:themeTint="D9"/>
-          <w:szCs w:val="22"/>
-        </w:rPr>
-        <w:t>T</w:t>
-      </w:r>
-      <w:r>
-        <w:rPr>
-          <w:rStyle w:val="Heading2Char"/>
-          <w:rFonts w:eastAsiaTheme="minorEastAsia" w:cstheme="minorBidi"/>
-          <w:b w:val="0"/>
-          <w:color w:val="262626" w:themeColor="text1" w:themeTint="D9"/>
-          <w:szCs w:val="22"/>
-        </w:rPr>
-        <w:t xml:space="preserve">rust </w:t>
-      </w:r>
-      <w:r>
-        <w:rPr>
-          <w:rStyle w:val="Heading2Char"/>
-          <w:rFonts w:eastAsiaTheme="minorEastAsia" w:cstheme="minorBidi"/>
-          <w:b w:val="0"/>
-          <w:color w:val="262626" w:themeColor="text1" w:themeTint="D9"/>
-          <w:szCs w:val="22"/>
-        </w:rPr>
-        <w:t>S</w:t>
-      </w:r>
-      <w:r>
-        <w:rPr>
-          <w:rStyle w:val="Heading2Char"/>
-          <w:rFonts w:eastAsiaTheme="minorEastAsia" w:cstheme="minorBidi"/>
-          <w:b w:val="0"/>
-          <w:color w:val="262626" w:themeColor="text1" w:themeTint="D9"/>
-          <w:szCs w:val="22"/>
-        </w:rPr>
-        <w:t>chool</w:t>
-      </w:r>
-      <w:r>
-        <w:rPr>
-          <w:rStyle w:val="Heading2Char"/>
-          <w:rFonts w:eastAsiaTheme="minorEastAsia" w:cstheme="minorBidi"/>
-          <w:b w:val="0"/>
-          <w:color w:val="262626" w:themeColor="text1" w:themeTint="D9"/>
-          <w:szCs w:val="22"/>
-        </w:rPr>
-        <w:t>, Benga</w:t>
-      </w:r>
-      <w:r>
-        <w:rPr>
-          <w:rStyle w:val="Heading2Char"/>
-          <w:rFonts w:eastAsiaTheme="minorEastAsia" w:cstheme="minorBidi"/>
-          <w:b w:val="0"/>
-          <w:color w:val="262626" w:themeColor="text1" w:themeTint="D9"/>
-          <w:szCs w:val="22"/>
-        </w:rPr>
-        <w:t>luru</w:t>
-      </w:r>
-    </w:p>
-    <w:p>
-      <w:pPr>
-        <w:pStyle w:val="Heading3"/>
-        <w:ind w:left="0"/>
-        <w:rPr>
-          <w:rStyle w:val="Heading2Char"/>
-          <w:rFonts w:eastAsiaTheme="minorEastAsia" w:cstheme="minorBidi"/>
-          <w:b w:val="0"/>
-          <w:color w:val="262626" w:themeColor="text1" w:themeTint="D9"/>
-          <w:szCs w:val="22"/>
-        </w:rPr>
-      </w:pPr>
-      <w:r>
-        <w:rPr>
-          <w:rStyle w:val="Heading2Char"/>
-          <w:rFonts w:eastAsiaTheme="minorEastAsia" w:cstheme="minorBidi"/>
-          <w:b w:val="0"/>
-          <w:color w:val="262626" w:themeColor="text1" w:themeTint="D9"/>
-          <w:szCs w:val="22"/>
-        </w:rPr>
-        <w:t xml:space="preserve">   </w:t>
-      </w:r>
-    </w:p>
-    <w:p>
-      <w:pPr>
-        <w:pStyle w:val="Heading1"/>
-      </w:pPr>
-      <w:r>
-        <w:t>Achievements</w:t>
-      </w:r>
-    </w:p>
-    <w:p>
-      <w:pPr>
-        <w:pStyle w:val="Line"/>
-      </w:pPr>
-      <w:r>
-        <mc:AlternateContent>
-          <mc:Choice Requires="wps">
-            <w:drawing>
-              <wp:inline distT="0" distB="0" distL="0" distR="0" wp14:anchorId="02234B10" wp14:editId="1F035AB0">
-                <wp:extent cx="5943600" cy="0"/>
-                <wp:effectExtent l="0" t="0" r="0" b="0"/>
-                <wp:docPr id="351664824" name="Straight Connector 1">
-                  <a:extLst xmlns:a="http://schemas.openxmlformats.org/drawingml/2006/main">
-                    <a:ext uri="{C183D7F6-B498-43B3-948B-1728B52AA6E4}">
-                      <adec:decorative xmlns:adec="http://schemas.microsoft.com/office/drawing/2017/decorative" val="1"/>
-                    </a:ext>
-                  </a:extLst>
-                </wp:docPr>
-                <wp:cNvGraphicFramePr/>
-                <a:graphic xmlns:a="http://schemas.openxmlformats.org/drawingml/2006/main">
-                  <a:graphicData uri="http://schemas.microsoft.com/office/word/2010/wordprocessingShape">
-                    <wps:wsp>
-                      <wps:cNvCnPr/>
-                      <wps:spPr>
-                        <a:xfrm>
-                          <a:off x="0" y="0"/>
-                          <a:ext cx="5943600" cy="0"/>
-                        </a:xfrm>
-                        <a:prstGeom prst="line">
-                          <a:avLst/>
-                        </a:prstGeom>
-                        <a:noFill/>
-                        <a:ln w="6350" cap="flat" cmpd="sng" algn="ctr">
-                          <a:solidFill>
-                            <a:sysClr val="window" lastClr="FFFFFF">
-                              <a:lumMod val="75000"/>
-                            </a:sysClr>
-                          </a:solidFill>
-                          <a:prstDash val="solid"/>
-                          <a:miter lim="800000"/>
-                        </a:ln>
-                        <a:effectLst/>
-                      </wps:spPr>
-                      <wps:bodyPr/>
-                    </wps:wsp>
-                  </a:graphicData>
-                </a:graphic>
-              </wp:inline>
-            </w:drawing>
-          </mc:Choice>
-          <mc:Fallback>
-            <w:pict>
-              <v:line w14:anchorId="715BCFB2" id="Straight Connector 1" o:spid="_x0000_s1026" alt="&quot;&quot;" style="visibility:visible;mso-wrap-style:square;mso-left-percent:-10001;mso-top-percent:-10001;mso-position-horizontal:absolute;mso-position-horizontal-relative:char;mso-position-vertical:absolute;mso-position-vertical-relative:line;mso-left-percent:-10001;mso-top-percent:-10001" from="0,0" to="468pt,0" o:gfxdata="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" strokecolor="#bfbfbf" strokeweight=".5pt">
-                <v:stroke joinstyle="miter"/>
-                <w10:anchorlock/>
-              </v:line>
-            </w:pict>
-          </mc:Fallback>
-        </mc:AlternateContent>
-      </w:r>
-    </w:p>
-    <w:p>
-      <w:pPr>
-        <w:pStyle w:val="Heading3"/>
+        <w:pStyle w:val="ListParagraph"/>
         <w:numPr>
           <w:ilvl w:val="0"/>
           <w:numId w:val="21"/>
         </w:numPr>
         <w:jc w:val="both"/>
         <w:rPr>
-          <w:rFonts w:eastAsiaTheme="minorEastAsia" w:cstheme="minorBidi"/>
-          <w:color w:val="262626" w:themeColor="text1" w:themeTint="D9"/>
-          <w:szCs w:val="22"/>
+          <w:rFonts w:asciiTheme="minorHAnsi" w:hAnsiTheme="minorHAnsi" w:cstheme="minorHAnsi"/>
         </w:rPr>
       </w:pPr>
       <w:r>
         <w:rPr>
-          <w:rFonts w:eastAsiaTheme="minorEastAsia" w:cstheme="minorBidi"/>
-          <w:color w:val="262626" w:themeColor="text1" w:themeTint="D9"/>
-          <w:szCs w:val="22"/>
+          <w:rFonts w:asciiTheme="minorHAnsi" w:hAnsiTheme="minorHAnsi" w:cstheme="minorHAnsi"/>
         </w:rPr>
-        <w:t>Developed an interactive dashboard to visualize datasets sourced from Kaggle</w:t>
-      </w:r>
-      <w:r>
-        <w:rPr>
-          <w:rFonts w:eastAsiaTheme="minorEastAsia" w:cstheme="minorBidi"/>
-          <w:color w:val="262626" w:themeColor="text1" w:themeTint="D9"/>
-          <w:szCs w:val="22"/>
-        </w:rPr>
-        <w:t>.</w:t>
+        <w:t>Demonstrated proficiency in data cleaning by addressing blank values and rectifying data types.</w:t>
       </w:r>
     </w:p>
     <w:p>
@@ -1726,12 +2010,15 @@
           <w:numId w:val="21"/>
         </w:numPr>
         <w:jc w:val="both"/>
+        <w:rPr>
+          <w:rFonts w:asciiTheme="minorHAnsi" w:hAnsiTheme="minorHAnsi" w:cstheme="minorHAnsi"/>
+        </w:rPr>
       </w:pPr>
       <w:r>
-        <w:t>Utilized Power BI and Excel to create dynamic visualizations and data manipulation</w:t>
-      </w:r>
-      <w:r>
-        <w:t>.</w:t>
+        <w:rPr>
+          <w:rFonts w:asciiTheme="minorHAnsi" w:hAnsiTheme="minorHAnsi" w:cstheme="minorHAnsi"/>
+        </w:rPr>
+        <w:t>Have basic understanding with Python and libraries such as NumPy, Pandas, Matplotlib, and Seaborn.</w:t>
       </w:r>
     </w:p>
     <w:p>
@@ -1742,194 +2029,16 @@
           <w:numId w:val="21"/>
         </w:numPr>
         <w:jc w:val="both"/>
+        <w:rPr>
+          <w:rFonts w:asciiTheme="minorHAnsi" w:hAnsiTheme="minorHAnsi" w:cstheme="minorHAnsi"/>
+        </w:rPr>
       </w:pPr>
       <w:r>
-        <w:lastRenderedPageBreak/>
-        <w:t>Demonstrated proficiency in data cleaning by addressing blank values and rectifying data types</w:t>
+        <w:rPr>
+          <w:rFonts w:asciiTheme="minorHAnsi" w:hAnsiTheme="minorHAnsi" w:cstheme="minorHAnsi"/>
+        </w:rPr>
+        <w:t>Have an understanding with SQL and perform some operation in using MySQL Workbench</w:t>
       </w:r>
-      <w:r>
-        <w:t>.</w:t>
-      </w:r>
-    </w:p>
-    <w:p>
-      <w:pPr>
-        <w:pStyle w:val="ListParagraph"/>
-        <w:numPr>
-          <w:ilvl w:val="0"/>
-          <w:numId w:val="21"/>
-        </w:numPr>
-        <w:jc w:val="both"/>
-      </w:pPr>
-      <w:r>
-        <w:t>Have basic understanding with Python and libraries such as NumPy, Pandas, Matplotlib, and Seaborn</w:t>
-      </w:r>
-      <w:r>
-        <w:t>.</w:t>
-      </w:r>
-    </w:p>
-    <w:p>
-      <w:pPr>
-        <w:pStyle w:val="ListParagraph"/>
-        <w:numPr>
-          <w:ilvl w:val="0"/>
-          <w:numId w:val="21"/>
-        </w:numPr>
-        <w:jc w:val="both"/>
-      </w:pPr>
-      <w:r>
-        <w:t xml:space="preserve">Have </w:t>
-      </w:r>
-      <w:r>
-        <w:t>an</w:t>
-      </w:r>
-      <w:r>
-        <w:t xml:space="preserve"> understanding with SQL and perform some operation in using MySQL Workbench</w:t>
-      </w:r>
-    </w:p>
-    <w:p>
-      <w:pPr>
-        <w:rPr>
-          <w:sz w:val="18"/>
-          <w:szCs w:val="18"/>
-        </w:rPr>
-      </w:pPr>
-    </w:p>
-    <w:p>
-      <w:pPr>
-        <w:pStyle w:val="Heading1"/>
-      </w:pPr>
-      <w:r>
-        <w:t>langauge</w:t>
-      </w:r>
-    </w:p>
-    <w:p>
-      <w:pPr>
-        <w:pStyle w:val="Line"/>
-      </w:pPr>
-      <w:r>
-        <mc:AlternateContent>
-          <mc:Choice Requires="wps">
-            <w:drawing>
-              <wp:inline distT="0" distB="0" distL="0" distR="0" wp14:anchorId="2A6D8311" wp14:editId="4649F3A6">
-                <wp:extent cx="5943600" cy="0"/>
-                <wp:effectExtent l="0" t="0" r="0" b="0"/>
-                <wp:docPr id="466340308" name="Straight Connector 1">
-                  <a:extLst xmlns:a="http://schemas.openxmlformats.org/drawingml/2006/main">
-                    <a:ext uri="{C183D7F6-B498-43B3-948B-1728B52AA6E4}">
-                      <adec:decorative xmlns:adec="http://schemas.microsoft.com/office/drawing/2017/decorative" val="1"/>
-                    </a:ext>
-                  </a:extLst>
-                </wp:docPr>
-                <wp:cNvGraphicFramePr/>
-                <a:graphic xmlns:a="http://schemas.openxmlformats.org/drawingml/2006/main">
-                  <a:graphicData uri="http://schemas.microsoft.com/office/word/2010/wordprocessingShape">
-                    <wps:wsp>
-                      <wps:cNvCnPr/>
-                      <wps:spPr>
-                        <a:xfrm>
-                          <a:off x="0" y="0"/>
-                          <a:ext cx="5943600" cy="0"/>
-                        </a:xfrm>
-                        <a:prstGeom prst="line">
-                          <a:avLst/>
-                        </a:prstGeom>
-                        <a:noFill/>
-                        <a:ln w="6350" cap="flat" cmpd="sng" algn="ctr">
-                          <a:solidFill>
-                            <a:sysClr val="window" lastClr="FFFFFF">
-                              <a:lumMod val="75000"/>
-                            </a:sysClr>
-                          </a:solidFill>
-                          <a:prstDash val="solid"/>
-                          <a:miter lim="800000"/>
-                        </a:ln>
-                        <a:effectLst/>
-                      </wps:spPr>
-                      <wps:bodyPr/>
-                    </wps:wsp>
-                  </a:graphicData>
-                </a:graphic>
-              </wp:inline>
-            </w:drawing>
-          </mc:Choice>
-          <mc:Fallback>
-            <w:pict>
-              <v:line w14:anchorId="74882AC5" id="Straight Connector 1" o:spid="_x0000_s1026" alt="&quot;&quot;" style="visibility:visible;mso-wrap-style:square;mso-left-percent:-10001;mso-top-percent:-10001;mso-position-horizontal:absolute;mso-position-horizontal-relative:char;mso-position-vertical:absolute;mso-position-vertical-relative:line;mso-left-percent:-10001;mso-top-percent:-10001" from="0,0" to="468pt,0" o:gfxdata="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" strokecolor="#bfbfbf" strokeweight=".5pt">
-                <v:stroke joinstyle="miter"/>
-                <w10:anchorlock/>
-              </v:line>
-            </w:pict>
-          </mc:Fallback>
-        </mc:AlternateContent>
-      </w:r>
-    </w:p>
-    <w:p>
-      <w:pPr>
-        <w:pStyle w:val="ListParagraph"/>
-        <w:numPr>
-          <w:ilvl w:val="0"/>
-          <w:numId w:val="14"/>
-        </w:numPr>
-      </w:pPr>
-      <w:r>
-        <w:t>English</w:t>
-      </w:r>
-    </w:p>
-    <w:p>
-      <w:pPr>
-        <w:pStyle w:val="ListParagraph"/>
-        <w:numPr>
-          <w:ilvl w:val="0"/>
-          <w:numId w:val="14"/>
-        </w:numPr>
-      </w:pPr>
-      <w:r>
-        <w:t>Kannada</w:t>
-      </w:r>
-    </w:p>
-    <w:p>
-      <w:pPr>
-        <w:pStyle w:val="ListParagraph"/>
-        <w:numPr>
-          <w:ilvl w:val="0"/>
-          <w:numId w:val="14"/>
-        </w:numPr>
-      </w:pPr>
-      <w:r>
-        <w:t>Tamil</w:t>
-      </w:r>
-    </w:p>
-    <w:p>
-      <w:pPr>
-        <w:pStyle w:val="ListParagraph"/>
-        <w:numPr>
-          <w:ilvl w:val="0"/>
-          <w:numId w:val="14"/>
-        </w:numPr>
-      </w:pPr>
-      <w:r>
-        <w:t>Telugu</w:t>
-      </w:r>
-    </w:p>
-    <w:p>
-      <w:pPr>
-        <w:pStyle w:val="ListParagraph"/>
-        <w:numPr>
-          <w:ilvl w:val="0"/>
-          <w:numId w:val="14"/>
-        </w:numPr>
-      </w:pPr>
-      <w:r>
-        <w:t>Hindi</w:t>
-      </w:r>
-    </w:p>
-    <w:p>
-      <w:pPr>
-        <w:rPr>
-          <w:sz w:val="18"/>
-          <w:szCs w:val="18"/>
-        </w:rPr>
-      </w:pPr>
     </w:p>
     <w:p/>
     <w:sectPr>
@@ -1944,7 +2053,7 @@
 </file>
 
 <file path=word/endnotes.xml><?xml version="1.0" encoding="utf-8"?>
-<w:endnotes xmlns:wpc="http://schemas.microsoft.com/office/word/2010/wordprocessingCanvas" xmlns:cx="http://schemas.microsoft.com/office/drawing/2014/chartex" xmlns:cx1="http://schemas.microsoft.com/office/drawing/2015/9/8/chartex" xmlns:cx2="http://schemas.microsoft.com/office/drawing/2015/10/21/chartex" xmlns:cx3="http://schemas.microsoft.com/office/drawing/2016/5/9/chartex" xmlns:cx4="http://schemas.microsoft.com/office/drawing/2016/5/10/chartex" xmlns:cx5="http://schemas.microsoft.com/office/drawing/2016/5/11/chartex" xmlns:cx6="http://schemas.microsoft.com/office/drawing/2016/5/12/chartex" xmlns:cx7="http://schemas.microsoft.com/office/drawing/2016/5/13/chartex" xmlns:cx8="http://schemas.microsoft.com/office/drawing/2016/5/14/chartex" xmlns:mc="http://schemas.openxmlformats.org/markup-compatibility/2006" xmlns:aink="http://schemas.microsoft.com/office/drawing/2016/ink" xmlns:am3d="http://schemas.microsoft.com/office/drawing/2017/model3d" xmlns:o="urn:schemas-microsoft-com:office:office" xmlns:oel="http://schemas.microsoft.com/office/2019/extlst" xmlns:r="http://schemas.openxmlformats.org/officeDocument/2006/relationships" xmlns:m="http://schemas.openxmlformats.org/officeDocument/2006/math" xmlns:v="urn:schemas-microsoft-com:vml" xmlns:wp14="http://schemas.microsoft.com/office/word/2010/wordprocessingDrawing" xmlns:wp="http://schemas.openxmlformats.org/drawingml/2006/wordprocessingDrawing" xmlns:w10="urn:schemas-microsoft-com:office:word" xmlns:w="http://schemas.openxmlformats.org/wordprocessingml/2006/main" xmlns:w14="http://schemas.microsoft.com/office/word/2010/wordml" xmlns:w15="http://schemas.microsoft.com/office/word/2012/wordml" xmlns:w16cex="http://schemas.microsoft.com/office/word/2018/wordml/cex" xmlns:w16cid="http://schemas.microsoft.com/office/word/2016/wordml/cid" xmlns:w16="http://schemas.microsoft.com/office/word/2018/wordml" xmlns:w16du="http://schemas.microsoft.com/office/word/2023/wordml/word16du" xmlns:w16sdtdh="http://schemas.microsoft.com/office/word/2020/wordml/sdtdatahash" xmlns:w16se="http://schemas.microsoft.com/office/word/2015/wordml/symex" xmlns:wpg="http://schemas.microsoft.com/office/word/2010/wordprocessingGroup" xmlns:wpi="http://schemas.microsoft.com/office/word/2010/wordprocessingInk" xmlns:wne="http://schemas.microsoft.com/office/word/2006/wordml" xmlns:wps="http://schemas.microsoft.com/office/word/2010/wordprocessingShape" mc:Ignorable="w14 w15 w16se w16cid w16 w16cex w16sdtdh w16du wp14">
+<w:endnotes xmlns:wpc="http://schemas.microsoft.com/office/word/2010/wordprocessingCanvas" xmlns:cx="http://schemas.microsoft.com/office/drawing/2014/chartex" xmlns:cx1="http://schemas.microsoft.com/office/drawing/2015/9/8/chartex" xmlns:cx2="http://schemas.microsoft.com/office/drawing/2015/10/21/chartex" xmlns:cx3="http://schemas.microsoft.com/office/drawing/2016/5/9/chartex" xmlns:cx4="http://schemas.microsoft.com/office/drawing/2016/5/10/chartex" xmlns:cx5="http://schemas.microsoft.com/office/drawing/2016/5/11/chartex" xmlns:cx6="http://schemas.microsoft.com/office/drawing/2016/5/12/chartex" xmlns:cx7="http://schemas.microsoft.com/office/drawing/2016/5/13/chartex" xmlns:cx8="http://schemas.microsoft.com/office/drawing/2016/5/14/chartex" xmlns:mc="http://schemas.openxmlformats.org/markup-compatibility/2006" xmlns:aink="http://schemas.microsoft.com/office/drawing/2016/ink" xmlns:am3d="http://schemas.microsoft.com/office/drawing/2017/model3d" xmlns:o="urn:schemas-microsoft-com:office:office" xmlns:oel="http://schemas.microsoft.com/office/2019/extlst" xmlns:r="http://schemas.openxmlformats.org/officeDocument/2006/relationships" xmlns:m="http://schemas.openxmlformats.org/officeDocument/2006/math" xmlns:v="urn:schemas-microsoft-com:vml" xmlns:wp14="http://schemas.microsoft.com/office/word/2010/wordprocessingDrawing" xmlns:wp="http://schemas.openxmlformats.org/drawingml/2006/wordprocessingDrawing" xmlns:w10="urn:schemas-microsoft-com:office:word" xmlns:w="http://schemas.openxmlformats.org/wordprocessingml/2006/main" xmlns:w14="http://schemas.microsoft.com/office/word/2010/wordml" xmlns:w15="http://schemas.microsoft.com/office/word/2012/wordml" xmlns:w16cex="http://schemas.microsoft.com/office/word/2018/wordml/cex" xmlns:w16cid="http://schemas.microsoft.com/office/word/2016/wordml/cid" xmlns:w16="http://schemas.microsoft.com/office/word/2018/wordml" xmlns:w16du="http://schemas.microsoft.com/office/word/2023/wordml/word16du" xmlns:w16sdtdh="http://schemas.microsoft.com/office/word/2020/wordml/sdtdatahash" xmlns:w16sdtfl="http://schemas.microsoft.com/office/word/2024/wordml/sdtformatlock" xmlns:w16se="http://schemas.microsoft.com/office/word/2015/wordml/symex" xmlns:wpg="http://schemas.microsoft.com/office/word/2010/wordprocessingGroup" xmlns:wpi="http://schemas.microsoft.com/office/word/2010/wordprocessingInk" xmlns:wne="http://schemas.microsoft.com/office/word/2006/wordml" xmlns:wps="http://schemas.microsoft.com/office/word/2010/wordprocessingShape" mc:Ignorable="w14 w15 w16se w16cid w16 w16cex w16sdtdh w16sdtfl w16du wp14">
   <w:endnote w:type="separator" w:id="-1">
     <w:p>
       <w:r>
@@ -1963,7 +2072,7 @@
 </file>
 
 <file path=word/footnotes.xml><?xml version="1.0" encoding="utf-8"?>
-<w:footnotes xmlns:wpc="http://schemas.microsoft.com/office/word/2010/wordprocessingCanvas" xmlns:cx="http://schemas.microsoft.com/office/drawing/2014/chartex" xmlns:cx1="http://schemas.microsoft.com/office/drawing/2015/9/8/chartex" xmlns:cx2="http://schemas.microsoft.com/office/drawing/2015/10/21/chartex" xmlns:cx3="http://schemas.microsoft.com/office/drawing/2016/5/9/chartex" xmlns:cx4="http://schemas.microsoft.com/office/drawing/2016/5/10/chartex" xmlns:cx5="http://schemas.microsoft.com/office/drawing/2016/5/11/chartex" xmlns:cx6="http://schemas.microsoft.com/office/drawing/2016/5/12/chartex" xmlns:cx7="http://schemas.microsoft.com/office/drawing/2016/5/13/chartex" xmlns:cx8="http://schemas.microsoft.com/office/drawing/2016/5/14/chartex" xmlns:mc="http://schemas.openxmlformats.org/markup-compatibility/2006" xmlns:aink="http://schemas.microsoft.com/office/drawing/2016/ink" xmlns:am3d="http://schemas.microsoft.com/office/drawing/2017/model3d" xmlns:o="urn:schemas-microsoft-com:office:office" xmlns:oel="http://schemas.microsoft.com/office/2019/extlst" xmlns:r="http://schemas.openxmlformats.org/officeDocument/2006/relationships" xmlns:m="http://schemas.openxmlformats.org/officeDocument/2006/math" xmlns:v="urn:schemas-microsoft-com:vml" xmlns:wp14="http://schemas.microsoft.com/office/word/2010/wordprocessingDrawing" xmlns:wp="http://schemas.openxmlformats.org/drawingml/2006/wordprocessingDrawing" xmlns:w10="urn:schemas-microsoft-com:office:word" xmlns:w="http://schemas.openxmlformats.org/wordprocessingml/2006/main" xmlns:w14="http://schemas.microsoft.com/office/word/2010/wordml" xmlns:w15="http://schemas.microsoft.com/office/word/2012/wordml" xmlns:w16cex="http://schemas.microsoft.com/office/word/2018/wordml/cex" xmlns:w16cid="http://schemas.microsoft.com/office/word/2016/wordml/cid" xmlns:w16="http://schemas.microsoft.com/office/word/2018/wordml" xmlns:w16du="http://schemas.microsoft.com/office/word/2023/wordml/word16du" xmlns:w16sdtdh="http://schemas.microsoft.com/office/word/2020/wordml/sdtdatahash" xmlns:w16se="http://schemas.microsoft.com/office/word/2015/wordml/symex" xmlns:wpg="http://schemas.microsoft.com/office/word/2010/wordprocessingGroup" xmlns:wpi="http://schemas.microsoft.com/office/word/2010/wordprocessingInk" xmlns:wne="http://schemas.microsoft.com/office/word/2006/wordml" xmlns:wps="http://schemas.microsoft.com/office/word/2010/wordprocessingShape" mc:Ignorable="w14 w15 w16se w16cid w16 w16cex w16sdtdh w16du wp14">
+<w:footnotes xmlns:wpc="http://schemas.microsoft.com/office/word/2010/wordprocessingCanvas" xmlns:cx="http://schemas.microsoft.com/office/drawing/2014/chartex" xmlns:cx1="http://schemas.microsoft.com/office/drawing/2015/9/8/chartex" xmlns:cx2="http://schemas.microsoft.com/office/drawing/2015/10/21/chartex" xmlns:cx3="http://schemas.microsoft.com/office/drawing/2016/5/9/chartex" xmlns:cx4="http://schemas.microsoft.com/office/drawing/2016/5/10/chartex" xmlns:cx5="http://schemas.microsoft.com/office/drawing/2016/5/11/chartex" xmlns:cx6="http://schemas.microsoft.com/office/drawing/2016/5/12/chartex" xmlns:cx7="http://schemas.microsoft.com/office/drawing/2016/5/13/chartex" xmlns:cx8="http://schemas.microsoft.com/office/drawing/2016/5/14/chartex" xmlns:mc="http://schemas.openxmlformats.org/markup-compatibility/2006" xmlns:aink="http://schemas.microsoft.com/office/drawing/2016/ink" xmlns:am3d="http://schemas.microsoft.com/office/drawing/2017/model3d" xmlns:o="urn:schemas-microsoft-com:office:office" xmlns:oel="http://schemas.microsoft.com/office/2019/extlst" xmlns:r="http://schemas.openxmlformats.org/officeDocument/2006/relationships" xmlns:m="http://schemas.openxmlformats.org/officeDocument/2006/math" xmlns:v="urn:schemas-microsoft-com:vml" xmlns:wp14="http://schemas.microsoft.com/office/word/2010/wordprocessingDrawing" xmlns:wp="http://schemas.openxmlformats.org/drawingml/2006/wordprocessingDrawing" xmlns:w10="urn:schemas-microsoft-com:office:word" xmlns:w="http://schemas.openxmlformats.org/wordprocessingml/2006/main" xmlns:w14="http://schemas.microsoft.com/office/word/2010/wordml" xmlns:w15="http://schemas.microsoft.com/office/word/2012/wordml" xmlns:w16cex="http://schemas.microsoft.com/office/word/2018/wordml/cex" xmlns:w16cid="http://schemas.microsoft.com/office/word/2016/wordml/cid" xmlns:w16="http://schemas.microsoft.com/office/word/2018/wordml" xmlns:w16du="http://schemas.microsoft.com/office/word/2023/wordml/word16du" xmlns:w16sdtdh="http://schemas.microsoft.com/office/word/2020/wordml/sdtdatahash" xmlns:w16sdtfl="http://schemas.microsoft.com/office/word/2024/wordml/sdtformatlock" xmlns:w16se="http://schemas.microsoft.com/office/word/2015/wordml/symex" xmlns:wpg="http://schemas.microsoft.com/office/word/2010/wordprocessingGroup" xmlns:wpi="http://schemas.microsoft.com/office/word/2010/wordprocessingInk" xmlns:wne="http://schemas.microsoft.com/office/word/2006/wordml" xmlns:wps="http://schemas.microsoft.com/office/word/2010/wordprocessingShape" mc:Ignorable="w14 w15 w16se w16cid w16 w16cex w16sdtdh w16sdtfl w16du wp14">
   <w:footnote w:type="separator" w:id="-1">
     <w:p>
       <w:r>
@@ -1982,7 +2091,7 @@
 </file>
 
 <file path=word/numbering.xml><?xml version="1.0" encoding="utf-8"?>
-<w:numbering xmlns:wpc="http://schemas.microsoft.com/office/word/2010/wordprocessingCanvas" xmlns:cx="http://schemas.microsoft.com/office/drawing/2014/chartex" xmlns:cx1="http://schemas.microsoft.com/office/drawing/2015/9/8/chartex" xmlns:cx2="http://schemas.microsoft.com/office/drawing/2015/10/21/chartex" xmlns:cx3="http://schemas.microsoft.com/office/drawing/2016/5/9/chartex" xmlns:cx4="http://schemas.microsoft.com/office/drawing/2016/5/10/chartex" xmlns:cx5="http://schemas.microsoft.com/office/drawing/2016/5/11/chartex" xmlns:cx6="http://schemas.microsoft.com/office/drawing/2016/5/12/chartex" xmlns:cx7="http://schemas.microsoft.com/office/drawing/2016/5/13/chartex" xmlns:cx8="http://schemas.microsoft.com/office/drawing/2016/5/14/chartex" xmlns:mc="http://schemas.openxmlformats.org/markup-compatibility/2006" xmlns:aink="http://schemas.microsoft.com/office/drawing/2016/ink" xmlns:am3d="http://schemas.microsoft.com/office/drawing/2017/model3d" xmlns:o="urn:schemas-microsoft-com:office:office" xmlns:oel="http://schemas.microsoft.com/office/2019/extlst" xmlns:r="http://schemas.openxmlformats.org/officeDocument/2006/relationships" xmlns:m="http://schemas.openxmlformats.org/officeDocument/2006/math" xmlns:v="urn:schemas-microsoft-com:vml" xmlns:wp14="http://schemas.microsoft.com/office/word/2010/wordprocessingDrawing" xmlns:wp="http://schemas.openxmlformats.org/drawingml/2006/wordprocessingDrawing" xmlns:w10="urn:schemas-microsoft-com:office:word" xmlns:w="http://schemas.openxmlformats.org/wordprocessingml/2006/main" xmlns:w14="http://schemas.microsoft.com/office/word/2010/wordml" xmlns:w15="http://schemas.microsoft.com/office/word/2012/wordml" xmlns:w16cex="http://schemas.microsoft.com/office/word/2018/wordml/cex" xmlns:w16cid="http://schemas.microsoft.com/office/word/2016/wordml/cid" xmlns:w16="http://schemas.microsoft.com/office/word/2018/wordml" xmlns:w16du="http://schemas.microsoft.com/office/word/2023/wordml/word16du" xmlns:w16sdtdh="http://schemas.microsoft.com/office/word/2020/wordml/sdtdatahash" xmlns:w16se="http://schemas.microsoft.com/office/word/2015/wordml/symex" xmlns:wpg="http://schemas.microsoft.com/office/word/2010/wordprocessingGroup" xmlns:wpi="http://schemas.microsoft.com/office/word/2010/wordprocessingInk" xmlns:wne="http://schemas.microsoft.com/office/word/2006/wordml" xmlns:wps="http://schemas.microsoft.com/office/word/2010/wordprocessingShape" mc:Ignorable="w14 w15 w16se w16cid w16 w16cex w16sdtdh w16du wp14">
+<w:numbering xmlns:wpc="http://schemas.microsoft.com/office/word/2010/wordprocessingCanvas" xmlns:cx="http://schemas.microsoft.com/office/drawing/2014/chartex" xmlns:cx1="http://schemas.microsoft.com/office/drawing/2015/9/8/chartex" xmlns:cx2="http://schemas.microsoft.com/office/drawing/2015/10/21/chartex" xmlns:cx3="http://schemas.microsoft.com/office/drawing/2016/5/9/chartex" xmlns:cx4="http://schemas.microsoft.com/office/drawing/2016/5/10/chartex" xmlns:cx5="http://schemas.microsoft.com/office/drawing/2016/5/11/chartex" xmlns:cx6="http://schemas.microsoft.com/office/drawing/2016/5/12/chartex" xmlns:cx7="http://schemas.microsoft.com/office/drawing/2016/5/13/chartex" xmlns:cx8="http://schemas.microsoft.com/office/drawing/2016/5/14/chartex" xmlns:mc="http://schemas.openxmlformats.org/markup-compatibility/2006" xmlns:aink="http://schemas.microsoft.com/office/drawing/2016/ink" xmlns:am3d="http://schemas.microsoft.com/office/drawing/2017/model3d" xmlns:o="urn:schemas-microsoft-com:office:office" xmlns:oel="http://schemas.microsoft.com/office/2019/extlst" xmlns:r="http://schemas.openxmlformats.org/officeDocument/2006/relationships" xmlns:m="http://schemas.openxmlformats.org/officeDocument/2006/math" xmlns:v="urn:schemas-microsoft-com:vml" xmlns:wp14="http://schemas.microsoft.com/office/word/2010/wordprocessingDrawing" xmlns:wp="http://schemas.openxmlformats.org/drawingml/2006/wordprocessingDrawing" xmlns:w10="urn:schemas-microsoft-com:office:word" xmlns:w="http://schemas.openxmlformats.org/wordprocessingml/2006/main" xmlns:w14="http://schemas.microsoft.com/office/word/2010/wordml" xmlns:w15="http://schemas.microsoft.com/office/word/2012/wordml" xmlns:w16cex="http://schemas.microsoft.com/office/word/2018/wordml/cex" xmlns:w16cid="http://schemas.microsoft.com/office/word/2016/wordml/cid" xmlns:w16="http://schemas.microsoft.com/office/word/2018/wordml" xmlns:w16du="http://schemas.microsoft.com/office/word/2023/wordml/word16du" xmlns:w16sdtdh="http://schemas.microsoft.com/office/word/2020/wordml/sdtdatahash" xmlns:w16sdtfl="http://schemas.microsoft.com/office/word/2024/wordml/sdtformatlock" xmlns:w16se="http://schemas.microsoft.com/office/word/2015/wordml/symex" xmlns:wpg="http://schemas.microsoft.com/office/word/2010/wordprocessingGroup" xmlns:wpi="http://schemas.microsoft.com/office/word/2010/wordprocessingInk" xmlns:wne="http://schemas.microsoft.com/office/word/2006/wordml" xmlns:wps="http://schemas.microsoft.com/office/word/2010/wordprocessingShape" mc:Ignorable="w14 w15 w16se w16cid w16 w16cex w16sdtdh w16sdtfl w16du wp14">
   <w:abstractNum w:abstractNumId="0" w15:restartNumberingAfterBreak="0">
     <w:nsid w:val="FFFFFF7C"/>
     <w:multiLevelType w:val="singleLevel"/>
@@ -2179,6 +2288,184 @@
     </w:lvl>
   </w:abstractNum>
   <w:abstractNum w:abstractNumId="10" w15:restartNumberingAfterBreak="0">
+    <w:nsid w:val="0240045D"/>
+    <w:multiLevelType w:val="hybridMultilevel"/>
+    <w:tmpl w:val="01743598"/>
+    <w:lvl w:ilvl="0" w:tplc="04090001">
+      <w:start w:val="1"/>
+      <w:numFmt w:val="bullet"/>
+      <w:lvlText w:val=""/>
+      <w:lvlJc w:val="left"/>
+      <w:pPr>
+        <w:ind w:left="720" w:hanging="360"/>
+      </w:pPr>
+      <w:rPr>
+        <w:rFonts w:ascii="Symbol" w:hAnsi="Symbol" w:hint="default"/>
+      </w:rPr>
+    </w:lvl>
+    <w:lvl w:ilvl="1" w:tplc="FFFFFFFF" w:tentative="1">
+      <w:start w:val="1"/>
+      <w:numFmt w:val="lowerLetter"/>
+      <w:lvlText w:val="%2."/>
+      <w:lvlJc w:val="left"/>
+      <w:pPr>
+        <w:ind w:left="1440" w:hanging="360"/>
+      </w:pPr>
+    </w:lvl>
+    <w:lvl w:ilvl="2" w:tplc="FFFFFFFF" w:tentative="1">
+      <w:start w:val="1"/>
+      <w:numFmt w:val="lowerRoman"/>
+      <w:lvlText w:val="%3."/>
+      <w:lvlJc w:val="right"/>
+      <w:pPr>
+        <w:ind w:left="2160" w:hanging="180"/>
+      </w:pPr>
+    </w:lvl>
+    <w:lvl w:ilvl="3" w:tplc="FFFFFFFF" w:tentative="1">
+      <w:start w:val="1"/>
+      <w:numFmt w:val="decimal"/>
+      <w:lvlText w:val="%4."/>
+      <w:lvlJc w:val="left"/>
+      <w:pPr>
+        <w:ind w:left="2880" w:hanging="360"/>
+      </w:pPr>
+    </w:lvl>
+    <w:lvl w:ilvl="4" w:tplc="FFFFFFFF" w:tentative="1">
+      <w:start w:val="1"/>
+      <w:numFmt w:val="lowerLetter"/>
+      <w:lvlText w:val="%5."/>
+      <w:lvlJc w:val="left"/>
+      <w:pPr>
+        <w:ind w:left="3600" w:hanging="360"/>
+      </w:pPr>
+    </w:lvl>
+    <w:lvl w:ilvl="5" w:tplc="FFFFFFFF" w:tentative="1">
+      <w:start w:val="1"/>
+      <w:numFmt w:val="lowerRoman"/>
+      <w:lvlText w:val="%6."/>
+      <w:lvlJc w:val="right"/>
+      <w:pPr>
+        <w:ind w:left="4320" w:hanging="180"/>
+      </w:pPr>
+    </w:lvl>
+    <w:lvl w:ilvl="6" w:tplc="FFFFFFFF" w:tentative="1">
+      <w:start w:val="1"/>
+      <w:numFmt w:val="decimal"/>
+      <w:lvlText w:val="%7."/>
+      <w:lvlJc w:val="left"/>
+      <w:pPr>
+        <w:ind w:left="5040" w:hanging="360"/>
+      </w:pPr>
+    </w:lvl>
+    <w:lvl w:ilvl="7" w:tplc="FFFFFFFF" w:tentative="1">
+      <w:start w:val="1"/>
+      <w:numFmt w:val="lowerLetter"/>
+      <w:lvlText w:val="%8."/>
+      <w:lvlJc w:val="left"/>
+      <w:pPr>
+        <w:ind w:left="5760" w:hanging="360"/>
+      </w:pPr>
+    </w:lvl>
+    <w:lvl w:ilvl="8" w:tplc="FFFFFFFF" w:tentative="1">
+      <w:start w:val="1"/>
+      <w:numFmt w:val="lowerRoman"/>
+      <w:lvlText w:val="%9."/>
+      <w:lvlJc w:val="right"/>
+      <w:pPr>
+        <w:ind w:left="6480" w:hanging="180"/>
+      </w:pPr>
+    </w:lvl>
+  </w:abstractNum>
+  <w:abstractNum w:abstractNumId="11" w15:restartNumberingAfterBreak="0">
+    <w:nsid w:val="044D2615"/>
+    <w:multiLevelType w:val="hybridMultilevel"/>
+    <w:tmpl w:val="C322A87C"/>
+    <w:lvl w:ilvl="0" w:tplc="04090001">
+      <w:start w:val="1"/>
+      <w:numFmt w:val="bullet"/>
+      <w:lvlText w:val=""/>
+      <w:lvlJc w:val="left"/>
+      <w:pPr>
+        <w:ind w:left="720" w:hanging="360"/>
+      </w:pPr>
+      <w:rPr>
+        <w:rFonts w:ascii="Symbol" w:hAnsi="Symbol" w:hint="default"/>
+      </w:rPr>
+    </w:lvl>
+    <w:lvl w:ilvl="1" w:tplc="FFFFFFFF" w:tentative="1">
+      <w:start w:val="1"/>
+      <w:numFmt w:val="lowerLetter"/>
+      <w:lvlText w:val="%2."/>
+      <w:lvlJc w:val="left"/>
+      <w:pPr>
+        <w:ind w:left="1440" w:hanging="360"/>
+      </w:pPr>
+    </w:lvl>
+    <w:lvl w:ilvl="2" w:tplc="FFFFFFFF" w:tentative="1">
+      <w:start w:val="1"/>
+      <w:numFmt w:val="lowerRoman"/>
+      <w:lvlText w:val="%3."/>
+      <w:lvlJc w:val="right"/>
+      <w:pPr>
+        <w:ind w:left="2160" w:hanging="180"/>
+      </w:pPr>
+    </w:lvl>
+    <w:lvl w:ilvl="3" w:tplc="FFFFFFFF" w:tentative="1">
+      <w:start w:val="1"/>
+      <w:numFmt w:val="decimal"/>
+      <w:lvlText w:val="%4."/>
+      <w:lvlJc w:val="left"/>
+      <w:pPr>
+        <w:ind w:left="2880" w:hanging="360"/>
+      </w:pPr>
+    </w:lvl>
+    <w:lvl w:ilvl="4" w:tplc="FFFFFFFF" w:tentative="1">
+      <w:start w:val="1"/>
+      <w:numFmt w:val="lowerLetter"/>
+      <w:lvlText w:val="%5."/>
+      <w:lvlJc w:val="left"/>
+      <w:pPr>
+        <w:ind w:left="3600" w:hanging="360"/>
+      </w:pPr>
+    </w:lvl>
+    <w:lvl w:ilvl="5" w:tplc="FFFFFFFF" w:tentative="1">
+      <w:start w:val="1"/>
+      <w:numFmt w:val="lowerRoman"/>
+      <w:lvlText w:val="%6."/>
+      <w:lvlJc w:val="right"/>
+      <w:pPr>
+        <w:ind w:left="4320" w:hanging="180"/>
+      </w:pPr>
+    </w:lvl>
+    <w:lvl w:ilvl="6" w:tplc="FFFFFFFF" w:tentative="1">
+      <w:start w:val="1"/>
+      <w:numFmt w:val="decimal"/>
+      <w:lvlText w:val="%7."/>
+      <w:lvlJc w:val="left"/>
+      <w:pPr>
+        <w:ind w:left="5040" w:hanging="360"/>
+      </w:pPr>
+    </w:lvl>
+    <w:lvl w:ilvl="7" w:tplc="FFFFFFFF" w:tentative="1">
+      <w:start w:val="1"/>
+      <w:numFmt w:val="lowerLetter"/>
+      <w:lvlText w:val="%8."/>
+      <w:lvlJc w:val="left"/>
+      <w:pPr>
+        <w:ind w:left="5760" w:hanging="360"/>
+      </w:pPr>
+    </w:lvl>
+    <w:lvl w:ilvl="8" w:tplc="FFFFFFFF" w:tentative="1">
+      <w:start w:val="1"/>
+      <w:numFmt w:val="lowerRoman"/>
+      <w:lvlText w:val="%9."/>
+      <w:lvlJc w:val="right"/>
+      <w:pPr>
+        <w:ind w:left="6480" w:hanging="180"/>
+      </w:pPr>
+    </w:lvl>
+  </w:abstractNum>
+  <w:abstractNum w:abstractNumId="12" w15:restartNumberingAfterBreak="0">
     <w:nsid w:val="0D9E0B0C"/>
     <w:multiLevelType w:val="hybridMultilevel"/>
     <w:tmpl w:val="F8E29D70"/>
@@ -2264,7 +2551,7 @@
       </w:pPr>
     </w:lvl>
   </w:abstractNum>
-  <w:abstractNum w:abstractNumId="11" w15:restartNumberingAfterBreak="0">
+  <w:abstractNum w:abstractNumId="13" w15:restartNumberingAfterBreak="0">
     <w:nsid w:val="18EA7C37"/>
     <w:multiLevelType w:val="hybridMultilevel"/>
     <w:tmpl w:val="2F8672E8"/>
@@ -2377,7 +2664,7 @@
       </w:rPr>
     </w:lvl>
   </w:abstractNum>
-  <w:abstractNum w:abstractNumId="12" w15:restartNumberingAfterBreak="0">
+  <w:abstractNum w:abstractNumId="14" w15:restartNumberingAfterBreak="0">
     <w:nsid w:val="2E911F21"/>
     <w:multiLevelType w:val="hybridMultilevel"/>
     <w:tmpl w:val="CB0631D0"/>
@@ -2490,7 +2777,7 @@
       </w:rPr>
     </w:lvl>
   </w:abstractNum>
-  <w:abstractNum w:abstractNumId="13" w15:restartNumberingAfterBreak="0">
+  <w:abstractNum w:abstractNumId="15" w15:restartNumberingAfterBreak="0">
     <w:nsid w:val="38F250DE"/>
     <w:multiLevelType w:val="hybridMultilevel"/>
     <w:tmpl w:val="2C9E1358"/>
@@ -2603,7 +2890,7 @@
       </w:rPr>
     </w:lvl>
   </w:abstractNum>
-  <w:abstractNum w:abstractNumId="14" w15:restartNumberingAfterBreak="0">
+  <w:abstractNum w:abstractNumId="16" w15:restartNumberingAfterBreak="0">
     <w:nsid w:val="3BC36325"/>
     <w:multiLevelType w:val="hybridMultilevel"/>
     <w:tmpl w:val="91225BD8"/>
@@ -2689,7 +2976,7 @@
       </w:pPr>
     </w:lvl>
   </w:abstractNum>
-  <w:abstractNum w:abstractNumId="15" w15:restartNumberingAfterBreak="0">
+  <w:abstractNum w:abstractNumId="17" w15:restartNumberingAfterBreak="0">
     <w:nsid w:val="414C45EA"/>
     <w:multiLevelType w:val="hybridMultilevel"/>
     <w:tmpl w:val="B336A072"/>
@@ -2802,7 +3089,7 @@
       </w:rPr>
     </w:lvl>
   </w:abstractNum>
-  <w:abstractNum w:abstractNumId="16" w15:restartNumberingAfterBreak="0">
+  <w:abstractNum w:abstractNumId="18" w15:restartNumberingAfterBreak="0">
     <w:nsid w:val="4E6009A5"/>
     <w:multiLevelType w:val="multilevel"/>
     <w:tmpl w:val="0409001F"/>
@@ -2888,7 +3175,7 @@
       </w:pPr>
     </w:lvl>
   </w:abstractNum>
-  <w:abstractNum w:abstractNumId="17" w15:restartNumberingAfterBreak="0">
+  <w:abstractNum w:abstractNumId="19" w15:restartNumberingAfterBreak="0">
     <w:nsid w:val="525C6A5A"/>
     <w:multiLevelType w:val="multilevel"/>
     <w:tmpl w:val="0409001D"/>
@@ -2974,7 +3261,7 @@
       </w:pPr>
     </w:lvl>
   </w:abstractNum>
-  <w:abstractNum w:abstractNumId="18" w15:restartNumberingAfterBreak="0">
+  <w:abstractNum w:abstractNumId="20" w15:restartNumberingAfterBreak="0">
     <w:nsid w:val="55DA63F0"/>
     <w:multiLevelType w:val="hybridMultilevel"/>
     <w:tmpl w:val="95D2253A"/>
@@ -3060,7 +3347,7 @@
       </w:pPr>
     </w:lvl>
   </w:abstractNum>
-  <w:abstractNum w:abstractNumId="19" w15:restartNumberingAfterBreak="0">
+  <w:abstractNum w:abstractNumId="21" w15:restartNumberingAfterBreak="0">
     <w:nsid w:val="5EAF39B8"/>
     <w:multiLevelType w:val="hybridMultilevel"/>
     <w:tmpl w:val="F42CD546"/>
@@ -3173,7 +3460,7 @@
       </w:rPr>
     </w:lvl>
   </w:abstractNum>
-  <w:abstractNum w:abstractNumId="20" w15:restartNumberingAfterBreak="0">
+  <w:abstractNum w:abstractNumId="22" w15:restartNumberingAfterBreak="0">
     <w:nsid w:val="640614BD"/>
     <w:multiLevelType w:val="multilevel"/>
     <w:tmpl w:val="04090023"/>
@@ -3260,7 +3547,7 @@
       </w:pPr>
     </w:lvl>
   </w:abstractNum>
-  <w:abstractNum w:abstractNumId="21" w15:restartNumberingAfterBreak="0">
+  <w:abstractNum w:abstractNumId="23" w15:restartNumberingAfterBreak="0">
     <w:nsid w:val="725B65AF"/>
     <w:multiLevelType w:val="hybridMultilevel"/>
     <w:tmpl w:val="59C405BA"/>
@@ -3373,7 +3660,7 @@
       </w:rPr>
     </w:lvl>
   </w:abstractNum>
-  <w:abstractNum w:abstractNumId="22" w15:restartNumberingAfterBreak="0">
+  <w:abstractNum w:abstractNumId="24" w15:restartNumberingAfterBreak="0">
     <w:nsid w:val="74604DD1"/>
     <w:multiLevelType w:val="hybridMultilevel"/>
     <w:tmpl w:val="1FDA4FD8"/>
@@ -3486,7 +3773,7 @@
       </w:rPr>
     </w:lvl>
   </w:abstractNum>
-  <w:abstractNum w:abstractNumId="23" w15:restartNumberingAfterBreak="0">
+  <w:abstractNum w:abstractNumId="25" w15:restartNumberingAfterBreak="0">
     <w:nsid w:val="76777CEA"/>
     <w:multiLevelType w:val="hybridMultilevel"/>
     <w:tmpl w:val="CF464986"/>
@@ -3599,7 +3886,7 @@
       </w:rPr>
     </w:lvl>
   </w:abstractNum>
-  <w:abstractNum w:abstractNumId="24" w15:restartNumberingAfterBreak="0">
+  <w:abstractNum w:abstractNumId="26" w15:restartNumberingAfterBreak="0">
     <w:nsid w:val="7F065538"/>
     <w:multiLevelType w:val="hybridMultilevel"/>
     <w:tmpl w:val="F2040552"/>
@@ -3743,55 +4030,61 @@
     <w:abstractNumId w:val="0"/>
   </w:num>
   <w:num w:numId="11" w16cid:durableId="402799907">
+    <w:abstractNumId w:val="18"/>
+  </w:num>
+  <w:num w:numId="12" w16cid:durableId="973682587">
+    <w:abstractNumId w:val="19"/>
+  </w:num>
+  <w:num w:numId="13" w16cid:durableId="290981187">
+    <w:abstractNumId w:val="22"/>
+  </w:num>
+  <w:num w:numId="14" w16cid:durableId="1145659322">
+    <w:abstractNumId w:val="15"/>
+  </w:num>
+  <w:num w:numId="15" w16cid:durableId="976104392">
+    <w:abstractNumId w:val="17"/>
+  </w:num>
+  <w:num w:numId="16" w16cid:durableId="364411771">
+    <w:abstractNumId w:val="21"/>
+  </w:num>
+  <w:num w:numId="17" w16cid:durableId="1915511787">
+    <w:abstractNumId w:val="24"/>
+  </w:num>
+  <w:num w:numId="18" w16cid:durableId="1089085953">
+    <w:abstractNumId w:val="14"/>
+  </w:num>
+  <w:num w:numId="19" w16cid:durableId="1311253242">
+    <w:abstractNumId w:val="25"/>
+  </w:num>
+  <w:num w:numId="20" w16cid:durableId="1055852908">
+    <w:abstractNumId w:val="13"/>
+  </w:num>
+  <w:num w:numId="21" w16cid:durableId="772285825">
+    <w:abstractNumId w:val="23"/>
+  </w:num>
+  <w:num w:numId="22" w16cid:durableId="260068870">
+    <w:abstractNumId w:val="26"/>
+  </w:num>
+  <w:num w:numId="23" w16cid:durableId="1136027103">
+    <w:abstractNumId w:val="20"/>
+  </w:num>
+  <w:num w:numId="24" w16cid:durableId="1961691593">
+    <w:abstractNumId w:val="12"/>
+  </w:num>
+  <w:num w:numId="25" w16cid:durableId="2054304842">
     <w:abstractNumId w:val="16"/>
   </w:num>
-  <w:num w:numId="12" w16cid:durableId="973682587">
-    <w:abstractNumId w:val="17"/>
-  </w:num>
-  <w:num w:numId="13" w16cid:durableId="290981187">
-    <w:abstractNumId w:val="20"/>
-  </w:num>
-  <w:num w:numId="14" w16cid:durableId="1145659322">
-    <w:abstractNumId w:val="13"/>
-  </w:num>
-  <w:num w:numId="15" w16cid:durableId="976104392">
-    <w:abstractNumId w:val="15"/>
-  </w:num>
-  <w:num w:numId="16" w16cid:durableId="364411771">
-    <w:abstractNumId w:val="19"/>
-  </w:num>
-  <w:num w:numId="17" w16cid:durableId="1915511787">
-    <w:abstractNumId w:val="22"/>
-  </w:num>
-  <w:num w:numId="18" w16cid:durableId="1089085953">
-    <w:abstractNumId w:val="12"/>
-  </w:num>
-  <w:num w:numId="19" w16cid:durableId="1311253242">
-    <w:abstractNumId w:val="23"/>
-  </w:num>
-  <w:num w:numId="20" w16cid:durableId="1055852908">
-    <w:abstractNumId w:val="11"/>
-  </w:num>
-  <w:num w:numId="21" w16cid:durableId="772285825">
-    <w:abstractNumId w:val="21"/>
-  </w:num>
-  <w:num w:numId="22" w16cid:durableId="260068870">
-    <w:abstractNumId w:val="24"/>
-  </w:num>
-  <w:num w:numId="23" w16cid:durableId="1136027103">
-    <w:abstractNumId w:val="18"/>
-  </w:num>
-  <w:num w:numId="24" w16cid:durableId="1961691593">
+  <w:num w:numId="26" w16cid:durableId="378016765">
     <w:abstractNumId w:val="10"/>
   </w:num>
-  <w:num w:numId="25" w16cid:durableId="2054304842">
-    <w:abstractNumId w:val="14"/>
+  <w:num w:numId="27" w16cid:durableId="492381091">
+    <w:abstractNumId w:val="11"/>
   </w:num>
 </w:numbering>
 </file>
 
 <file path=word/styles.xml><?xml version="1.0" encoding="utf-8"?>
-<w:styles xmlns:mc="http://schemas.openxmlformats.org/markup-compatibility/2006" xmlns:r="http://schemas.openxmlformats.org/officeDocument/2006/relationships" xmlns:w="http://schemas.openxmlformats.org/wordprocessingml/2006/main" xmlns:w14="http://schemas.microsoft.com/office/word/2010/wordml" xmlns:w15="http://schemas.microsoft.com/office/word/2012/wordml" xmlns:w16cex="http://schemas.microsoft.com/office/word/2018/wordml/cex" xmlns:w16cid="http://schemas.microsoft.com/office/word/2016/wordml/cid" xmlns:w16="http://schemas.microsoft.com/office/word/2018/wordml" xmlns:w16du="http://schemas.microsoft.com/office/word/2023/wordml/word16du" xmlns:w16sdtdh="http://schemas.microsoft.com/office/word/2020/wordml/sdtdatahash" xmlns:w16se="http://schemas.microsoft.com/office/word/2015/wordml/symex" mc:Ignorable="w14 w15 w16se w16cid w16 w16cex w16sdtdh w16du">
+<w:styles xmlns:mc="http://schemas.openxmlformats.org/markup-compatibility/2006" xmlns:r="http://schemas.openxmlformats.org/officeDocument/2006/relationships" xmlns:w="http://schemas.openxmlformats.org/wordprocessingml/2006/main" xmlns:w14="http://schemas.microsoft.com/office/word/2010/wordml" xmlns:w15="http://schemas.microsoft.com/office/word/2012/wordml" xmlns:w16cex="http://schemas.microsoft.com/office/word/2018/wordml/cex" xmlns:w16cid="http://schemas.microsoft.com/office/word/2016/wordml/cid" xmlns:w16="http://schemas.microsoft.com/office/word/2018/wordml" xmlns:w16du="http://schemas.microsoft.com/office/word/2023/wordml/word16du" xmlns:w16sdtdh="http://schemas.microsoft.com/office/word/2020/wordml/sdtdatahash" xmlns:w16sdtfl="http://schemas.microsoft.com/office/word/2024/wordml/sdtformatlock" xmlns:w16se="http://schemas.microsoft.com/office/word/2015/wordml/symex" mc:Ignorable="w14 w15 w16se w16cid w16 w16cex w16sdtdh w16sdtfl w16du">
   <w:docDefaults>
     <w:rPrDefault>
       <w:rPr>
@@ -29102,11 +29395,11 @@
 </file>
 
 <file path=word/glossary/document.xml><?xml version="1.0" encoding="utf-8"?>
-<w:glossaryDocument xmlns:wpc="http://schemas.microsoft.com/office/word/2010/wordprocessingCanvas" xmlns:cx="http://schemas.microsoft.com/office/drawing/2014/chartex" xmlns:cx1="http://schemas.microsoft.com/office/drawing/2015/9/8/chartex" xmlns:cx2="http://schemas.microsoft.com/office/drawing/2015/10/21/chartex" xmlns:cx3="http://schemas.microsoft.com/office/drawing/2016/5/9/chartex" xmlns:cx4="http://schemas.microsoft.com/office/drawing/2016/5/10/chartex" xmlns:cx5="http://schemas.microsoft.com/office/drawing/2016/5/11/chartex" xmlns:cx6="http://schemas.microsoft.com/office/drawing/2016/5/12/chartex" xmlns:cx7="http://schemas.microsoft.com/office/drawing/2016/5/13/chartex" xmlns:cx8="http://schemas.microsoft.com/office/drawing/2016/5/14/chartex" xmlns:mc="http://schemas.openxmlformats.org/markup-compatibility/2006" xmlns:aink="http://schemas.microsoft.com/office/drawing/2016/ink" xmlns:am3d="http://schemas.microsoft.com/office/drawing/2017/model3d" xmlns:o="urn:schemas-microsoft-com:office:office" xmlns:oel="http://schemas.microsoft.com/office/2019/extlst" xmlns:r="http://schemas.openxmlformats.org/officeDocument/2006/relationships" xmlns:m="http://schemas.openxmlformats.org/officeDocument/2006/math" xmlns:v="urn:schemas-microsoft-com:vml" xmlns:wp14="http://schemas.microsoft.com/office/word/2010/wordprocessingDrawing" xmlns:wp="http://schemas.openxmlformats.org/drawingml/2006/wordprocessingDrawing" xmlns:w10="urn:schemas-microsoft-com:office:word" xmlns:w="http://schemas.openxmlformats.org/wordprocessingml/2006/main" xmlns:w14="http://schemas.microsoft.com/office/word/2010/wordml" xmlns:w15="http://schemas.microsoft.com/office/word/2012/wordml" xmlns:w16cex="http://schemas.microsoft.com/office/word/2018/wordml/cex" xmlns:w16cid="http://schemas.microsoft.com/office/word/2016/wordml/cid" xmlns:w16="http://schemas.microsoft.com/office/word/2018/wordml" xmlns:w16du="http://schemas.microsoft.com/office/word/2023/wordml/word16du" xmlns:w16sdtdh="http://schemas.microsoft.com/office/word/2020/wordml/sdtdatahash" xmlns:w16se="http://schemas.microsoft.com/office/word/2015/wordml/symex" xmlns:wpg="http://schemas.microsoft.com/office/word/2010/wordprocessingGroup" xmlns:wpi="http://schemas.microsoft.com/office/word/2010/wordprocessingInk" xmlns:wne="http://schemas.microsoft.com/office/word/2006/wordml" xmlns:wps="http://schemas.microsoft.com/office/word/2010/wordprocessingShape" mc:Ignorable="w14 w15 w16se w16cid w16 w16cex w16sdtdh w16du wp14">
+<w:glossaryDocument xmlns:wpc="http://schemas.microsoft.com/office/word/2010/wordprocessingCanvas" xmlns:cx="http://schemas.microsoft.com/office/drawing/2014/chartex" xmlns:cx1="http://schemas.microsoft.com/office/drawing/2015/9/8/chartex" xmlns:cx2="http://schemas.microsoft.com/office/drawing/2015/10/21/chartex" xmlns:cx3="http://schemas.microsoft.com/office/drawing/2016/5/9/chartex" xmlns:cx4="http://schemas.microsoft.com/office/drawing/2016/5/10/chartex" xmlns:cx5="http://schemas.microsoft.com/office/drawing/2016/5/11/chartex" xmlns:cx6="http://schemas.microsoft.com/office/drawing/2016/5/12/chartex" xmlns:cx7="http://schemas.microsoft.com/office/drawing/2016/5/13/chartex" xmlns:cx8="http://schemas.microsoft.com/office/drawing/2016/5/14/chartex" xmlns:mc="http://schemas.openxmlformats.org/markup-compatibility/2006" xmlns:aink="http://schemas.microsoft.com/office/drawing/2016/ink" xmlns:am3d="http://schemas.microsoft.com/office/drawing/2017/model3d" xmlns:o="urn:schemas-microsoft-com:office:office" xmlns:oel="http://schemas.microsoft.com/office/2019/extlst" xmlns:r="http://schemas.openxmlformats.org/officeDocument/2006/relationships" xmlns:m="http://schemas.openxmlformats.org/officeDocument/2006/math" xmlns:v="urn:schemas-microsoft-com:vml" xmlns:wp14="http://schemas.microsoft.com/office/word/2010/wordprocessingDrawing" xmlns:wp="http://schemas.openxmlformats.org/drawingml/2006/wordprocessingDrawing" xmlns:w10="urn:schemas-microsoft-com:office:word" xmlns:w="http://schemas.openxmlformats.org/wordprocessingml/2006/main" xmlns:w14="http://schemas.microsoft.com/office/word/2010/wordml" xmlns:w15="http://schemas.microsoft.com/office/word/2012/wordml" xmlns:w16cex="http://schemas.microsoft.com/office/word/2018/wordml/cex" xmlns:w16cid="http://schemas.microsoft.com/office/word/2016/wordml/cid" xmlns:w16="http://schemas.microsoft.com/office/word/2018/wordml" xmlns:w16du="http://schemas.microsoft.com/office/word/2023/wordml/word16du" xmlns:w16sdtdh="http://schemas.microsoft.com/office/word/2020/wordml/sdtdatahash" xmlns:w16sdtfl="http://schemas.microsoft.com/office/word/2024/wordml/sdtformatlock" xmlns:w16se="http://schemas.microsoft.com/office/word/2015/wordml/symex" xmlns:wpg="http://schemas.microsoft.com/office/word/2010/wordprocessingGroup" xmlns:wpi="http://schemas.microsoft.com/office/word/2010/wordprocessingInk" xmlns:wne="http://schemas.microsoft.com/office/word/2006/wordml" xmlns:wps="http://schemas.microsoft.com/office/word/2010/wordprocessingShape" mc:Ignorable="w14 w15 w16se w16cid w16 w16cex w16sdtdh w16sdtfl w16du wp14">
   <w:docParts>
     <w:docPart>
       <w:docPartPr>
-        <w:name w:val="AB163E7F5DBB415B875F0BE5BD032FBE"/>
+        <w:name w:val="B1960E8FC1C746E1958FF01958A4A076"/>
         <w:category>
           <w:name w:val="General"/>
           <w:gallery w:val="placeholder"/>
@@ -29117,12 +29410,12 @@
         <w:behaviors>
           <w:behavior w:val="content"/>
         </w:behaviors>
-        <w:guid w:val="{03E29110-3DB8-4495-AC46-7815B2454799}"/>
+        <w:guid w:val="{9566B10F-763B-4944-B7E9-9299BC9AC534}"/>
       </w:docPartPr>
       <w:docPartBody>
         <w:p>
           <w:pPr>
-            <w:pStyle w:val="AB163E7F5DBB415B875F0BE5BD032FBE"/>
+            <w:pStyle w:val="B1960E8FC1C746E1958FF01958A4A076"/>
           </w:pPr>
           <w:r>
             <w:t>Education</w:t>
@@ -29135,7 +29428,7 @@
 </file>
 
 <file path=word/glossary/fontTable.xml><?xml version="1.0" encoding="utf-8"?>
-<w:fonts xmlns:mc="http://schemas.openxmlformats.org/markup-compatibility/2006" xmlns:r="http://schemas.openxmlformats.org/officeDocument/2006/relationships" xmlns:w="http://schemas.openxmlformats.org/wordprocessingml/2006/main" xmlns:w14="http://schemas.microsoft.com/office/word/2010/wordml" xmlns:w15="http://schemas.microsoft.com/office/word/2012/wordml" xmlns:w16cex="http://schemas.microsoft.com/office/word/2018/wordml/cex" xmlns:w16cid="http://schemas.microsoft.com/office/word/2016/wordml/cid" xmlns:w16="http://schemas.microsoft.com/office/word/2018/wordml" xmlns:w16du="http://schemas.microsoft.com/office/word/2023/wordml/word16du" xmlns:w16sdtdh="http://schemas.microsoft.com/office/word/2020/wordml/sdtdatahash" xmlns:w16se="http://schemas.microsoft.com/office/word/2015/wordml/symex" mc:Ignorable="w14 w15 w16se w16cid w16 w16cex w16sdtdh w16du">
+<w:fonts xmlns:mc="http://schemas.openxmlformats.org/markup-compatibility/2006" xmlns:r="http://schemas.openxmlformats.org/officeDocument/2006/relationships" xmlns:w="http://schemas.openxmlformats.org/wordprocessingml/2006/main" xmlns:w14="http://schemas.microsoft.com/office/word/2010/wordml" xmlns:w15="http://schemas.microsoft.com/office/word/2012/wordml" xmlns:w16cex="http://schemas.microsoft.com/office/word/2018/wordml/cex" xmlns:w16cid="http://schemas.microsoft.com/office/word/2016/wordml/cid" xmlns:w16="http://schemas.microsoft.com/office/word/2018/wordml" xmlns:w16du="http://schemas.microsoft.com/office/word/2023/wordml/word16du" xmlns:w16sdtdh="http://schemas.microsoft.com/office/word/2020/wordml/sdtdatahash" xmlns:w16sdtfl="http://schemas.microsoft.com/office/word/2024/wordml/sdtformatlock" xmlns:w16se="http://schemas.microsoft.com/office/word/2015/wordml/symex" mc:Ignorable="w14 w15 w16se w16cid w16 w16cex w16sdtdh w16sdtfl w16du">
   <w:font w:name="Symbol">
     <w:panose1 w:val="05050102010706020507"/>
     <w:charset w:val="02"/>
@@ -29255,7 +29548,7 @@
 </file>
 
 <file path=word/glossary/settings.xml><?xml version="1.0" encoding="utf-8"?>
-<w:settings xmlns:mc="http://schemas.openxmlformats.org/markup-compatibility/2006" xmlns:o="urn:schemas-microsoft-com:office:office" xmlns:r="http://schemas.openxmlformats.org/officeDocument/2006/relationships" xmlns:m="http://schemas.openxmlformats.org/officeDocument/2006/math" xmlns:v="urn:schemas-microsoft-com:vml" xmlns:w10="urn:schemas-microsoft-com:office:word" xmlns:w="http://schemas.openxmlformats.org/wordprocessingml/2006/main" xmlns:w14="http://schemas.microsoft.com/office/word/2010/wordml" xmlns:w15="http://schemas.microsoft.com/office/word/2012/wordml" xmlns:w16cex="http://schemas.microsoft.com/office/word/2018/wordml/cex" xmlns:w16cid="http://schemas.microsoft.com/office/word/2016/wordml/cid" xmlns:w16="http://schemas.microsoft.com/office/word/2018/wordml" xmlns:w16du="http://schemas.microsoft.com/office/word/2023/wordml/word16du" xmlns:w16sdtdh="http://schemas.microsoft.com/office/word/2020/wordml/sdtdatahash" xmlns:w16se="http://schemas.microsoft.com/office/word/2015/wordml/symex" xmlns:sl="http://schemas.openxmlformats.org/schemaLibrary/2006/main" mc:Ignorable="w14 w15 w16se w16cid w16 w16cex w16sdtdh w16du">
+<w:settings xmlns:mc="http://schemas.openxmlformats.org/markup-compatibility/2006" xmlns:o="urn:schemas-microsoft-com:office:office" xmlns:r="http://schemas.openxmlformats.org/officeDocument/2006/relationships" xmlns:m="http://schemas.openxmlformats.org/officeDocument/2006/math" xmlns:v="urn:schemas-microsoft-com:vml" xmlns:w10="urn:schemas-microsoft-com:office:word" xmlns:w="http://schemas.openxmlformats.org/wordprocessingml/2006/main" xmlns:w14="http://schemas.microsoft.com/office/word/2010/wordml" xmlns:w15="http://schemas.microsoft.com/office/word/2012/wordml" xmlns:w16cex="http://schemas.microsoft.com/office/word/2018/wordml/cex" xmlns:w16cid="http://schemas.microsoft.com/office/word/2016/wordml/cid" xmlns:w16="http://schemas.microsoft.com/office/word/2018/wordml" xmlns:w16du="http://schemas.microsoft.com/office/word/2023/wordml/word16du" xmlns:w16sdtdh="http://schemas.microsoft.com/office/word/2020/wordml/sdtdatahash" xmlns:w16sdtfl="http://schemas.microsoft.com/office/word/2024/wordml/sdtformatlock" xmlns:w16se="http://schemas.microsoft.com/office/word/2015/wordml/symex" xmlns:sl="http://schemas.openxmlformats.org/schemaLibrary/2006/main" mc:Ignorable="w14 w15 w16se w16cid w16 w16cex w16sdtdh w16sdtfl w16du">
   <w:view w:val="normal"/>
   <w:defaultTabStop w:val="720"/>
   <w:characterSpacingControl w:val="doNotCompress"/>
@@ -29277,12 +29570,15 @@
     <w:rsid w:val="003D79C8"/>
     <w:rsid w:val="004053C2"/>
     <w:rsid w:val="004C04F3"/>
+    <w:rsid w:val="0051539A"/>
     <w:rsid w:val="00516EFD"/>
+    <w:rsid w:val="00536C35"/>
     <w:rsid w:val="00592E7B"/>
     <w:rsid w:val="00647800"/>
     <w:rsid w:val="006D1D1C"/>
     <w:rsid w:val="00722A1C"/>
     <w:rsid w:val="00725D61"/>
+    <w:rsid w:val="008F3797"/>
     <w:rsid w:val="009362E4"/>
     <w:rsid w:val="0097644A"/>
     <w:rsid w:val="00BB7F9F"/>
@@ -29290,9 +29586,12 @@
     <w:rsid w:val="00C9000E"/>
     <w:rsid w:val="00D31FBD"/>
     <w:rsid w:val="00D66504"/>
+    <w:rsid w:val="00D763A4"/>
+    <w:rsid w:val="00DE72CA"/>
     <w:rsid w:val="00E23E7D"/>
     <w:rsid w:val="00F4728C"/>
     <w:rsid w:val="00F94185"/>
+    <w:rsid w:val="00FD24E1"/>
   </w:rsids>
   <m:mathPr>
     <m:mathFont m:val="Cambria Math"/>
@@ -29316,7 +29615,7 @@
 </file>
 
 <file path=word/glossary/styles.xml><?xml version="1.0" encoding="utf-8"?>
-<w:styles xmlns:mc="http://schemas.openxmlformats.org/markup-compatibility/2006" xmlns:r="http://schemas.openxmlformats.org/officeDocument/2006/relationships" xmlns:w="http://schemas.openxmlformats.org/wordprocessingml/2006/main" xmlns:w14="http://schemas.microsoft.com/office/word/2010/wordml" xmlns:w15="http://schemas.microsoft.com/office/word/2012/wordml" xmlns:w16cex="http://schemas.microsoft.com/office/word/2018/wordml/cex" xmlns:w16cid="http://schemas.microsoft.com/office/word/2016/wordml/cid" xmlns:w16="http://schemas.microsoft.com/office/word/2018/wordml" xmlns:w16du="http://schemas.microsoft.com/office/word/2023/wordml/word16du" xmlns:w16sdtdh="http://schemas.microsoft.com/office/word/2020/wordml/sdtdatahash" xmlns:w16se="http://schemas.microsoft.com/office/word/2015/wordml/symex" mc:Ignorable="w14 w15 w16se w16cid w16 w16cex w16sdtdh w16du">
+<w:styles xmlns:mc="http://schemas.openxmlformats.org/markup-compatibility/2006" xmlns:r="http://schemas.openxmlformats.org/officeDocument/2006/relationships" xmlns:w="http://schemas.openxmlformats.org/wordprocessingml/2006/main" xmlns:w14="http://schemas.microsoft.com/office/word/2010/wordml" xmlns:w15="http://schemas.microsoft.com/office/word/2012/wordml" xmlns:w16cex="http://schemas.microsoft.com/office/word/2018/wordml/cex" xmlns:w16cid="http://schemas.microsoft.com/office/word/2016/wordml/cid" xmlns:w16="http://schemas.microsoft.com/office/word/2018/wordml" xmlns:w16du="http://schemas.microsoft.com/office/word/2023/wordml/word16du" xmlns:w16sdtdh="http://schemas.microsoft.com/office/word/2020/wordml/sdtdatahash" xmlns:w16sdtfl="http://schemas.microsoft.com/office/word/2024/wordml/sdtformatlock" xmlns:w16se="http://schemas.microsoft.com/office/word/2015/wordml/symex" mc:Ignorable="w14 w15 w16se w16cid w16 w16cex w16sdtdh w16sdtfl w16du">
   <w:docDefaults>
     <w:rPrDefault>
       <w:rPr>
@@ -29774,14 +30073,6 @@
       <w:color w:val="595959" w:themeColor="text1" w:themeTint="A6"/>
     </w:rPr>
   </w:style>
-  <w:style w:type="paragraph" w:customStyle="1" w:styleId="AB163E7F5DBB415B875F0BE5BD032FBE">
-    <w:name w:val="AB163E7F5DBB415B875F0BE5BD032FBE"/>
-    <w:rsid w:val="00592E7B"/>
-    <w:rPr>
-      <w:kern w:val="2"/>
-      <w14:ligatures w14:val="standardContextual"/>
-    </w:rPr>
-  </w:style>
   <w:style w:type="character" w:customStyle="1" w:styleId="Heading1Char">
     <w:name w:val="Heading 1 Char"/>
     <w:basedOn w:val="DefaultParagraphFont"/>
@@ -29797,11 +30088,24 @@
       <w:lang w:eastAsia="ja-JP"/>
     </w:rPr>
   </w:style>
+  <w:style w:type="paragraph" w:customStyle="1" w:styleId="B1960E8FC1C746E1958FF01958A4A076">
+    <w:name w:val="B1960E8FC1C746E1958FF01958A4A076"/>
+    <w:rsid w:val="00536C35"/>
+    <w:pPr>
+      <w:spacing w:line="278" w:lineRule="auto"/>
+    </w:pPr>
+    <w:rPr>
+      <w:kern w:val="2"/>
+      <w:sz w:val="24"/>
+      <w:szCs w:val="24"/>
+      <w14:ligatures w14:val="standardContextual"/>
+    </w:rPr>
+  </w:style>
 </w:styles>
 </file>
 
 <file path=word/glossary/webSettings.xml><?xml version="1.0" encoding="utf-8"?>
-<w:webSettings xmlns:mc="http://schemas.openxmlformats.org/markup-compatibility/2006" xmlns:r="http://schemas.openxmlformats.org/officeDocument/2006/relationships" xmlns:w="http://schemas.openxmlformats.org/wordprocessingml/2006/main" xmlns:w14="http://schemas.microsoft.com/office/word/2010/wordml" xmlns:w15="http://schemas.microsoft.com/office/word/2012/wordml" xmlns:w16cex="http://schemas.microsoft.com/office/word/2018/wordml/cex" xmlns:w16cid="http://schemas.microsoft.com/office/word/2016/wordml/cid" xmlns:w16="http://schemas.microsoft.com/office/word/2018/wordml" xmlns:w16du="http://schemas.microsoft.com/office/word/2023/wordml/word16du" xmlns:w16sdtdh="http://schemas.microsoft.com/office/word/2020/wordml/sdtdatahash" xmlns:w16se="http://schemas.microsoft.com/office/word/2015/wordml/symex" mc:Ignorable="w14 w15 w16se w16cid w16 w16cex w16sdtdh w16du">
+<w:webSettings xmlns:mc="http://schemas.openxmlformats.org/markup-compatibility/2006" xmlns:r="http://schemas.openxmlformats.org/officeDocument/2006/relationships" xmlns:w="http://schemas.openxmlformats.org/wordprocessingml/2006/main" xmlns:w14="http://schemas.microsoft.com/office/word/2010/wordml" xmlns:w15="http://schemas.microsoft.com/office/word/2012/wordml" xmlns:w16cex="http://schemas.microsoft.com/office/word/2018/wordml/cex" xmlns:w16cid="http://schemas.microsoft.com/office/word/2016/wordml/cid" xmlns:w16="http://schemas.microsoft.com/office/word/2018/wordml" xmlns:w16du="http://schemas.microsoft.com/office/word/2023/wordml/word16du" xmlns:w16sdtdh="http://schemas.microsoft.com/office/word/2020/wordml/sdtdatahash" xmlns:w16sdtfl="http://schemas.microsoft.com/office/word/2024/wordml/sdtformatlock" xmlns:w16se="http://schemas.microsoft.com/office/word/2015/wordml/symex" mc:Ignorable="w14 w15 w16se w16cid w16 w16cex w16sdtdh w16sdtfl w16du">
   <w:optimizeForBrowser/>
   <w:allowPNG/>
 </w:webSettings>
@@ -30009,6 +30313,35 @@
 </file>
 
 <file path=customXml/item1.xml><?xml version="1.0" encoding="utf-8"?>
+<?mso-contentType ?>
+<FormTemplates xmlns="http://schemas.microsoft.com/sharepoint/v3/contenttype/forms">
+  <Display>DocumentLibraryForm</Display>
+  <Edit>DocumentLibraryForm</Edit>
+  <New>DocumentLibraryForm</New>
+</FormTemplates>
+</file>
+
+<file path=customXml/item2.xml><?xml version="1.0" encoding="utf-8"?>
+<p:properties xmlns:p="http://schemas.microsoft.com/office/2006/metadata/properties" xmlns:xsi="http://www.w3.org/2001/XMLSchema-instance" xmlns:pc="http://schemas.microsoft.com/office/infopath/2007/PartnerControls">
+  <documentManagement>
+    <Background xmlns="71af3243-3dd4-4a8d-8c0d-dd76da1f02a5">false</Background>
+    <Status xmlns="71af3243-3dd4-4a8d-8c0d-dd76da1f02a5">Not started</Status>
+    <_ip_UnifiedCompliancePolicyUIAction xmlns="http://schemas.microsoft.com/sharepoint/v3" xsi:nil="true"/>
+    <Image xmlns="71af3243-3dd4-4a8d-8c0d-dd76da1f02a5">
+      <Url xsi:nil="true"/>
+      <Description xsi:nil="true"/>
+    </Image>
+    <_ip_UnifiedCompliancePolicyProperties xmlns="http://schemas.microsoft.com/sharepoint/v3" xsi:nil="true"/>
+    <ImageTagsTaxHTField xmlns="71af3243-3dd4-4a8d-8c0d-dd76da1f02a5">
+      <Terms xmlns="http://schemas.microsoft.com/office/infopath/2007/PartnerControls"/>
+    </ImageTagsTaxHTField>
+    <TaxCatchAll xmlns="230e9df3-be65-4c73-a93b-d1236ebd677e" xsi:nil="true"/>
+    <MediaServiceKeyPoints xmlns="71af3243-3dd4-4a8d-8c0d-dd76da1f02a5" xsi:nil="true"/>
+  </documentManagement>
+</p:properties>
+</file>
+
+<file path=customXml/item3.xml><?xml version="1.0" encoding="utf-8"?>
 <ct:contentTypeSchema xmlns:ct="http://schemas.microsoft.com/office/2006/metadata/contentType" xmlns:ma="http://schemas.microsoft.com/office/2006/metadata/properties/metaAttributes" ct:_="" ma:_="" ma:contentTypeName="Document" ma:contentTypeID="0x01010079F111ED35F8CC479449609E8A0923A6" ma:contentTypeVersion="26" ma:contentTypeDescription="Create a new document." ma:contentTypeScope="" ma:versionID="ac37c1753acd5e330d2062ccec26ea66">
   <xsd:schema xmlns:xsd="http://www.w3.org/2001/XMLSchema" xmlns:xs="http://www.w3.org/2001/XMLSchema" xmlns:p="http://schemas.microsoft.com/office/2006/metadata/properties" xmlns:ns1="http://schemas.microsoft.com/sharepoint/v3" xmlns:ns2="71af3243-3dd4-4a8d-8c0d-dd76da1f02a5" xmlns:ns3="16c05727-aa75-4e4a-9b5f-8a80a1165891" xmlns:ns4="230e9df3-be65-4c73-a93b-d1236ebd677e" targetNamespace="http://schemas.microsoft.com/office/2006/metadata/properties" ma:root="true" ma:fieldsID="3b340c7101c92c5120abd06486f94548" ns1:_="" ns2:_="" ns3:_="" ns4:_="">
     <xsd:import namespace="http://schemas.microsoft.com/sharepoint/v3"/>
@@ -30308,36 +30641,27 @@
 </ct:contentTypeSchema>
 </file>
 
-<file path=customXml/item2.xml><?xml version="1.0" encoding="utf-8"?>
-<?mso-contentType ?>
-<FormTemplates xmlns="http://schemas.microsoft.com/sharepoint/v3/contenttype/forms">
-  <Display>DocumentLibraryForm</Display>
-  <Edit>DocumentLibraryForm</Edit>
-  <New>DocumentLibraryForm</New>
-</FormTemplates>
+<file path=customXml/itemProps1.xml><?xml version="1.0" encoding="utf-8"?>
+<ds:datastoreItem xmlns:ds="http://schemas.openxmlformats.org/officeDocument/2006/customXml" ds:itemID="{5D9ED3FD-0EE3-43B5-B701-56BB60CEE482}">
+  <ds:schemaRefs>
+    <ds:schemaRef ds:uri="http://schemas.microsoft.com/sharepoint/v3/contenttype/forms"/>
+  </ds:schemaRefs>
+</ds:datastoreItem>
 </file>
 
-<file path=customXml/item3.xml><?xml version="1.0" encoding="utf-8"?>
-<p:properties xmlns:p="http://schemas.microsoft.com/office/2006/metadata/properties" xmlns:xsi="http://www.w3.org/2001/XMLSchema-instance" xmlns:pc="http://schemas.microsoft.com/office/infopath/2007/PartnerControls">
-  <documentManagement>
-    <Background xmlns="71af3243-3dd4-4a8d-8c0d-dd76da1f02a5">false</Background>
-    <Status xmlns="71af3243-3dd4-4a8d-8c0d-dd76da1f02a5">Not started</Status>
-    <_ip_UnifiedCompliancePolicyUIAction xmlns="http://schemas.microsoft.com/sharepoint/v3" xsi:nil="true"/>
-    <Image xmlns="71af3243-3dd4-4a8d-8c0d-dd76da1f02a5">
-      <Url xsi:nil="true"/>
-      <Description xsi:nil="true"/>
-    </Image>
-    <_ip_UnifiedCompliancePolicyProperties xmlns="http://schemas.microsoft.com/sharepoint/v3" xsi:nil="true"/>
-    <ImageTagsTaxHTField xmlns="71af3243-3dd4-4a8d-8c0d-dd76da1f02a5">
-      <Terms xmlns="http://schemas.microsoft.com/office/infopath/2007/PartnerControls"/>
-    </ImageTagsTaxHTField>
-    <TaxCatchAll xmlns="230e9df3-be65-4c73-a93b-d1236ebd677e" xsi:nil="true"/>
-    <MediaServiceKeyPoints xmlns="71af3243-3dd4-4a8d-8c0d-dd76da1f02a5" xsi:nil="true"/>
-  </documentManagement>
-</p:properties>
+<file path=customXml/itemProps2.xml><?xml version="1.0" encoding="utf-8"?>
+<ds:datastoreItem xmlns:ds="http://schemas.openxmlformats.org/officeDocument/2006/customXml" ds:itemID="{2B9F8D08-1D9B-4293-B753-AE33123B7366}">
+  <ds:schemaRefs>
+    <ds:schemaRef ds:uri="http://schemas.microsoft.com/office/2006/metadata/properties"/>
+    <ds:schemaRef ds:uri="http://schemas.microsoft.com/office/infopath/2007/PartnerControls"/>
+    <ds:schemaRef ds:uri="71af3243-3dd4-4a8d-8c0d-dd76da1f02a5"/>
+    <ds:schemaRef ds:uri="http://schemas.microsoft.com/sharepoint/v3"/>
+    <ds:schemaRef ds:uri="230e9df3-be65-4c73-a93b-d1236ebd677e"/>
+  </ds:schemaRefs>
+</ds:datastoreItem>
 </file>
 
-<file path=customXml/itemProps1.xml><?xml version="1.0" encoding="utf-8"?>
+<file path=customXml/itemProps3.xml><?xml version="1.0" encoding="utf-8"?>
 <ds:datastoreItem xmlns:ds="http://schemas.openxmlformats.org/officeDocument/2006/customXml" ds:itemID="{3341EF5F-139F-499F-A465-6C6FF6A88041}">
   <ds:schemaRefs>
     <ds:schemaRef ds:uri="http://schemas.microsoft.com/office/2006/metadata/contentType"/>
@@ -30358,26 +30682,6 @@
 </ds:datastoreItem>
 </file>
 
-<file path=customXml/itemProps2.xml><?xml version="1.0" encoding="utf-8"?>
-<ds:datastoreItem xmlns:ds="http://schemas.openxmlformats.org/officeDocument/2006/customXml" ds:itemID="{5D9ED3FD-0EE3-43B5-B701-56BB60CEE482}">
-  <ds:schemaRefs>
-    <ds:schemaRef ds:uri="http://schemas.microsoft.com/sharepoint/v3/contenttype/forms"/>
-  </ds:schemaRefs>
-</ds:datastoreItem>
-</file>
-
-<file path=customXml/itemProps3.xml><?xml version="1.0" encoding="utf-8"?>
-<ds:datastoreItem xmlns:ds="http://schemas.openxmlformats.org/officeDocument/2006/customXml" ds:itemID="{2B9F8D08-1D9B-4293-B753-AE33123B7366}">
-  <ds:schemaRefs>
-    <ds:schemaRef ds:uri="http://schemas.microsoft.com/office/2006/metadata/properties"/>
-    <ds:schemaRef ds:uri="http://schemas.microsoft.com/office/infopath/2007/PartnerControls"/>
-    <ds:schemaRef ds:uri="71af3243-3dd4-4a8d-8c0d-dd76da1f02a5"/>
-    <ds:schemaRef ds:uri="http://schemas.microsoft.com/sharepoint/v3"/>
-    <ds:schemaRef ds:uri="230e9df3-be65-4c73-a93b-d1236ebd677e"/>
-  </ds:schemaRefs>
-</ds:datastoreItem>
-</file>
-
 <file path=docMetadata/LabelInfo.xml><?xml version="1.0" encoding="utf-8"?>
 <clbl:labelList xmlns:clbl="http://schemas.microsoft.com/office/2020/mipLabelMetadata"/>
 </file>
</xml_diff>